<commit_message>
adição de preço estiimado
</commit_message>
<xml_diff>
--- a/Documentação/Doc atualizado.docx
+++ b/Documentação/Doc atualizado.docx
@@ -357,7 +357,35 @@
         <w:rPr>
           <w:sz w:val="22"/>
         </w:rPr>
-        <w:t>ETEC Prof. Massuyuki Kawano,</w:t>
+        <w:t xml:space="preserve">ETEC Prof. </w:t>
+      </w:r>
+      <w:proofErr w:type="spellStart"/>
+      <w:r>
+        <w:rPr>
+          <w:sz w:val="22"/>
+        </w:rPr>
+        <w:t>Massuyuki</w:t>
+      </w:r>
+      <w:proofErr w:type="spellEnd"/>
+      <w:r>
+        <w:rPr>
+          <w:sz w:val="22"/>
+        </w:rPr>
+        <w:t xml:space="preserve"> </w:t>
+      </w:r>
+      <w:proofErr w:type="spellStart"/>
+      <w:r>
+        <w:rPr>
+          <w:sz w:val="22"/>
+        </w:rPr>
+        <w:t>Kawano</w:t>
+      </w:r>
+      <w:proofErr w:type="spellEnd"/>
+      <w:r>
+        <w:rPr>
+          <w:sz w:val="22"/>
+        </w:rPr>
+        <w:t>,</w:t>
       </w:r>
       <w:r>
         <w:rPr>
@@ -2885,11 +2913,9 @@
       <w:r>
         <w:t xml:space="preserve">No contexto empresarial atual, a contabilidade consolidou-se como o núcleo de todas as operações de uma organização, sendo o setor responsável por absorver as informações monetárias e expedir o resultado econômico. Para as Microempresas (ME) e Microempreendedores Individuais (MEI), a ciência contábil é vital, pois, como afirmam Silva et al. (2002, p. 51), "a Contabilidade surgiu da necessidade </w:t>
       </w:r>
-      <w:proofErr w:type="gramStart"/>
-      <w:r>
-        <w:t>do</w:t>
-      </w:r>
-      <w:proofErr w:type="gramEnd"/>
+      <w:r>
+        <w:t>de o</w:t>
+      </w:r>
       <w:r>
         <w:t xml:space="preserve"> homem controlar os seus recebimentos, obrigações e todo o seu patrimônio". Contudo, a eficácia dessa gestão depende de uma comunicação clara com os serviços terceirizados, permitindo que os gestores obtenham um entendimento preciso da situação financeira para evitar a "clandestinidade patrimonial".</w:t>
       </w:r>
@@ -2973,7 +2999,13 @@
         </w:rPr>
       </w:pPr>
       <w:r>
-        <w:t>O sistema Contax será desenvolvido com base em uma arquitetura híbrida de microsserviços, utilizando tecnologias como React.js e TypeScript no front-end, Node.js com Express.js no back-end e MySQL como banco de dados relacional. A infraestrutura será hospedada em plataformas como Vercel (frontend) e Heroku (backend). A modelagem será guiada pelas diretrizes da Engenharia de Software, com uso de ferramentas como UML, DFD, MER, Dicionário de Dados e prototipagem em Figma.</w:t>
+        <w:t xml:space="preserve">O sistema Contax será desenvolvido com base em uma arquitetura híbrida de </w:t>
+      </w:r>
+      <w:r>
+        <w:t>micros serviços</w:t>
+      </w:r>
+      <w:r>
+        <w:t>, utilizando tecnologias como React.js e TypeScript no front-end, Node.js com Express.js no back-end e MySQL como banco de dados relacional. A infraestrutura será hospedada em plataformas como Vercel (frontend) e Heroku (backend). A modelagem será guiada pelas diretrizes da Engenharia de Software, com uso de ferramentas como UML, DFD, MER, Dicionário de Dados e prototipagem em Figma.</w:t>
       </w:r>
       <w:r>
         <w:br w:type="page"/>
@@ -5402,20 +5434,363 @@
     <w:p/>
     <w:p>
       <w:r>
-        <w:t>Apresentação dos valores referentes ao projeto seguido</w:t>
-      </w:r>
-      <w:r>
-        <w:t xml:space="preserve">. </w:t>
+        <w:t>Por se tratar de um projeto de pesquisa de graduação sem financiamento</w:t>
+      </w:r>
+      <w:r>
+        <w:t xml:space="preserve"> </w:t>
+      </w:r>
+      <w:r>
+        <w:t>externo, os recursos humanos serão os próprios autores do trabalho, não havendo</w:t>
+      </w:r>
+      <w:r>
+        <w:t xml:space="preserve"> </w:t>
+      </w:r>
+      <w:r>
+        <w:t>custos de mão de obra. O orçamento se restringe aos custos de infraestrutura de</w:t>
+      </w:r>
+      <w:r>
+        <w:t xml:space="preserve"> softwares</w:t>
+      </w:r>
+      <w:r>
+        <w:t xml:space="preserve"> necessários para a disponibilização do protótipo durante a fase de validação</w:t>
+      </w:r>
+      <w:r>
+        <w:t xml:space="preserve"> </w:t>
+      </w:r>
+      <w:r>
+        <w:t>(estimada em 3 meses).</w:t>
       </w:r>
     </w:p>
     <w:p/>
     <w:p>
-      <w:r>
-        <w:t>Pode ser em formato de tabela, focar no custo das ferramentas utilizadas no desenvolvimento, listar todas, até de uso gratuito, apontar também o custo que teria para uma possível hospedagem do site.</w:t>
-      </w:r>
-    </w:p>
-    <w:p/>
-    <w:p/>
+      <w:pPr>
+        <w:rPr>
+          <w:b/>
+          <w:bCs/>
+        </w:rPr>
+      </w:pPr>
+      <w:r>
+        <w:t xml:space="preserve"> </w:t>
+      </w:r>
+      <w:r>
+        <w:rPr>
+          <w:b/>
+          <w:bCs/>
+        </w:rPr>
+        <w:t xml:space="preserve"> </w:t>
+      </w:r>
+      <w:r>
+        <w:rPr>
+          <w:b/>
+          <w:bCs/>
+        </w:rPr>
+        <w:t>Tabela 1: Orçamento estimado para a fase de validação (3 meses).</w:t>
+      </w:r>
+    </w:p>
+    <w:tbl>
+      <w:tblPr>
+        <w:tblStyle w:val="Tabelacomgrade"/>
+        <w:tblW w:w="0" w:type="auto"/>
+        <w:tblLook w:val="04A0" w:firstRow="1" w:lastRow="0" w:firstColumn="1" w:lastColumn="0" w:noHBand="0" w:noVBand="1"/>
+      </w:tblPr>
+      <w:tblGrid>
+        <w:gridCol w:w="2265"/>
+        <w:gridCol w:w="2265"/>
+        <w:gridCol w:w="2265"/>
+        <w:gridCol w:w="2266"/>
+      </w:tblGrid>
+      <w:tr>
+        <w:tc>
+          <w:tcPr>
+            <w:tcW w:w="2265" w:type="dxa"/>
+          </w:tcPr>
+          <w:p>
+            <w:pPr>
+              <w:rPr>
+                <w:b/>
+                <w:bCs/>
+              </w:rPr>
+            </w:pPr>
+            <w:r>
+              <w:rPr>
+                <w:b/>
+                <w:bCs/>
+              </w:rPr>
+              <w:t>Recurso</w:t>
+            </w:r>
+          </w:p>
+        </w:tc>
+        <w:tc>
+          <w:tcPr>
+            <w:tcW w:w="2265" w:type="dxa"/>
+          </w:tcPr>
+          <w:p>
+            <w:pPr>
+              <w:rPr>
+                <w:b/>
+                <w:bCs/>
+              </w:rPr>
+            </w:pPr>
+            <w:r>
+              <w:rPr>
+                <w:b/>
+                <w:bCs/>
+              </w:rPr>
+              <w:t>Fornecedor (exemplo)</w:t>
+            </w:r>
+          </w:p>
+        </w:tc>
+        <w:tc>
+          <w:tcPr>
+            <w:tcW w:w="2265" w:type="dxa"/>
+          </w:tcPr>
+          <w:p>
+            <w:pPr>
+              <w:rPr>
+                <w:b/>
+                <w:bCs/>
+              </w:rPr>
+            </w:pPr>
+            <w:r>
+              <w:rPr>
+                <w:b/>
+                <w:bCs/>
+              </w:rPr>
+              <w:t>Custo(R$)</w:t>
+            </w:r>
+          </w:p>
+        </w:tc>
+        <w:tc>
+          <w:tcPr>
+            <w:tcW w:w="2266" w:type="dxa"/>
+          </w:tcPr>
+          <w:p>
+            <w:pPr>
+              <w:rPr>
+                <w:b/>
+                <w:bCs/>
+              </w:rPr>
+            </w:pPr>
+            <w:r>
+              <w:rPr>
+                <w:b/>
+                <w:bCs/>
+              </w:rPr>
+              <w:t>Custo Total (3 meses)</w:t>
+            </w:r>
+          </w:p>
+        </w:tc>
+      </w:tr>
+      <w:tr>
+        <w:tc>
+          <w:tcPr>
+            <w:tcW w:w="2265" w:type="dxa"/>
+          </w:tcPr>
+          <w:p>
+            <w:r>
+              <w:t>Registro de domínio</w:t>
+            </w:r>
+          </w:p>
+        </w:tc>
+        <w:tc>
+          <w:tcPr>
+            <w:tcW w:w="2265" w:type="dxa"/>
+          </w:tcPr>
+          <w:p>
+            <w:proofErr w:type="spellStart"/>
+            <w:r>
+              <w:t>Hostinger</w:t>
+            </w:r>
+            <w:proofErr w:type="spellEnd"/>
+          </w:p>
+        </w:tc>
+        <w:tc>
+          <w:tcPr>
+            <w:tcW w:w="2265" w:type="dxa"/>
+          </w:tcPr>
+          <w:p>
+            <w:r>
+              <w:t>R$ 40,00 por ano</w:t>
+            </w:r>
+          </w:p>
+        </w:tc>
+        <w:tc>
+          <w:tcPr>
+            <w:tcW w:w="2266" w:type="dxa"/>
+          </w:tcPr>
+          <w:p>
+            <w:r>
+              <w:t>R$ 10,00 (Proporcional)</w:t>
+            </w:r>
+          </w:p>
+        </w:tc>
+      </w:tr>
+      <w:tr>
+        <w:tc>
+          <w:tcPr>
+            <w:tcW w:w="2265" w:type="dxa"/>
+          </w:tcPr>
+          <w:p>
+            <w:r>
+              <w:t>Hospedagem de banco de dados</w:t>
+            </w:r>
+          </w:p>
+        </w:tc>
+        <w:tc>
+          <w:tcPr>
+            <w:tcW w:w="2265" w:type="dxa"/>
+          </w:tcPr>
+          <w:p>
+            <w:proofErr w:type="spellStart"/>
+            <w:r>
+              <w:t>PlanetScale</w:t>
+            </w:r>
+            <w:proofErr w:type="spellEnd"/>
+            <w:r>
+              <w:t xml:space="preserve"> (Plano Gratuito)</w:t>
+            </w:r>
+          </w:p>
+        </w:tc>
+        <w:tc>
+          <w:tcPr>
+            <w:tcW w:w="2265" w:type="dxa"/>
+          </w:tcPr>
+          <w:p>
+            <w:r>
+              <w:t>R$ 00,00</w:t>
+            </w:r>
+          </w:p>
+        </w:tc>
+        <w:tc>
+          <w:tcPr>
+            <w:tcW w:w="2266" w:type="dxa"/>
+          </w:tcPr>
+          <w:p>
+            <w:r>
+              <w:t>R$ 00,00</w:t>
+            </w:r>
+          </w:p>
+        </w:tc>
+      </w:tr>
+      <w:tr>
+        <w:tc>
+          <w:tcPr>
+            <w:tcW w:w="2265" w:type="dxa"/>
+          </w:tcPr>
+          <w:p>
+            <w:r>
+              <w:t>Hospedagem de Backend (servidor)</w:t>
+            </w:r>
+          </w:p>
+        </w:tc>
+        <w:tc>
+          <w:tcPr>
+            <w:tcW w:w="2265" w:type="dxa"/>
+          </w:tcPr>
+          <w:p>
+            <w:r>
+              <w:t>Heroku (Plano “Eco”)</w:t>
+            </w:r>
+          </w:p>
+        </w:tc>
+        <w:tc>
+          <w:tcPr>
+            <w:tcW w:w="2265" w:type="dxa"/>
+          </w:tcPr>
+          <w:p>
+            <w:r>
+              <w:t>R$ 26,48 por mês</w:t>
+            </w:r>
+          </w:p>
+        </w:tc>
+        <w:tc>
+          <w:tcPr>
+            <w:tcW w:w="2266" w:type="dxa"/>
+          </w:tcPr>
+          <w:p>
+            <w:r>
+              <w:t>R$ 79,45</w:t>
+            </w:r>
+          </w:p>
+        </w:tc>
+      </w:tr>
+      <w:tr>
+        <w:tc>
+          <w:tcPr>
+            <w:tcW w:w="2265" w:type="dxa"/>
+          </w:tcPr>
+          <w:p>
+            <w:pPr>
+              <w:rPr>
+                <w:b/>
+                <w:bCs/>
+              </w:rPr>
+            </w:pPr>
+            <w:r>
+              <w:rPr>
+                <w:b/>
+                <w:bCs/>
+              </w:rPr>
+              <w:t>Total estimado</w:t>
+            </w:r>
+          </w:p>
+        </w:tc>
+        <w:tc>
+          <w:tcPr>
+            <w:tcW w:w="2265" w:type="dxa"/>
+          </w:tcPr>
+          <w:p>
+            <w:pPr>
+              <w:rPr>
+                <w:b/>
+                <w:bCs/>
+              </w:rPr>
+            </w:pPr>
+          </w:p>
+        </w:tc>
+        <w:tc>
+          <w:tcPr>
+            <w:tcW w:w="2265" w:type="dxa"/>
+          </w:tcPr>
+          <w:p>
+            <w:pPr>
+              <w:rPr>
+                <w:b/>
+                <w:bCs/>
+              </w:rPr>
+            </w:pPr>
+          </w:p>
+        </w:tc>
+        <w:tc>
+          <w:tcPr>
+            <w:tcW w:w="2266" w:type="dxa"/>
+          </w:tcPr>
+          <w:p>
+            <w:pPr>
+              <w:rPr>
+                <w:b/>
+                <w:bCs/>
+              </w:rPr>
+            </w:pPr>
+            <w:r>
+              <w:rPr>
+                <w:b/>
+                <w:bCs/>
+              </w:rPr>
+              <w:t>R$ 89,45</w:t>
+            </w:r>
+          </w:p>
+        </w:tc>
+      </w:tr>
+    </w:tbl>
+    <w:p>
+      <w:pPr>
+        <w:jc w:val="center"/>
+      </w:pPr>
+      <w:r>
+        <w:t>Fonte: Elaborado pelos autores (2025).</w:t>
+      </w:r>
+    </w:p>
     <w:p>
       <w:pPr>
         <w:spacing w:after="200" w:line="276" w:lineRule="auto"/>
@@ -5858,9 +6233,11 @@
             <w:vAlign w:val="center"/>
           </w:tcPr>
           <w:p>
+            <w:proofErr w:type="spellStart"/>
             <w:r>
               <w:t>usu_id</w:t>
             </w:r>
+            <w:proofErr w:type="spellEnd"/>
           </w:p>
         </w:tc>
         <w:tc>
@@ -5920,8 +6297,13 @@
             <w:tcW w:w="1151" w:type="pct"/>
           </w:tcPr>
           <w:p>
-            <w:r>
-              <w:t>Auto-Incremento.</w:t>
+            <w:proofErr w:type="spellStart"/>
+            <w:r>
+              <w:t>Auto-Incremento</w:t>
+            </w:r>
+            <w:proofErr w:type="spellEnd"/>
+            <w:r>
+              <w:t>.</w:t>
             </w:r>
           </w:p>
         </w:tc>
@@ -5944,9 +6326,11 @@
             <w:vAlign w:val="center"/>
           </w:tcPr>
           <w:p>
+            <w:proofErr w:type="spellStart"/>
             <w:r>
               <w:t>usu_nome</w:t>
             </w:r>
+            <w:proofErr w:type="spellEnd"/>
           </w:p>
         </w:tc>
         <w:tc>
@@ -6027,9 +6411,11 @@
             <w:vAlign w:val="center"/>
           </w:tcPr>
           <w:p>
+            <w:proofErr w:type="spellStart"/>
             <w:r>
               <w:t>usu_email</w:t>
             </w:r>
+            <w:proofErr w:type="spellEnd"/>
           </w:p>
         </w:tc>
         <w:tc>
@@ -6110,9 +6496,11 @@
             <w:vAlign w:val="center"/>
           </w:tcPr>
           <w:p>
+            <w:proofErr w:type="spellStart"/>
             <w:r>
               <w:t>usu_cpf</w:t>
             </w:r>
+            <w:proofErr w:type="spellEnd"/>
           </w:p>
         </w:tc>
         <w:tc>
@@ -6193,9 +6581,11 @@
             <w:vAlign w:val="center"/>
           </w:tcPr>
           <w:p>
+            <w:proofErr w:type="spellStart"/>
             <w:r>
               <w:t>usu_senha_hash</w:t>
             </w:r>
+            <w:proofErr w:type="spellEnd"/>
           </w:p>
         </w:tc>
         <w:tc>
@@ -6276,9 +6666,11 @@
             <w:vAlign w:val="center"/>
           </w:tcPr>
           <w:p>
+            <w:proofErr w:type="spellStart"/>
             <w:r>
               <w:t>usu_telefone</w:t>
             </w:r>
+            <w:proofErr w:type="spellEnd"/>
           </w:p>
         </w:tc>
         <w:tc>
@@ -6359,9 +6751,11 @@
             <w:vAlign w:val="center"/>
           </w:tcPr>
           <w:p>
+            <w:proofErr w:type="spellStart"/>
             <w:r>
               <w:t>usu_status</w:t>
             </w:r>
+            <w:proofErr w:type="spellEnd"/>
           </w:p>
         </w:tc>
         <w:tc>
@@ -6442,9 +6836,11 @@
             <w:vAlign w:val="center"/>
           </w:tcPr>
           <w:p>
+            <w:proofErr w:type="spellStart"/>
             <w:r>
               <w:t>usu_alterar_senha</w:t>
             </w:r>
+            <w:proofErr w:type="spellEnd"/>
           </w:p>
         </w:tc>
         <w:tc>
@@ -6773,9 +7169,11 @@
             <w:vAlign w:val="center"/>
           </w:tcPr>
           <w:p>
+            <w:proofErr w:type="spellStart"/>
             <w:r>
               <w:t>emp_id</w:t>
             </w:r>
+            <w:proofErr w:type="spellEnd"/>
           </w:p>
         </w:tc>
         <w:tc>
@@ -6836,8 +7234,13 @@
             <w:tcW w:w="1151" w:type="pct"/>
           </w:tcPr>
           <w:p>
-            <w:r>
-              <w:t>Auto-Incremento.</w:t>
+            <w:proofErr w:type="spellStart"/>
+            <w:r>
+              <w:t>Auto-Incremento</w:t>
+            </w:r>
+            <w:proofErr w:type="spellEnd"/>
+            <w:r>
+              <w:t>.</w:t>
             </w:r>
           </w:p>
         </w:tc>
@@ -6860,9 +7263,11 @@
             <w:vAlign w:val="center"/>
           </w:tcPr>
           <w:p>
+            <w:proofErr w:type="spellStart"/>
             <w:r>
               <w:t>emp_nome_fantasia</w:t>
             </w:r>
+            <w:proofErr w:type="spellEnd"/>
           </w:p>
         </w:tc>
         <w:tc>
@@ -6944,9 +7349,11 @@
             <w:vAlign w:val="center"/>
           </w:tcPr>
           <w:p>
+            <w:proofErr w:type="spellStart"/>
             <w:r>
               <w:t>emp_razao_social</w:t>
             </w:r>
+            <w:proofErr w:type="spellEnd"/>
           </w:p>
         </w:tc>
         <w:tc>
@@ -7028,9 +7435,11 @@
             <w:vAlign w:val="center"/>
           </w:tcPr>
           <w:p>
+            <w:proofErr w:type="spellStart"/>
             <w:r>
               <w:t>emp_cnpj</w:t>
             </w:r>
+            <w:proofErr w:type="spellEnd"/>
           </w:p>
         </w:tc>
         <w:tc>
@@ -7112,9 +7521,11 @@
             <w:vAlign w:val="center"/>
           </w:tcPr>
           <w:p>
+            <w:proofErr w:type="spellStart"/>
             <w:r>
               <w:t>emp_endereco</w:t>
             </w:r>
+            <w:proofErr w:type="spellEnd"/>
           </w:p>
         </w:tc>
         <w:tc>
@@ -7196,9 +7607,11 @@
             <w:vAlign w:val="center"/>
           </w:tcPr>
           <w:p>
+            <w:proofErr w:type="spellStart"/>
             <w:r>
               <w:t>emp_municipio</w:t>
             </w:r>
+            <w:proofErr w:type="spellEnd"/>
           </w:p>
         </w:tc>
         <w:tc>
@@ -7280,9 +7693,11 @@
             <w:vAlign w:val="center"/>
           </w:tcPr>
           <w:p>
+            <w:proofErr w:type="spellStart"/>
             <w:r>
               <w:t>emp_telefone</w:t>
             </w:r>
+            <w:proofErr w:type="spellEnd"/>
           </w:p>
         </w:tc>
         <w:tc>
@@ -7364,9 +7779,11 @@
             <w:vAlign w:val="center"/>
           </w:tcPr>
           <w:p>
+            <w:proofErr w:type="spellStart"/>
             <w:r>
               <w:t>emp_email</w:t>
             </w:r>
+            <w:proofErr w:type="spellEnd"/>
           </w:p>
         </w:tc>
         <w:tc>
@@ -7448,9 +7865,11 @@
             <w:vAlign w:val="center"/>
           </w:tcPr>
           <w:p>
+            <w:proofErr w:type="spellStart"/>
             <w:r>
               <w:t>emp_senha_hash</w:t>
             </w:r>
+            <w:proofErr w:type="spellEnd"/>
           </w:p>
         </w:tc>
         <w:tc>
@@ -7532,9 +7951,11 @@
             <w:vAlign w:val="center"/>
           </w:tcPr>
           <w:p>
+            <w:proofErr w:type="spellStart"/>
             <w:r>
               <w:t>emp_tipo</w:t>
             </w:r>
+            <w:proofErr w:type="spellEnd"/>
           </w:p>
         </w:tc>
         <w:tc>
@@ -7851,9 +8272,11 @@
             <w:vAlign w:val="center"/>
           </w:tcPr>
           <w:p>
+            <w:proofErr w:type="spellStart"/>
             <w:r>
               <w:t>emp_id</w:t>
             </w:r>
+            <w:proofErr w:type="spellEnd"/>
           </w:p>
         </w:tc>
         <w:tc>
@@ -7937,9 +8360,11 @@
             <w:vAlign w:val="center"/>
           </w:tcPr>
           <w:p>
+            <w:proofErr w:type="spellStart"/>
             <w:r>
               <w:t>usu_id</w:t>
             </w:r>
+            <w:proofErr w:type="spellEnd"/>
           </w:p>
         </w:tc>
         <w:tc>
@@ -8023,9 +8448,11 @@
             <w:vAlign w:val="center"/>
           </w:tcPr>
           <w:p>
+            <w:proofErr w:type="spellStart"/>
             <w:r>
               <w:t>usu_emp_nivel_acesso</w:t>
             </w:r>
+            <w:proofErr w:type="spellEnd"/>
           </w:p>
         </w:tc>
         <w:tc>
@@ -8107,9 +8534,11 @@
             <w:vAlign w:val="center"/>
           </w:tcPr>
           <w:p>
+            <w:proofErr w:type="spellStart"/>
             <w:r>
               <w:t>usu_emp_data_vinculo</w:t>
             </w:r>
+            <w:proofErr w:type="spellEnd"/>
           </w:p>
         </w:tc>
         <w:tc>
@@ -8191,9 +8620,11 @@
             <w:vAlign w:val="center"/>
           </w:tcPr>
           <w:p>
+            <w:proofErr w:type="spellStart"/>
             <w:r>
               <w:t>usu_emp_status</w:t>
             </w:r>
+            <w:proofErr w:type="spellEnd"/>
           </w:p>
         </w:tc>
         <w:tc>
@@ -8275,9 +8706,11 @@
             <w:vAlign w:val="center"/>
           </w:tcPr>
           <w:p>
+            <w:proofErr w:type="spellStart"/>
             <w:r>
               <w:t>usu_emp_observacoes</w:t>
             </w:r>
+            <w:proofErr w:type="spellEnd"/>
           </w:p>
         </w:tc>
         <w:tc>
@@ -8570,9 +9003,11 @@
             <w:vAlign w:val="center"/>
           </w:tcPr>
           <w:p>
+            <w:proofErr w:type="spellStart"/>
             <w:r>
               <w:t>regi_id</w:t>
             </w:r>
+            <w:proofErr w:type="spellEnd"/>
           </w:p>
         </w:tc>
         <w:tc>
@@ -8633,8 +9068,13 @@
             <w:tcW w:w="1080" w:type="pct"/>
           </w:tcPr>
           <w:p>
-            <w:r>
-              <w:t>Auto-Incremento.</w:t>
+            <w:proofErr w:type="spellStart"/>
+            <w:r>
+              <w:t>Auto-Incremento</w:t>
+            </w:r>
+            <w:proofErr w:type="spellEnd"/>
+            <w:r>
+              <w:t>.</w:t>
             </w:r>
           </w:p>
         </w:tc>
@@ -8657,9 +9097,11 @@
             <w:vAlign w:val="center"/>
           </w:tcPr>
           <w:p>
+            <w:proofErr w:type="spellStart"/>
             <w:r>
               <w:t>regi_nome</w:t>
             </w:r>
+            <w:proofErr w:type="spellEnd"/>
           </w:p>
         </w:tc>
         <w:tc>
@@ -8741,9 +9183,11 @@
             <w:vAlign w:val="center"/>
           </w:tcPr>
           <w:p>
+            <w:proofErr w:type="spellStart"/>
             <w:r>
               <w:t>regi_descricao</w:t>
             </w:r>
+            <w:proofErr w:type="spellEnd"/>
           </w:p>
         </w:tc>
         <w:tc>
@@ -8825,9 +9269,11 @@
             <w:vAlign w:val="center"/>
           </w:tcPr>
           <w:p>
+            <w:proofErr w:type="spellStart"/>
             <w:r>
               <w:t>regi_limite_faturamento_anual</w:t>
             </w:r>
+            <w:proofErr w:type="spellEnd"/>
           </w:p>
         </w:tc>
         <w:tc>
@@ -8909,9 +9355,11 @@
             <w:vAlign w:val="center"/>
           </w:tcPr>
           <w:p>
+            <w:proofErr w:type="spellStart"/>
             <w:r>
               <w:t>regi_tipo_emp_permitida</w:t>
             </w:r>
+            <w:proofErr w:type="spellEnd"/>
           </w:p>
         </w:tc>
         <w:tc>
@@ -8996,9 +9444,11 @@
             <w:pPr>
               <w:ind w:left="708" w:hanging="708"/>
             </w:pPr>
+            <w:proofErr w:type="spellStart"/>
             <w:r>
               <w:t>regi_status</w:t>
             </w:r>
+            <w:proofErr w:type="spellEnd"/>
           </w:p>
         </w:tc>
         <w:tc>
@@ -9322,9 +9772,11 @@
             <w:vAlign w:val="center"/>
           </w:tcPr>
           <w:p>
+            <w:proofErr w:type="spellStart"/>
             <w:r>
               <w:t>regi_emp_id</w:t>
             </w:r>
+            <w:proofErr w:type="spellEnd"/>
           </w:p>
         </w:tc>
         <w:tc>
@@ -9385,8 +9837,13 @@
             <w:tcW w:w="1131" w:type="pct"/>
           </w:tcPr>
           <w:p>
-            <w:r>
-              <w:t>Auto-Incremento.</w:t>
+            <w:proofErr w:type="spellStart"/>
+            <w:r>
+              <w:t>Auto-Incremento</w:t>
+            </w:r>
+            <w:proofErr w:type="spellEnd"/>
+            <w:r>
+              <w:t>.</w:t>
             </w:r>
           </w:p>
         </w:tc>
@@ -9409,9 +9866,11 @@
             <w:vAlign w:val="center"/>
           </w:tcPr>
           <w:p>
+            <w:proofErr w:type="spellStart"/>
             <w:r>
               <w:t>regi_id</w:t>
             </w:r>
+            <w:proofErr w:type="spellEnd"/>
           </w:p>
         </w:tc>
         <w:tc>
@@ -9493,9 +9952,11 @@
             <w:vAlign w:val="center"/>
           </w:tcPr>
           <w:p>
+            <w:proofErr w:type="spellStart"/>
             <w:r>
               <w:t>emp_id</w:t>
             </w:r>
+            <w:proofErr w:type="spellEnd"/>
           </w:p>
         </w:tc>
         <w:tc>
@@ -9576,9 +10037,11 @@
             <w:vAlign w:val="center"/>
           </w:tcPr>
           <w:p>
+            <w:proofErr w:type="spellStart"/>
             <w:r>
               <w:t>regi_emp_data_inicio</w:t>
             </w:r>
+            <w:proofErr w:type="spellEnd"/>
           </w:p>
         </w:tc>
         <w:tc>
@@ -9660,9 +10123,11 @@
             <w:vAlign w:val="center"/>
           </w:tcPr>
           <w:p>
+            <w:proofErr w:type="spellStart"/>
             <w:r>
               <w:t>regi_emp_data_fim</w:t>
             </w:r>
+            <w:proofErr w:type="spellEnd"/>
           </w:p>
         </w:tc>
         <w:tc>
@@ -9740,9 +10205,11 @@
             <w:vAlign w:val="center"/>
           </w:tcPr>
           <w:p>
+            <w:proofErr w:type="spellStart"/>
             <w:r>
               <w:t>regi_emp_motivo_alteracao</w:t>
             </w:r>
+            <w:proofErr w:type="spellEnd"/>
           </w:p>
         </w:tc>
         <w:tc>
@@ -9820,9 +10287,11 @@
             <w:vAlign w:val="center"/>
           </w:tcPr>
           <w:p>
+            <w:proofErr w:type="spellStart"/>
             <w:r>
               <w:t>regi_emp_status</w:t>
             </w:r>
+            <w:proofErr w:type="spellEnd"/>
           </w:p>
         </w:tc>
         <w:tc>
@@ -9909,6 +10378,7 @@
             <w:vAlign w:val="center"/>
           </w:tcPr>
           <w:p>
+            <w:proofErr w:type="spellStart"/>
             <w:r>
               <w:rPr>
                 <w:u w:val="single"/>
@@ -9918,6 +10388,7 @@
             <w:r>
               <w:t>_emp_observacoes</w:t>
             </w:r>
+            <w:proofErr w:type="spellEnd"/>
           </w:p>
         </w:tc>
         <w:tc>
@@ -10238,9 +10709,11 @@
             <w:vAlign w:val="center"/>
           </w:tcPr>
           <w:p>
+            <w:proofErr w:type="spellStart"/>
             <w:r>
               <w:t>doc_id</w:t>
             </w:r>
+            <w:proofErr w:type="spellEnd"/>
           </w:p>
         </w:tc>
         <w:tc>
@@ -10301,8 +10774,13 @@
             <w:tcW w:w="1151" w:type="pct"/>
           </w:tcPr>
           <w:p>
-            <w:r>
-              <w:t>Auto-Incremento.</w:t>
+            <w:proofErr w:type="spellStart"/>
+            <w:r>
+              <w:t>Auto-Incremento</w:t>
+            </w:r>
+            <w:proofErr w:type="spellEnd"/>
+            <w:r>
+              <w:t>.</w:t>
             </w:r>
           </w:p>
         </w:tc>
@@ -10325,9 +10803,11 @@
             <w:vAlign w:val="center"/>
           </w:tcPr>
           <w:p>
+            <w:proofErr w:type="spellStart"/>
             <w:r>
               <w:t>usu_id</w:t>
             </w:r>
+            <w:proofErr w:type="spellEnd"/>
           </w:p>
         </w:tc>
         <w:tc>
@@ -10409,9 +10889,11 @@
             <w:vAlign w:val="center"/>
           </w:tcPr>
           <w:p>
+            <w:proofErr w:type="spellStart"/>
             <w:r>
               <w:t>emp_id</w:t>
             </w:r>
+            <w:proofErr w:type="spellEnd"/>
           </w:p>
         </w:tc>
         <w:tc>
@@ -10492,9 +10974,11 @@
             <w:vAlign w:val="center"/>
           </w:tcPr>
           <w:p>
+            <w:proofErr w:type="spellStart"/>
             <w:r>
               <w:t>tpd_id</w:t>
             </w:r>
+            <w:proofErr w:type="spellEnd"/>
           </w:p>
         </w:tc>
         <w:tc>
@@ -10572,9 +11056,11 @@
             <w:vAlign w:val="center"/>
           </w:tcPr>
           <w:p>
+            <w:proofErr w:type="spellStart"/>
             <w:r>
               <w:t>doc_arquivo_nome</w:t>
             </w:r>
+            <w:proofErr w:type="spellEnd"/>
           </w:p>
         </w:tc>
         <w:tc>
@@ -10656,9 +11142,11 @@
             <w:vAlign w:val="center"/>
           </w:tcPr>
           <w:p>
+            <w:proofErr w:type="spellStart"/>
             <w:r>
               <w:t>doc_data_emissao</w:t>
             </w:r>
+            <w:proofErr w:type="spellEnd"/>
           </w:p>
         </w:tc>
         <w:tc>
@@ -10740,9 +11228,11 @@
             <w:vAlign w:val="center"/>
           </w:tcPr>
           <w:p>
+            <w:proofErr w:type="spellStart"/>
             <w:r>
               <w:t>doc_valor</w:t>
             </w:r>
+            <w:proofErr w:type="spellEnd"/>
           </w:p>
         </w:tc>
         <w:tc>
@@ -10824,9 +11314,11 @@
             <w:vAlign w:val="center"/>
           </w:tcPr>
           <w:p>
+            <w:proofErr w:type="spellStart"/>
             <w:r>
               <w:t>doc_status</w:t>
             </w:r>
+            <w:proofErr w:type="spellEnd"/>
           </w:p>
         </w:tc>
         <w:tc>
@@ -11158,9 +11650,11 @@
             <w:vAlign w:val="center"/>
           </w:tcPr>
           <w:p>
+            <w:proofErr w:type="spellStart"/>
             <w:r>
               <w:t>tpd_id</w:t>
             </w:r>
+            <w:proofErr w:type="spellEnd"/>
           </w:p>
         </w:tc>
         <w:tc>
@@ -11221,8 +11715,13 @@
             <w:tcW w:w="1151" w:type="pct"/>
           </w:tcPr>
           <w:p>
-            <w:r>
-              <w:t>Auto-Incremento.</w:t>
+            <w:proofErr w:type="spellStart"/>
+            <w:r>
+              <w:t>Auto-Incremento</w:t>
+            </w:r>
+            <w:proofErr w:type="spellEnd"/>
+            <w:r>
+              <w:t>.</w:t>
             </w:r>
           </w:p>
         </w:tc>
@@ -11234,8 +11733,13 @@
             <w:vAlign w:val="center"/>
           </w:tcPr>
           <w:p>
-            <w:r>
-              <w:t>Descricão do Tipo do Documento.</w:t>
+            <w:proofErr w:type="spellStart"/>
+            <w:r>
+              <w:t>Descricão</w:t>
+            </w:r>
+            <w:proofErr w:type="spellEnd"/>
+            <w:r>
+              <w:t xml:space="preserve"> do Tipo do Documento.</w:t>
             </w:r>
           </w:p>
         </w:tc>
@@ -11245,9 +11749,11 @@
             <w:vAlign w:val="center"/>
           </w:tcPr>
           <w:p>
+            <w:proofErr w:type="spellStart"/>
             <w:r>
               <w:t>tpd_descricao</w:t>
             </w:r>
+            <w:proofErr w:type="spellEnd"/>
           </w:p>
         </w:tc>
         <w:tc>
@@ -11330,9 +11836,11 @@
             <w:vAlign w:val="center"/>
           </w:tcPr>
           <w:p>
+            <w:proofErr w:type="spellStart"/>
             <w:r>
               <w:t>tpd_status</w:t>
             </w:r>
+            <w:proofErr w:type="spellEnd"/>
           </w:p>
         </w:tc>
         <w:tc>
@@ -11656,9 +12164,11 @@
             <w:vAlign w:val="center"/>
           </w:tcPr>
           <w:p>
+            <w:proofErr w:type="spellStart"/>
             <w:r>
               <w:t>praz_id</w:t>
             </w:r>
+            <w:proofErr w:type="spellEnd"/>
           </w:p>
         </w:tc>
         <w:tc>
@@ -11719,8 +12229,13 @@
             <w:tcW w:w="1151" w:type="pct"/>
           </w:tcPr>
           <w:p>
-            <w:r>
-              <w:t>Auto-Incremento.</w:t>
+            <w:proofErr w:type="spellStart"/>
+            <w:r>
+              <w:t>Auto-Incremento</w:t>
+            </w:r>
+            <w:proofErr w:type="spellEnd"/>
+            <w:r>
+              <w:t>.</w:t>
             </w:r>
           </w:p>
         </w:tc>
@@ -11743,9 +12258,11 @@
             <w:vAlign w:val="center"/>
           </w:tcPr>
           <w:p>
+            <w:proofErr w:type="spellStart"/>
             <w:r>
               <w:t>emp_id</w:t>
             </w:r>
+            <w:proofErr w:type="spellEnd"/>
           </w:p>
         </w:tc>
         <w:tc>
@@ -11826,9 +12343,11 @@
             <w:vAlign w:val="center"/>
           </w:tcPr>
           <w:p>
+            <w:proofErr w:type="spellStart"/>
             <w:r>
               <w:t>praz_descricao</w:t>
             </w:r>
+            <w:proofErr w:type="spellEnd"/>
           </w:p>
         </w:tc>
         <w:tc>
@@ -11910,9 +12429,11 @@
             <w:vAlign w:val="center"/>
           </w:tcPr>
           <w:p>
+            <w:proofErr w:type="spellStart"/>
             <w:r>
               <w:t>praz_data_vencimento</w:t>
             </w:r>
+            <w:proofErr w:type="spellEnd"/>
           </w:p>
         </w:tc>
         <w:tc>
@@ -11997,9 +12518,11 @@
             <w:pPr>
               <w:ind w:left="11328" w:hanging="11328"/>
             </w:pPr>
+            <w:proofErr w:type="spellStart"/>
             <w:r>
               <w:t>praz_status</w:t>
             </w:r>
+            <w:proofErr w:type="spellEnd"/>
           </w:p>
         </w:tc>
         <w:tc>
@@ -12342,9 +12865,11 @@
             <w:vAlign w:val="center"/>
           </w:tcPr>
           <w:p>
+            <w:proofErr w:type="spellStart"/>
             <w:r>
               <w:t>aud_id</w:t>
             </w:r>
+            <w:proofErr w:type="spellEnd"/>
           </w:p>
         </w:tc>
         <w:tc>
@@ -12405,8 +12930,13 @@
             <w:tcW w:w="1151" w:type="pct"/>
           </w:tcPr>
           <w:p>
-            <w:r>
-              <w:t>Auto-Incremento.</w:t>
+            <w:proofErr w:type="spellStart"/>
+            <w:r>
+              <w:t>Auto-Incremento</w:t>
+            </w:r>
+            <w:proofErr w:type="spellEnd"/>
+            <w:r>
+              <w:t>.</w:t>
             </w:r>
           </w:p>
         </w:tc>
@@ -12429,9 +12959,11 @@
             <w:vAlign w:val="center"/>
           </w:tcPr>
           <w:p>
+            <w:proofErr w:type="spellStart"/>
             <w:r>
               <w:t>usu_id</w:t>
             </w:r>
+            <w:proofErr w:type="spellEnd"/>
           </w:p>
         </w:tc>
         <w:tc>
@@ -12512,9 +13044,11 @@
             <w:vAlign w:val="center"/>
           </w:tcPr>
           <w:p>
+            <w:proofErr w:type="spellStart"/>
             <w:r>
               <w:t>aud_acao</w:t>
             </w:r>
+            <w:proofErr w:type="spellEnd"/>
           </w:p>
         </w:tc>
         <w:tc>
@@ -12614,9 +13148,11 @@
             <w:vAlign w:val="center"/>
           </w:tcPr>
           <w:p>
+            <w:proofErr w:type="spellStart"/>
             <w:r>
               <w:t>aud_tabela_afetada</w:t>
             </w:r>
+            <w:proofErr w:type="spellEnd"/>
           </w:p>
         </w:tc>
         <w:tc>
@@ -12698,9 +13234,11 @@
             <w:vAlign w:val="center"/>
           </w:tcPr>
           <w:p>
+            <w:proofErr w:type="spellStart"/>
             <w:r>
               <w:t>aud_registro_afetado</w:t>
             </w:r>
+            <w:proofErr w:type="spellEnd"/>
           </w:p>
         </w:tc>
         <w:tc>
@@ -12782,9 +13320,11 @@
             <w:vAlign w:val="center"/>
           </w:tcPr>
           <w:p>
+            <w:proofErr w:type="spellStart"/>
             <w:r>
               <w:t>aud_data_acao</w:t>
             </w:r>
+            <w:proofErr w:type="spellEnd"/>
           </w:p>
         </w:tc>
         <w:tc>
@@ -13101,9 +13641,11 @@
             <w:vAlign w:val="center"/>
           </w:tcPr>
           <w:p>
+            <w:proofErr w:type="spellStart"/>
             <w:r>
               <w:t>sup_id</w:t>
             </w:r>
+            <w:proofErr w:type="spellEnd"/>
           </w:p>
         </w:tc>
         <w:tc>
@@ -13164,8 +13706,13 @@
             <w:tcW w:w="1151" w:type="pct"/>
           </w:tcPr>
           <w:p>
-            <w:r>
-              <w:t>Auto-Incremento.</w:t>
+            <w:proofErr w:type="spellStart"/>
+            <w:r>
+              <w:t>Auto-Incremento</w:t>
+            </w:r>
+            <w:proofErr w:type="spellEnd"/>
+            <w:r>
+              <w:t>.</w:t>
             </w:r>
           </w:p>
         </w:tc>
@@ -13189,9 +13736,11 @@
             <w:vAlign w:val="center"/>
           </w:tcPr>
           <w:p>
+            <w:proofErr w:type="spellStart"/>
             <w:r>
               <w:t>usu_id_solicitante</w:t>
             </w:r>
+            <w:proofErr w:type="spellEnd"/>
           </w:p>
         </w:tc>
         <w:tc>
@@ -13272,9 +13821,11 @@
             <w:vAlign w:val="center"/>
           </w:tcPr>
           <w:p>
+            <w:proofErr w:type="spellStart"/>
             <w:r>
               <w:t>usu_id_responsavel</w:t>
             </w:r>
+            <w:proofErr w:type="spellEnd"/>
           </w:p>
         </w:tc>
         <w:tc>
@@ -13355,9 +13906,11 @@
             <w:vAlign w:val="center"/>
           </w:tcPr>
           <w:p>
+            <w:proofErr w:type="spellStart"/>
             <w:r>
               <w:t>sup_assunto</w:t>
             </w:r>
+            <w:proofErr w:type="spellEnd"/>
           </w:p>
         </w:tc>
         <w:tc>
@@ -13439,9 +13992,11 @@
             <w:vAlign w:val="center"/>
           </w:tcPr>
           <w:p>
+            <w:proofErr w:type="spellStart"/>
             <w:r>
               <w:t>sup_descricao</w:t>
             </w:r>
+            <w:proofErr w:type="spellEnd"/>
           </w:p>
         </w:tc>
         <w:tc>
@@ -13523,9 +14078,11 @@
             <w:vAlign w:val="center"/>
           </w:tcPr>
           <w:p>
+            <w:proofErr w:type="spellStart"/>
             <w:r>
               <w:t>sup_status</w:t>
             </w:r>
+            <w:proofErr w:type="spellEnd"/>
           </w:p>
         </w:tc>
         <w:tc>
@@ -13625,9 +14182,11 @@
             <w:vAlign w:val="center"/>
           </w:tcPr>
           <w:p>
+            <w:proofErr w:type="spellStart"/>
             <w:r>
               <w:t>sup_data_abertura</w:t>
             </w:r>
+            <w:proofErr w:type="spellEnd"/>
           </w:p>
         </w:tc>
         <w:tc>
@@ -13709,9 +14268,11 @@
             <w:vAlign w:val="center"/>
           </w:tcPr>
           <w:p>
+            <w:proofErr w:type="spellStart"/>
             <w:r>
               <w:t>sup_data_suporte</w:t>
             </w:r>
+            <w:proofErr w:type="spellEnd"/>
           </w:p>
         </w:tc>
         <w:tc>
@@ -13796,9 +14357,11 @@
             <w:vAlign w:val="center"/>
           </w:tcPr>
           <w:p>
+            <w:proofErr w:type="spellStart"/>
             <w:r>
               <w:t>sup_id_resp</w:t>
             </w:r>
+            <w:proofErr w:type="spellEnd"/>
           </w:p>
         </w:tc>
         <w:tc>
@@ -14203,7 +14766,15 @@
     </w:p>
     <w:p>
       <w:r>
-        <w:t>Solicitamos informações pessoais apenas quando realmente precisamos delas para lhe fornecer um serviço. Fazemo-lo por meios justos e legais, com o seu conhecimento e consentimento. Também informamos por que estamos coletando e como será usado.</w:t>
+        <w:t xml:space="preserve">Solicitamos informações pessoais apenas quando realmente precisamos delas para lhe </w:t>
+      </w:r>
+      <w:proofErr w:type="spellStart"/>
+      <w:r>
+        <w:t>fornecer</w:t>
+      </w:r>
+      <w:proofErr w:type="spellEnd"/>
+      <w:r>
+        <w:t xml:space="preserve"> um serviço. Fazemo-lo por meios justos e legais, com o seu conhecimento e consentimento. Também informamos por que estamos coletando e como será usado.</w:t>
       </w:r>
     </w:p>
     <w:p>
@@ -14223,7 +14794,15 @@
     </w:p>
     <w:p>
       <w:r>
-        <w:t>Você é livre para recusar a nossa solicitação de informações pessoais, entendendo que talvez não possamos fornecer alguns dos serviços desejados.</w:t>
+        <w:t xml:space="preserve">Você é livre para recusar a nossa solicitação de informações pessoais, entendendo que talvez não possamos </w:t>
+      </w:r>
+      <w:proofErr w:type="spellStart"/>
+      <w:r>
+        <w:t>fornecer</w:t>
+      </w:r>
+      <w:proofErr w:type="spellEnd"/>
+      <w:r>
+        <w:t xml:space="preserve"> alguns dos serviços desejados.</w:t>
       </w:r>
     </w:p>
     <w:p>
@@ -14245,7 +14824,23 @@
         <w:t xml:space="preserve">- </w:t>
       </w:r>
       <w:r>
-        <w:t>O serviço Google AdSense que usamos para veicular publicidade usa um cookie DoubleClick para veicular anúncios mais relevantes em toda a Web e limitar o número de vezes que um determinado anúncio é exibido para você.</w:t>
+        <w:t xml:space="preserve">O serviço Google </w:t>
+      </w:r>
+      <w:proofErr w:type="spellStart"/>
+      <w:r>
+        <w:t>AdSense</w:t>
+      </w:r>
+      <w:proofErr w:type="spellEnd"/>
+      <w:r>
+        <w:t xml:space="preserve"> que usamos para veicular publicidade usa um cookie </w:t>
+      </w:r>
+      <w:proofErr w:type="spellStart"/>
+      <w:r>
+        <w:t>DoubleClick</w:t>
+      </w:r>
+      <w:proofErr w:type="spellEnd"/>
+      <w:r>
+        <w:t xml:space="preserve"> para veicular anúncios mais relevantes em toda a Web e limitar o número de vezes que um determinado anúncio é exibido para você.</w:t>
       </w:r>
     </w:p>
     <w:p>
@@ -14253,7 +14848,31 @@
         <w:t xml:space="preserve">- </w:t>
       </w:r>
       <w:r>
-        <w:t>Para mais informações sobre o Google AdSense, consulte as FAQs oficiais sobre privacidade do Google AdSense.</w:t>
+        <w:t xml:space="preserve">Para mais informações sobre o Google </w:t>
+      </w:r>
+      <w:proofErr w:type="spellStart"/>
+      <w:r>
+        <w:t>AdSense</w:t>
+      </w:r>
+      <w:proofErr w:type="spellEnd"/>
+      <w:r>
+        <w:t xml:space="preserve">, consulte as </w:t>
+      </w:r>
+      <w:proofErr w:type="spellStart"/>
+      <w:r>
+        <w:t>FAQs</w:t>
+      </w:r>
+      <w:proofErr w:type="spellEnd"/>
+      <w:r>
+        <w:t xml:space="preserve"> oficiais sobre privacidade do Google </w:t>
+      </w:r>
+      <w:proofErr w:type="spellStart"/>
+      <w:r>
+        <w:t>AdSense</w:t>
+      </w:r>
+      <w:proofErr w:type="spellEnd"/>
+      <w:r>
+        <w:t>.</w:t>
       </w:r>
     </w:p>
     <w:p>
@@ -14427,7 +15046,15 @@
         </w:numPr>
       </w:pPr>
       <w:r>
-        <w:t>tentar descompilar ou fazer engenharia reversa de qualquer software contido no site Contax;</w:t>
+        <w:t xml:space="preserve">tentar </w:t>
+      </w:r>
+      <w:proofErr w:type="spellStart"/>
+      <w:r>
+        <w:t>descompilar</w:t>
+      </w:r>
+      <w:proofErr w:type="spellEnd"/>
+      <w:r>
+        <w:t xml:space="preserve"> ou fazer engenharia reversa de qualquer software contido no site Contax;</w:t>
       </w:r>
     </w:p>
     <w:p>
@@ -14456,7 +15083,15 @@
     </w:p>
     <w:p>
       <w:r>
-        <w:t>Esta licença será automaticamente rescindida se você violar alguma dessas restrições e poderá ser rescindida por Contax a qualquer momento. Ao encerrar a visualização desses materiais ou após o término desta licença, você deve apagar todos os materiais baixados em sua posse, seja em formato eletrónico ou impresso.</w:t>
+        <w:t xml:space="preserve">Esta licença será automaticamente rescindida se você violar alguma dessas restrições e poderá ser rescindida por Contax a qualquer momento. Ao encerrar a visualização desses materiais ou após o término desta licença, você deve apagar todos os materiais baixados em sua posse, seja em formato </w:t>
+      </w:r>
+      <w:proofErr w:type="spellStart"/>
+      <w:r>
+        <w:t>eletrónico</w:t>
+      </w:r>
+      <w:proofErr w:type="spellEnd"/>
+      <w:r>
+        <w:t xml:space="preserve"> ou impresso.</w:t>
       </w:r>
     </w:p>
     <w:p>
@@ -14513,7 +15148,15 @@
     </w:p>
     <w:p>
       <w:r>
-        <w:t>Em nenhum caso o Contax ou seus fornecedores serão responsáveis ​​por quaisquer danos (incluindo, sem limitação, danos por perda de dados ou lucro ou devido a interrupção dos negócios) decorrentes do uso ou da incapacidade de usar os materiais em Contax, mesmo que Contax ou um representante autorizado da Contax tenha sido notificado oralmente ou por escrito da possibilidade de tais danos. Como algumas jurisdições não permitem limitações em garantias implícitas, ou limitações de responsabilidade por danos conseqüentes ou incidentais, essas limitações podem não se aplicar a você.</w:t>
+        <w:t xml:space="preserve">Em nenhum caso o Contax ou seus fornecedores serão responsáveis ​​por quaisquer danos (incluindo, sem limitação, danos por perda de dados ou lucro ou devido a interrupção dos negócios) decorrentes do uso ou da incapacidade de usar os materiais em Contax, mesmo que Contax ou um representante autorizado da Contax tenha sido notificado oralmente ou por escrito da possibilidade de tais danos. Como algumas jurisdições não permitem limitações em garantias implícitas, ou limitações de responsabilidade por danos </w:t>
+      </w:r>
+      <w:proofErr w:type="spellStart"/>
+      <w:r>
+        <w:t>conseqüentes</w:t>
+      </w:r>
+      <w:proofErr w:type="spellEnd"/>
+      <w:r>
+        <w:t xml:space="preserve"> ou incidentais, essas limitações podem não se aplicar a você.</w:t>
       </w:r>
     </w:p>
     <w:p>
@@ -14709,7 +15352,31 @@
     <w:p/>
     <w:p>
       <w:r>
-        <w:t>ALBUQUERQUE, Felipe et al. Integraçao de Replicaçao Máquina de Estados no Kubernetes. In: </w:t>
+        <w:t xml:space="preserve">ALBUQUERQUE, Felipe et al. </w:t>
+      </w:r>
+      <w:proofErr w:type="spellStart"/>
+      <w:r>
+        <w:t>Integraçao</w:t>
+      </w:r>
+      <w:proofErr w:type="spellEnd"/>
+      <w:r>
+        <w:t xml:space="preserve"> de </w:t>
+      </w:r>
+      <w:proofErr w:type="spellStart"/>
+      <w:r>
+        <w:t>Replicaçao</w:t>
+      </w:r>
+      <w:proofErr w:type="spellEnd"/>
+      <w:r>
+        <w:t xml:space="preserve"> Máquina de Estados no </w:t>
+      </w:r>
+      <w:proofErr w:type="spellStart"/>
+      <w:r>
+        <w:t>Kubernetes</w:t>
+      </w:r>
+      <w:proofErr w:type="spellEnd"/>
+      <w:r>
+        <w:t>. In: </w:t>
       </w:r>
       <w:r>
         <w:rPr>
@@ -14739,7 +15406,23 @@
     <w:p/>
     <w:p>
       <w:r>
-        <w:t>Oliveira S de M de. O funcionamento da autoria nos blogs de divulgação científica. Ling (dis)curso</w:t>
+        <w:t xml:space="preserve">Oliveira S de M de. O funcionamento da autoria nos blogs de divulgação científica. </w:t>
+      </w:r>
+      <w:proofErr w:type="spellStart"/>
+      <w:r>
+        <w:t>Ling</w:t>
+      </w:r>
+      <w:proofErr w:type="spellEnd"/>
+      <w:r>
+        <w:t xml:space="preserve"> (</w:t>
+      </w:r>
+      <w:proofErr w:type="spellStart"/>
+      <w:r>
+        <w:t>dis</w:t>
+      </w:r>
+      <w:proofErr w:type="spellEnd"/>
+      <w:r>
+        <w:t>)curso</w:t>
       </w:r>
       <w:r>
         <w:t>,</w:t>
@@ -14810,7 +15493,15 @@
     <w:p/>
     <w:p>
       <w:r>
-        <w:t>Texto ou documento elaborado pelo autor, a fim de complementar sua argumentação. O(s) apêndice(s) é(são) identificado(s) por letras maiúsculas consecutivas, travessão e pelos res- pectivos títulos. Excepcionalmente utilizam-se letras maiúsculas dobradas, na identificação dos apêndices, quando esgotadas as 26 letras do alfabeto.</w:t>
+        <w:t xml:space="preserve">Texto ou documento elaborado pelo autor, a fim de complementar sua argumentação. O(s) apêndice(s) é(são) identificado(s) por letras maiúsculas consecutivas, travessão e pelos res- </w:t>
+      </w:r>
+      <w:proofErr w:type="spellStart"/>
+      <w:r>
+        <w:t>pectivos</w:t>
+      </w:r>
+      <w:proofErr w:type="spellEnd"/>
+      <w:r>
+        <w:t xml:space="preserve"> títulos. Excepcionalmente utilizam-se letras maiúsculas dobradas, na identificação dos apêndices, quando esgotadas as 26 letras do alfabeto.</w:t>
       </w:r>
     </w:p>
     <w:p/>
@@ -17154,15 +17845,6 @@
 </file>
 
 <file path=customXml/item1.xml><?xml version="1.0" encoding="utf-8"?>
-<?mso-contentType ?>
-<FormTemplates xmlns="http://schemas.microsoft.com/sharepoint/v3/contenttype/forms">
-  <Display>DocumentLibraryForm</Display>
-  <Edit>DocumentLibraryForm</Edit>
-  <New>DocumentLibraryForm</New>
-</FormTemplates>
-</file>
-
-<file path=customXml/item2.xml><?xml version="1.0" encoding="utf-8"?>
 <ct:contentTypeSchema xmlns:ct="http://schemas.microsoft.com/office/2006/metadata/contentType" xmlns:ma="http://schemas.microsoft.com/office/2006/metadata/properties/metaAttributes" ct:_="" ma:_="" ma:contentTypeName="Documento" ma:contentTypeID="0x01010079E85AF13E1D6948BAEBBC3E299C7A4C" ma:contentTypeVersion="11" ma:contentTypeDescription="Crie um novo documento." ma:contentTypeScope="" ma:versionID="9903338d6f6ebf8d9f52e57d695b90e0">
   <xsd:schema xmlns:xsd="http://www.w3.org/2001/XMLSchema" xmlns:xs="http://www.w3.org/2001/XMLSchema" xmlns:p="http://schemas.microsoft.com/office/2006/metadata/properties" xmlns:ns2="1c99b82c-450d-407b-8685-188b0222f857" xmlns:ns3="ec9326a9-796b-4177-81ae-8ce46d6874ce" targetNamespace="http://schemas.microsoft.com/office/2006/metadata/properties" ma:root="true" ma:fieldsID="27025b9af28ab54196939bbeabbec0a9" ns2:_="" ns3:_="">
     <xsd:import namespace="1c99b82c-450d-407b-8685-188b0222f857"/>
@@ -17351,19 +18033,20 @@
 </ct:contentTypeSchema>
 </file>
 
+<file path=customXml/item2.xml><?xml version="1.0" encoding="utf-8"?>
+<?mso-contentType ?>
+<FormTemplates xmlns="http://schemas.microsoft.com/sharepoint/v3/contenttype/forms">
+  <Display>DocumentLibraryForm</Display>
+  <Edit>DocumentLibraryForm</Edit>
+  <New>DocumentLibraryForm</New>
+</FormTemplates>
+</file>
+
 <file path=customXml/item3.xml><?xml version="1.0" encoding="utf-8"?>
 <b:Sources xmlns:b="http://schemas.openxmlformats.org/officeDocument/2006/bibliography" xmlns="http://schemas.openxmlformats.org/officeDocument/2006/bibliography" SelectedStyle="\APA.XSL" StyleName="APA"/>
 </file>
 
 <file path=customXml/itemProps1.xml><?xml version="1.0" encoding="utf-8"?>
-<ds:datastoreItem xmlns:ds="http://schemas.openxmlformats.org/officeDocument/2006/customXml" ds:itemID="{19856E04-179F-401F-8246-BA08537D6152}">
-  <ds:schemaRefs>
-    <ds:schemaRef ds:uri="http://schemas.microsoft.com/sharepoint/v3/contenttype/forms"/>
-  </ds:schemaRefs>
-</ds:datastoreItem>
-</file>
-
-<file path=customXml/itemProps2.xml><?xml version="1.0" encoding="utf-8"?>
 <ds:datastoreItem xmlns:ds="http://schemas.openxmlformats.org/officeDocument/2006/customXml" ds:itemID="{F9562963-6458-4B09-8DDA-F09296948AA7}">
   <ds:schemaRefs>
     <ds:schemaRef ds:uri="http://schemas.microsoft.com/office/2006/metadata/contentType"/>
@@ -17382,6 +18065,14 @@
 </ds:datastoreItem>
 </file>
 
+<file path=customXml/itemProps2.xml><?xml version="1.0" encoding="utf-8"?>
+<ds:datastoreItem xmlns:ds="http://schemas.openxmlformats.org/officeDocument/2006/customXml" ds:itemID="{19856E04-179F-401F-8246-BA08537D6152}">
+  <ds:schemaRefs>
+    <ds:schemaRef ds:uri="http://schemas.microsoft.com/sharepoint/v3/contenttype/forms"/>
+  </ds:schemaRefs>
+</ds:datastoreItem>
+</file>
+
 <file path=customXml/itemProps3.xml><?xml version="1.0" encoding="utf-8"?>
 <ds:datastoreItem xmlns:ds="http://schemas.openxmlformats.org/officeDocument/2006/customXml" ds:itemID="{205E797E-3F55-48D0-B859-951F215AD568}">
   <ds:schemaRefs>

</xml_diff>

<commit_message>
correção de formatação de sumário
</commit_message>
<xml_diff>
--- a/Documentação/Doc atualizado.docx
+++ b/Documentação/Doc atualizado.docx
@@ -357,35 +357,7 @@
         <w:rPr>
           <w:sz w:val="22"/>
         </w:rPr>
-        <w:t xml:space="preserve">ETEC Prof. </w:t>
-      </w:r>
-      <w:proofErr w:type="spellStart"/>
-      <w:r>
-        <w:rPr>
-          <w:sz w:val="22"/>
-        </w:rPr>
-        <w:t>Massuyuki</w:t>
-      </w:r>
-      <w:proofErr w:type="spellEnd"/>
-      <w:r>
-        <w:rPr>
-          <w:sz w:val="22"/>
-        </w:rPr>
-        <w:t xml:space="preserve"> </w:t>
-      </w:r>
-      <w:proofErr w:type="spellStart"/>
-      <w:r>
-        <w:rPr>
-          <w:sz w:val="22"/>
-        </w:rPr>
-        <w:t>Kawano</w:t>
-      </w:r>
-      <w:proofErr w:type="spellEnd"/>
-      <w:r>
-        <w:rPr>
-          <w:sz w:val="22"/>
-        </w:rPr>
-        <w:t>,</w:t>
+        <w:t>ETEC Prof. Massuyuki Kawano,</w:t>
       </w:r>
       <w:r>
         <w:rPr>
@@ -1034,13 +1006,13 @@
       <w:r>
         <w:fldChar w:fldCharType="separate"/>
       </w:r>
-      <w:hyperlink w:anchor="_Toc229592415" w:history="1">
+      <w:hyperlink w:anchor="_Toc229598871" w:history="1">
         <w:r>
           <w:rPr>
             <w:rStyle w:val="Hyperlink"/>
             <w:noProof/>
           </w:rPr>
-          <w:t>Figura 1 - Modelo relacional das tabelas do projeto CONTAX.</w:t>
+          <w:t>Figura 1: Modelo relacional das tabelas do projeto CONTAX.</w:t>
         </w:r>
         <w:r>
           <w:rPr>
@@ -1061,7 +1033,7 @@
             <w:noProof/>
             <w:webHidden/>
           </w:rPr>
-          <w:instrText xml:space="preserve"> PAGEREF _Toc229592415 \h </w:instrText>
+          <w:instrText xml:space="preserve"> PAGEREF _Toc229598871 \h </w:instrText>
         </w:r>
         <w:r>
           <w:rPr>
@@ -1081,7 +1053,7 @@
             <w:noProof/>
             <w:webHidden/>
           </w:rPr>
-          <w:t>18</w:t>
+          <w:t>16</w:t>
         </w:r>
         <w:r>
           <w:rPr>
@@ -1107,13 +1079,13 @@
           <w14:ligatures w14:val="standardContextual"/>
         </w:rPr>
       </w:pPr>
-      <w:hyperlink w:anchor="_Toc229592416" w:history="1">
+      <w:hyperlink w:anchor="_Toc229598872" w:history="1">
         <w:r>
           <w:rPr>
             <w:rStyle w:val="Hyperlink"/>
             <w:noProof/>
           </w:rPr>
-          <w:t>Figura 2: tela de login do software Contax.</w:t>
+          <w:t>Figura 2: Tela de login do software Contax.</w:t>
         </w:r>
         <w:r>
           <w:rPr>
@@ -1134,7 +1106,153 @@
             <w:noProof/>
             <w:webHidden/>
           </w:rPr>
-          <w:instrText xml:space="preserve"> PAGEREF _Toc229592416 \h </w:instrText>
+          <w:instrText xml:space="preserve"> PAGEREF _Toc229598872 \h </w:instrText>
+        </w:r>
+        <w:r>
+          <w:rPr>
+            <w:noProof/>
+            <w:webHidden/>
+          </w:rPr>
+        </w:r>
+        <w:r>
+          <w:rPr>
+            <w:noProof/>
+            <w:webHidden/>
+          </w:rPr>
+          <w:fldChar w:fldCharType="separate"/>
+        </w:r>
+        <w:r>
+          <w:rPr>
+            <w:noProof/>
+            <w:webHidden/>
+          </w:rPr>
+          <w:t>27</w:t>
+        </w:r>
+        <w:r>
+          <w:rPr>
+            <w:noProof/>
+            <w:webHidden/>
+          </w:rPr>
+          <w:fldChar w:fldCharType="end"/>
+        </w:r>
+      </w:hyperlink>
+    </w:p>
+    <w:p>
+      <w:pPr>
+        <w:pStyle w:val="ndicedeilustraes"/>
+        <w:tabs>
+          <w:tab w:val="right" w:leader="dot" w:pos="9061"/>
+        </w:tabs>
+        <w:rPr>
+          <w:rFonts w:asciiTheme="minorHAnsi" w:eastAsiaTheme="minorEastAsia" w:hAnsiTheme="minorHAnsi"/>
+          <w:noProof/>
+          <w:kern w:val="2"/>
+          <w:szCs w:val="24"/>
+          <w:lang w:eastAsia="pt-BR"/>
+          <w14:ligatures w14:val="standardContextual"/>
+        </w:rPr>
+      </w:pPr>
+      <w:hyperlink w:anchor="_Toc229598873" w:history="1">
+        <w:r>
+          <w:rPr>
+            <w:rStyle w:val="Hyperlink"/>
+            <w:noProof/>
+          </w:rPr>
+          <w:t>Figura 3: Tela de dashboard do administrador.</w:t>
+        </w:r>
+        <w:r>
+          <w:rPr>
+            <w:noProof/>
+            <w:webHidden/>
+          </w:rPr>
+          <w:tab/>
+        </w:r>
+        <w:r>
+          <w:rPr>
+            <w:noProof/>
+            <w:webHidden/>
+          </w:rPr>
+          <w:fldChar w:fldCharType="begin"/>
+        </w:r>
+        <w:r>
+          <w:rPr>
+            <w:noProof/>
+            <w:webHidden/>
+          </w:rPr>
+          <w:instrText xml:space="preserve"> PAGEREF _Toc229598873 \h </w:instrText>
+        </w:r>
+        <w:r>
+          <w:rPr>
+            <w:noProof/>
+            <w:webHidden/>
+          </w:rPr>
+        </w:r>
+        <w:r>
+          <w:rPr>
+            <w:noProof/>
+            <w:webHidden/>
+          </w:rPr>
+          <w:fldChar w:fldCharType="separate"/>
+        </w:r>
+        <w:r>
+          <w:rPr>
+            <w:noProof/>
+            <w:webHidden/>
+          </w:rPr>
+          <w:t>28</w:t>
+        </w:r>
+        <w:r>
+          <w:rPr>
+            <w:noProof/>
+            <w:webHidden/>
+          </w:rPr>
+          <w:fldChar w:fldCharType="end"/>
+        </w:r>
+      </w:hyperlink>
+    </w:p>
+    <w:p>
+      <w:pPr>
+        <w:pStyle w:val="ndicedeilustraes"/>
+        <w:tabs>
+          <w:tab w:val="right" w:leader="dot" w:pos="9061"/>
+        </w:tabs>
+        <w:rPr>
+          <w:rFonts w:asciiTheme="minorHAnsi" w:eastAsiaTheme="minorEastAsia" w:hAnsiTheme="minorHAnsi"/>
+          <w:noProof/>
+          <w:kern w:val="2"/>
+          <w:szCs w:val="24"/>
+          <w:lang w:eastAsia="pt-BR"/>
+          <w14:ligatures w14:val="standardContextual"/>
+        </w:rPr>
+      </w:pPr>
+      <w:hyperlink w:anchor="_Toc229598874" w:history="1">
+        <w:r>
+          <w:rPr>
+            <w:rStyle w:val="Hyperlink"/>
+            <w:noProof/>
+          </w:rPr>
+          <w:t>Figura 4: Interface de cadastro de empresa administrada pelo contador.</w:t>
+        </w:r>
+        <w:r>
+          <w:rPr>
+            <w:noProof/>
+            <w:webHidden/>
+          </w:rPr>
+          <w:tab/>
+        </w:r>
+        <w:r>
+          <w:rPr>
+            <w:noProof/>
+            <w:webHidden/>
+          </w:rPr>
+          <w:fldChar w:fldCharType="begin"/>
+        </w:r>
+        <w:r>
+          <w:rPr>
+            <w:noProof/>
+            <w:webHidden/>
+          </w:rPr>
+          <w:instrText xml:space="preserve"> PAGEREF _Toc229598874 \h </w:instrText>
         </w:r>
         <w:r>
           <w:rPr>
@@ -1180,13 +1298,13 @@
           <w14:ligatures w14:val="standardContextual"/>
         </w:rPr>
       </w:pPr>
-      <w:hyperlink w:anchor="_Toc229592417" w:history="1">
+      <w:hyperlink w:anchor="_Toc229598875" w:history="1">
         <w:r>
           <w:rPr>
             <w:rStyle w:val="Hyperlink"/>
             <w:noProof/>
           </w:rPr>
-          <w:t>Figura 3: Tela de dashboard do administrador.</w:t>
+          <w:t>Figura 5: Interface de cadastro de usuário administrada pelo contador.</w:t>
         </w:r>
         <w:r>
           <w:rPr>
@@ -1207,7 +1325,7 @@
             <w:noProof/>
             <w:webHidden/>
           </w:rPr>
-          <w:instrText xml:space="preserve"> PAGEREF _Toc229592417 \h </w:instrText>
+          <w:instrText xml:space="preserve"> PAGEREF _Toc229598875 \h </w:instrText>
         </w:r>
         <w:r>
           <w:rPr>
@@ -1253,20 +1371,20 @@
           <w14:ligatures w14:val="standardContextual"/>
         </w:rPr>
       </w:pPr>
-      <w:hyperlink w:anchor="_Toc229592418" w:history="1">
+      <w:hyperlink w:anchor="_Toc229598876" w:history="1">
         <w:r>
           <w:rPr>
             <w:rStyle w:val="Hyperlink"/>
             <w:noProof/>
           </w:rPr>
-          <w:t>Figura 4: Interface de cadastro administrada pelo contador.</w:t>
+          <w:t xml:space="preserve">Figura 6: Interface central da empresa MEI. </w:t>
         </w:r>
         <w:r>
           <w:rPr>
             <w:noProof/>
             <w:webHidden/>
           </w:rPr>
-          <w:t xml:space="preserve">..................................... </w:t>
+          <w:tab/>
         </w:r>
         <w:r>
           <w:rPr>
@@ -1280,7 +1398,80 @@
             <w:noProof/>
             <w:webHidden/>
           </w:rPr>
-          <w:instrText xml:space="preserve"> PAGEREF _Toc229592418 \h </w:instrText>
+          <w:instrText xml:space="preserve"> PAGEREF _Toc229598876 \h </w:instrText>
+        </w:r>
+        <w:r>
+          <w:rPr>
+            <w:noProof/>
+            <w:webHidden/>
+          </w:rPr>
+        </w:r>
+        <w:r>
+          <w:rPr>
+            <w:noProof/>
+            <w:webHidden/>
+          </w:rPr>
+          <w:fldChar w:fldCharType="separate"/>
+        </w:r>
+        <w:r>
+          <w:rPr>
+            <w:noProof/>
+            <w:webHidden/>
+          </w:rPr>
+          <w:t>30</w:t>
+        </w:r>
+        <w:r>
+          <w:rPr>
+            <w:noProof/>
+            <w:webHidden/>
+          </w:rPr>
+          <w:fldChar w:fldCharType="end"/>
+        </w:r>
+      </w:hyperlink>
+    </w:p>
+    <w:p>
+      <w:pPr>
+        <w:pStyle w:val="ndicedeilustraes"/>
+        <w:tabs>
+          <w:tab w:val="right" w:leader="dot" w:pos="9061"/>
+        </w:tabs>
+        <w:rPr>
+          <w:rFonts w:asciiTheme="minorHAnsi" w:eastAsiaTheme="minorEastAsia" w:hAnsiTheme="minorHAnsi"/>
+          <w:noProof/>
+          <w:kern w:val="2"/>
+          <w:szCs w:val="24"/>
+          <w:lang w:eastAsia="pt-BR"/>
+          <w14:ligatures w14:val="standardContextual"/>
+        </w:rPr>
+      </w:pPr>
+      <w:hyperlink w:anchor="_Toc229598877" w:history="1">
+        <w:r>
+          <w:rPr>
+            <w:rStyle w:val="Hyperlink"/>
+            <w:noProof/>
+          </w:rPr>
+          <w:t>Figura 7: Interface central da empresa ME.</w:t>
+        </w:r>
+        <w:r>
+          <w:rPr>
+            <w:noProof/>
+            <w:webHidden/>
+          </w:rPr>
+          <w:tab/>
+        </w:r>
+        <w:r>
+          <w:rPr>
+            <w:noProof/>
+            <w:webHidden/>
+          </w:rPr>
+          <w:fldChar w:fldCharType="begin"/>
+        </w:r>
+        <w:r>
+          <w:rPr>
+            <w:noProof/>
+            <w:webHidden/>
+          </w:rPr>
+          <w:instrText xml:space="preserve"> PAGEREF _Toc229598877 \h </w:instrText>
         </w:r>
         <w:r>
           <w:rPr>
@@ -1326,20 +1517,13 @@
           <w14:ligatures w14:val="standardContextual"/>
         </w:rPr>
       </w:pPr>
-      <w:hyperlink w:anchor="_Toc229592419" w:history="1">
+      <w:hyperlink w:anchor="_Toc229598878" w:history="1">
         <w:r>
           <w:rPr>
             <w:rStyle w:val="Hyperlink"/>
             <w:noProof/>
           </w:rPr>
-          <w:t>Figura 5: Interface de cadastro de usuário, administrada pelo contado</w:t>
-        </w:r>
-        <w:r>
-          <w:rPr>
-            <w:rStyle w:val="Hyperlink"/>
-            <w:noProof/>
-          </w:rPr>
-          <w:t>r.</w:t>
+          <w:t xml:space="preserve">Figura 8: Tela de documentos. </w:t>
         </w:r>
         <w:r>
           <w:rPr>
@@ -1360,7 +1544,7 @@
             <w:noProof/>
             <w:webHidden/>
           </w:rPr>
-          <w:instrText xml:space="preserve"> PAGEREF _Toc229592419 \h </w:instrText>
+          <w:instrText xml:space="preserve"> PAGEREF _Toc229598878 \h </w:instrText>
         </w:r>
         <w:r>
           <w:rPr>
@@ -1380,7 +1564,7 @@
             <w:noProof/>
             <w:webHidden/>
           </w:rPr>
-          <w:t>32</w:t>
+          <w:t>31</w:t>
         </w:r>
         <w:r>
           <w:rPr>
@@ -1606,21 +1790,7 @@
             <w:rStyle w:val="Hyperlink"/>
             <w:noProof/>
           </w:rPr>
-          <w:t>Tab</w:t>
-        </w:r>
-        <w:r>
-          <w:rPr>
-            <w:rStyle w:val="Hyperlink"/>
-            <w:noProof/>
-          </w:rPr>
-          <w:t>e</w:t>
-        </w:r>
-        <w:r>
-          <w:rPr>
-            <w:rStyle w:val="Hyperlink"/>
-            <w:noProof/>
-          </w:rPr>
-          <w:t>la 1 - USUÁRIOS</w:t>
+          <w:t>Tabela 1 - USUÁRIOS</w:t>
         </w:r>
         <w:r>
           <w:rPr>
@@ -7171,14 +7341,12 @@
                 <w:szCs w:val="24"/>
               </w:rPr>
             </w:pPr>
-            <w:proofErr w:type="spellStart"/>
             <w:r>
               <w:rPr>
                 <w:szCs w:val="24"/>
               </w:rPr>
               <w:t>Hostinger</w:t>
             </w:r>
-            <w:proofErr w:type="spellEnd"/>
           </w:p>
         </w:tc>
         <w:tc>
@@ -7259,19 +7427,11 @@
                 <w:szCs w:val="24"/>
               </w:rPr>
             </w:pPr>
-            <w:proofErr w:type="spellStart"/>
             <w:r>
               <w:rPr>
                 <w:szCs w:val="24"/>
               </w:rPr>
-              <w:t>PlanetScale</w:t>
-            </w:r>
-            <w:proofErr w:type="spellEnd"/>
-            <w:r>
-              <w:rPr>
-                <w:szCs w:val="24"/>
-              </w:rPr>
-              <w:t xml:space="preserve"> (Plano Gratuito)</w:t>
+              <w:t>PlanetScale (Plano Gratuito)</w:t>
             </w:r>
           </w:p>
         </w:tc>
@@ -7579,8 +7739,8 @@
           <w:bCs/>
         </w:rPr>
       </w:pPr>
-      <w:bookmarkStart w:id="10" w:name="_Toc229592415"/>
-      <w:bookmarkStart w:id="11" w:name="_Toc229592493"/>
+      <w:bookmarkStart w:id="10" w:name="_Toc229592493"/>
+      <w:bookmarkStart w:id="11" w:name="_Toc229598871"/>
       <w:r>
         <w:t xml:space="preserve">Figura </w:t>
       </w:r>
@@ -7603,7 +7763,10 @@
         <w:fldChar w:fldCharType="end"/>
       </w:r>
       <w:r>
-        <w:t xml:space="preserve"> - Modelo relacional das tabelas do projeto CONTAX.</w:t>
+        <w:t xml:space="preserve">: </w:t>
+      </w:r>
+      <w:r>
+        <w:t>Modelo relacional das tabelas do projeto CONTAX.</w:t>
       </w:r>
       <w:bookmarkEnd w:id="10"/>
       <w:bookmarkEnd w:id="11"/>
@@ -7907,11 +8070,9 @@
             <w:vAlign w:val="center"/>
           </w:tcPr>
           <w:p>
-            <w:proofErr w:type="spellStart"/>
             <w:r>
               <w:t>usu_id</w:t>
             </w:r>
-            <w:proofErr w:type="spellEnd"/>
           </w:p>
         </w:tc>
         <w:tc>
@@ -7971,13 +8132,8 @@
             <w:tcW w:w="1151" w:type="pct"/>
           </w:tcPr>
           <w:p>
-            <w:proofErr w:type="spellStart"/>
-            <w:r>
-              <w:t>Auto-Incremento</w:t>
-            </w:r>
-            <w:proofErr w:type="spellEnd"/>
-            <w:r>
-              <w:t>.</w:t>
+            <w:r>
+              <w:t>Auto-Incremento.</w:t>
             </w:r>
           </w:p>
         </w:tc>
@@ -8000,11 +8156,9 @@
             <w:vAlign w:val="center"/>
           </w:tcPr>
           <w:p>
-            <w:proofErr w:type="spellStart"/>
             <w:r>
               <w:t>usu_nome</w:t>
             </w:r>
-            <w:proofErr w:type="spellEnd"/>
           </w:p>
         </w:tc>
         <w:tc>
@@ -8085,11 +8239,9 @@
             <w:vAlign w:val="center"/>
           </w:tcPr>
           <w:p>
-            <w:proofErr w:type="spellStart"/>
             <w:r>
               <w:t>usu_email</w:t>
             </w:r>
-            <w:proofErr w:type="spellEnd"/>
           </w:p>
         </w:tc>
         <w:tc>
@@ -8170,11 +8322,9 @@
             <w:vAlign w:val="center"/>
           </w:tcPr>
           <w:p>
-            <w:proofErr w:type="spellStart"/>
             <w:r>
               <w:t>usu_cpf</w:t>
             </w:r>
-            <w:proofErr w:type="spellEnd"/>
           </w:p>
         </w:tc>
         <w:tc>
@@ -8255,11 +8405,9 @@
             <w:vAlign w:val="center"/>
           </w:tcPr>
           <w:p>
-            <w:proofErr w:type="spellStart"/>
             <w:r>
               <w:t>usu_senha_hash</w:t>
             </w:r>
-            <w:proofErr w:type="spellEnd"/>
           </w:p>
         </w:tc>
         <w:tc>
@@ -8340,11 +8488,9 @@
             <w:vAlign w:val="center"/>
           </w:tcPr>
           <w:p>
-            <w:proofErr w:type="spellStart"/>
             <w:r>
               <w:t>usu_telefone</w:t>
             </w:r>
-            <w:proofErr w:type="spellEnd"/>
           </w:p>
         </w:tc>
         <w:tc>
@@ -8425,11 +8571,9 @@
             <w:vAlign w:val="center"/>
           </w:tcPr>
           <w:p>
-            <w:proofErr w:type="spellStart"/>
             <w:r>
               <w:t>usu_status</w:t>
             </w:r>
-            <w:proofErr w:type="spellEnd"/>
           </w:p>
         </w:tc>
         <w:tc>
@@ -8510,11 +8654,9 @@
             <w:vAlign w:val="center"/>
           </w:tcPr>
           <w:p>
-            <w:proofErr w:type="spellStart"/>
             <w:r>
               <w:t>usu_alterar_senha</w:t>
             </w:r>
-            <w:proofErr w:type="spellEnd"/>
           </w:p>
         </w:tc>
         <w:tc>
@@ -8816,11 +8958,9 @@
             <w:vAlign w:val="center"/>
           </w:tcPr>
           <w:p>
-            <w:proofErr w:type="spellStart"/>
             <w:r>
               <w:t>emp_id</w:t>
             </w:r>
-            <w:proofErr w:type="spellEnd"/>
           </w:p>
         </w:tc>
         <w:tc>
@@ -8881,13 +9021,8 @@
             <w:tcW w:w="1151" w:type="pct"/>
           </w:tcPr>
           <w:p>
-            <w:proofErr w:type="spellStart"/>
-            <w:r>
-              <w:t>Auto-Incremento</w:t>
-            </w:r>
-            <w:proofErr w:type="spellEnd"/>
-            <w:r>
-              <w:t>.</w:t>
+            <w:r>
+              <w:t>Auto-Incremento.</w:t>
             </w:r>
           </w:p>
         </w:tc>
@@ -8910,11 +9045,9 @@
             <w:vAlign w:val="center"/>
           </w:tcPr>
           <w:p>
-            <w:proofErr w:type="spellStart"/>
             <w:r>
               <w:t>emp_nome_fantasia</w:t>
             </w:r>
-            <w:proofErr w:type="spellEnd"/>
           </w:p>
         </w:tc>
         <w:tc>
@@ -8996,11 +9129,9 @@
             <w:vAlign w:val="center"/>
           </w:tcPr>
           <w:p>
-            <w:proofErr w:type="spellStart"/>
             <w:r>
               <w:t>emp_razao_social</w:t>
             </w:r>
-            <w:proofErr w:type="spellEnd"/>
           </w:p>
         </w:tc>
         <w:tc>
@@ -9082,11 +9213,9 @@
             <w:vAlign w:val="center"/>
           </w:tcPr>
           <w:p>
-            <w:proofErr w:type="spellStart"/>
             <w:r>
               <w:t>emp_cnpj</w:t>
             </w:r>
-            <w:proofErr w:type="spellEnd"/>
           </w:p>
         </w:tc>
         <w:tc>
@@ -9168,11 +9297,9 @@
             <w:vAlign w:val="center"/>
           </w:tcPr>
           <w:p>
-            <w:proofErr w:type="spellStart"/>
             <w:r>
               <w:t>emp_endereco</w:t>
             </w:r>
-            <w:proofErr w:type="spellEnd"/>
           </w:p>
         </w:tc>
         <w:tc>
@@ -9254,11 +9381,9 @@
             <w:vAlign w:val="center"/>
           </w:tcPr>
           <w:p>
-            <w:proofErr w:type="spellStart"/>
             <w:r>
               <w:t>emp_municipio</w:t>
             </w:r>
-            <w:proofErr w:type="spellEnd"/>
           </w:p>
         </w:tc>
         <w:tc>
@@ -9340,11 +9465,9 @@
             <w:vAlign w:val="center"/>
           </w:tcPr>
           <w:p>
-            <w:proofErr w:type="spellStart"/>
             <w:r>
               <w:t>emp_telefone</w:t>
             </w:r>
-            <w:proofErr w:type="spellEnd"/>
           </w:p>
         </w:tc>
         <w:tc>
@@ -9426,11 +9549,9 @@
             <w:vAlign w:val="center"/>
           </w:tcPr>
           <w:p>
-            <w:proofErr w:type="spellStart"/>
             <w:r>
               <w:t>emp_email</w:t>
             </w:r>
-            <w:proofErr w:type="spellEnd"/>
           </w:p>
         </w:tc>
         <w:tc>
@@ -9512,11 +9633,9 @@
             <w:vAlign w:val="center"/>
           </w:tcPr>
           <w:p>
-            <w:proofErr w:type="spellStart"/>
             <w:r>
               <w:t>emp_senha_hash</w:t>
             </w:r>
-            <w:proofErr w:type="spellEnd"/>
           </w:p>
         </w:tc>
         <w:tc>
@@ -9598,11 +9717,9 @@
             <w:vAlign w:val="center"/>
           </w:tcPr>
           <w:p>
-            <w:proofErr w:type="spellStart"/>
             <w:r>
               <w:t>emp_tipo</w:t>
             </w:r>
-            <w:proofErr w:type="spellEnd"/>
           </w:p>
         </w:tc>
         <w:tc>
@@ -9892,11 +10009,9 @@
             <w:vAlign w:val="center"/>
           </w:tcPr>
           <w:p>
-            <w:proofErr w:type="spellStart"/>
             <w:r>
               <w:t>emp_id</w:t>
             </w:r>
-            <w:proofErr w:type="spellEnd"/>
           </w:p>
         </w:tc>
         <w:tc>
@@ -9980,11 +10095,9 @@
             <w:vAlign w:val="center"/>
           </w:tcPr>
           <w:p>
-            <w:proofErr w:type="spellStart"/>
             <w:r>
               <w:t>usu_id</w:t>
             </w:r>
-            <w:proofErr w:type="spellEnd"/>
           </w:p>
         </w:tc>
         <w:tc>
@@ -10068,11 +10181,9 @@
             <w:vAlign w:val="center"/>
           </w:tcPr>
           <w:p>
-            <w:proofErr w:type="spellStart"/>
             <w:r>
               <w:t>usu_emp_nivel_acesso</w:t>
             </w:r>
-            <w:proofErr w:type="spellEnd"/>
           </w:p>
         </w:tc>
         <w:tc>
@@ -10154,11 +10265,9 @@
             <w:vAlign w:val="center"/>
           </w:tcPr>
           <w:p>
-            <w:proofErr w:type="spellStart"/>
             <w:r>
               <w:t>usu_emp_data_vinculo</w:t>
             </w:r>
-            <w:proofErr w:type="spellEnd"/>
           </w:p>
         </w:tc>
         <w:tc>
@@ -10240,11 +10349,9 @@
             <w:vAlign w:val="center"/>
           </w:tcPr>
           <w:p>
-            <w:proofErr w:type="spellStart"/>
             <w:r>
               <w:t>usu_emp_status</w:t>
             </w:r>
-            <w:proofErr w:type="spellEnd"/>
           </w:p>
         </w:tc>
         <w:tc>
@@ -10326,11 +10433,9 @@
             <w:vAlign w:val="center"/>
           </w:tcPr>
           <w:p>
-            <w:proofErr w:type="spellStart"/>
             <w:r>
               <w:t>usu_emp_observacoes</w:t>
             </w:r>
-            <w:proofErr w:type="spellEnd"/>
           </w:p>
         </w:tc>
         <w:tc>
@@ -10625,11 +10730,9 @@
             <w:vAlign w:val="center"/>
           </w:tcPr>
           <w:p>
-            <w:proofErr w:type="spellStart"/>
             <w:r>
               <w:t>regi_id</w:t>
             </w:r>
-            <w:proofErr w:type="spellEnd"/>
           </w:p>
         </w:tc>
         <w:tc>
@@ -10690,13 +10793,8 @@
             <w:tcW w:w="1080" w:type="pct"/>
           </w:tcPr>
           <w:p>
-            <w:proofErr w:type="spellStart"/>
-            <w:r>
-              <w:t>Auto-Incremento</w:t>
-            </w:r>
-            <w:proofErr w:type="spellEnd"/>
-            <w:r>
-              <w:t>.</w:t>
+            <w:r>
+              <w:t>Auto-Incremento.</w:t>
             </w:r>
           </w:p>
         </w:tc>
@@ -10719,11 +10817,9 @@
             <w:vAlign w:val="center"/>
           </w:tcPr>
           <w:p>
-            <w:proofErr w:type="spellStart"/>
             <w:r>
               <w:t>regi_nome</w:t>
             </w:r>
-            <w:proofErr w:type="spellEnd"/>
           </w:p>
         </w:tc>
         <w:tc>
@@ -10805,11 +10901,9 @@
             <w:vAlign w:val="center"/>
           </w:tcPr>
           <w:p>
-            <w:proofErr w:type="spellStart"/>
             <w:r>
               <w:t>regi_descricao</w:t>
             </w:r>
-            <w:proofErr w:type="spellEnd"/>
           </w:p>
         </w:tc>
         <w:tc>
@@ -10891,11 +10985,9 @@
             <w:vAlign w:val="center"/>
           </w:tcPr>
           <w:p>
-            <w:proofErr w:type="spellStart"/>
             <w:r>
               <w:t>regi_limite_faturamento_anual</w:t>
             </w:r>
-            <w:proofErr w:type="spellEnd"/>
           </w:p>
         </w:tc>
         <w:tc>
@@ -10977,11 +11069,9 @@
             <w:vAlign w:val="center"/>
           </w:tcPr>
           <w:p>
-            <w:proofErr w:type="spellStart"/>
             <w:r>
               <w:t>regi_tipo_emp_permitida</w:t>
             </w:r>
-            <w:proofErr w:type="spellEnd"/>
           </w:p>
         </w:tc>
         <w:tc>
@@ -11066,11 +11156,9 @@
             <w:pPr>
               <w:ind w:left="708" w:hanging="708"/>
             </w:pPr>
-            <w:proofErr w:type="spellStart"/>
             <w:r>
               <w:t>regi_status</w:t>
             </w:r>
-            <w:proofErr w:type="spellEnd"/>
           </w:p>
         </w:tc>
         <w:tc>
@@ -11368,11 +11456,9 @@
             <w:vAlign w:val="center"/>
           </w:tcPr>
           <w:p>
-            <w:proofErr w:type="spellStart"/>
             <w:r>
               <w:t>regi_emp_id</w:t>
             </w:r>
-            <w:proofErr w:type="spellEnd"/>
           </w:p>
         </w:tc>
         <w:tc>
@@ -11433,13 +11519,8 @@
             <w:tcW w:w="1131" w:type="pct"/>
           </w:tcPr>
           <w:p>
-            <w:proofErr w:type="spellStart"/>
-            <w:r>
-              <w:t>Auto-Incremento</w:t>
-            </w:r>
-            <w:proofErr w:type="spellEnd"/>
-            <w:r>
-              <w:t>.</w:t>
+            <w:r>
+              <w:t>Auto-Incremento.</w:t>
             </w:r>
           </w:p>
         </w:tc>
@@ -11462,11 +11543,9 @@
             <w:vAlign w:val="center"/>
           </w:tcPr>
           <w:p>
-            <w:proofErr w:type="spellStart"/>
             <w:r>
               <w:t>regi_id</w:t>
             </w:r>
-            <w:proofErr w:type="spellEnd"/>
           </w:p>
         </w:tc>
         <w:tc>
@@ -11547,11 +11626,9 @@
             <w:vAlign w:val="center"/>
           </w:tcPr>
           <w:p>
-            <w:proofErr w:type="spellStart"/>
             <w:r>
               <w:t>emp_id</w:t>
             </w:r>
-            <w:proofErr w:type="spellEnd"/>
           </w:p>
         </w:tc>
         <w:tc>
@@ -11632,11 +11709,9 @@
             <w:vAlign w:val="center"/>
           </w:tcPr>
           <w:p>
-            <w:proofErr w:type="spellStart"/>
             <w:r>
               <w:t>regi_emp_data_inicio</w:t>
             </w:r>
-            <w:proofErr w:type="spellEnd"/>
           </w:p>
         </w:tc>
         <w:tc>
@@ -11718,11 +11793,9 @@
             <w:vAlign w:val="center"/>
           </w:tcPr>
           <w:p>
-            <w:proofErr w:type="spellStart"/>
             <w:r>
               <w:t>regi_emp_data_fim</w:t>
             </w:r>
-            <w:proofErr w:type="spellEnd"/>
           </w:p>
         </w:tc>
         <w:tc>
@@ -11800,11 +11873,9 @@
             <w:vAlign w:val="center"/>
           </w:tcPr>
           <w:p>
-            <w:proofErr w:type="spellStart"/>
             <w:r>
               <w:t>regi_emp_motivo_alteracao</w:t>
             </w:r>
-            <w:proofErr w:type="spellEnd"/>
           </w:p>
         </w:tc>
         <w:tc>
@@ -11882,11 +11953,9 @@
             <w:vAlign w:val="center"/>
           </w:tcPr>
           <w:p>
-            <w:proofErr w:type="spellStart"/>
             <w:r>
               <w:t>regi_emp_status</w:t>
             </w:r>
-            <w:proofErr w:type="spellEnd"/>
           </w:p>
         </w:tc>
         <w:tc>
@@ -11968,7 +12037,6 @@
             <w:vAlign w:val="center"/>
           </w:tcPr>
           <w:p>
-            <w:proofErr w:type="spellStart"/>
             <w:r>
               <w:rPr>
                 <w:u w:val="single"/>
@@ -11978,7 +12046,6 @@
             <w:r>
               <w:t>_emp_observacoes</w:t>
             </w:r>
-            <w:proofErr w:type="spellEnd"/>
           </w:p>
         </w:tc>
         <w:tc>
@@ -12272,11 +12339,9 @@
             <w:vAlign w:val="center"/>
           </w:tcPr>
           <w:p>
-            <w:proofErr w:type="spellStart"/>
             <w:r>
               <w:t>doc_id</w:t>
             </w:r>
-            <w:proofErr w:type="spellEnd"/>
           </w:p>
         </w:tc>
         <w:tc>
@@ -12337,13 +12402,8 @@
             <w:tcW w:w="1151" w:type="pct"/>
           </w:tcPr>
           <w:p>
-            <w:proofErr w:type="spellStart"/>
-            <w:r>
-              <w:t>Auto-Incremento</w:t>
-            </w:r>
-            <w:proofErr w:type="spellEnd"/>
-            <w:r>
-              <w:t>.</w:t>
+            <w:r>
+              <w:t>Auto-Incremento.</w:t>
             </w:r>
           </w:p>
         </w:tc>
@@ -12366,11 +12426,9 @@
             <w:vAlign w:val="center"/>
           </w:tcPr>
           <w:p>
-            <w:proofErr w:type="spellStart"/>
             <w:r>
               <w:t>usu_id</w:t>
             </w:r>
-            <w:proofErr w:type="spellEnd"/>
           </w:p>
         </w:tc>
         <w:tc>
@@ -12451,11 +12509,9 @@
             <w:vAlign w:val="center"/>
           </w:tcPr>
           <w:p>
-            <w:proofErr w:type="spellStart"/>
             <w:r>
               <w:t>emp_id</w:t>
             </w:r>
-            <w:proofErr w:type="spellEnd"/>
           </w:p>
         </w:tc>
         <w:tc>
@@ -12536,11 +12592,9 @@
             <w:vAlign w:val="center"/>
           </w:tcPr>
           <w:p>
-            <w:proofErr w:type="spellStart"/>
             <w:r>
               <w:t>tpd_id</w:t>
             </w:r>
-            <w:proofErr w:type="spellEnd"/>
           </w:p>
         </w:tc>
         <w:tc>
@@ -12618,11 +12672,9 @@
             <w:vAlign w:val="center"/>
           </w:tcPr>
           <w:p>
-            <w:proofErr w:type="spellStart"/>
             <w:r>
               <w:t>doc_arquivo_nome</w:t>
             </w:r>
-            <w:proofErr w:type="spellEnd"/>
           </w:p>
         </w:tc>
         <w:tc>
@@ -12704,11 +12756,9 @@
             <w:vAlign w:val="center"/>
           </w:tcPr>
           <w:p>
-            <w:proofErr w:type="spellStart"/>
             <w:r>
               <w:t>doc_data_emissao</w:t>
             </w:r>
-            <w:proofErr w:type="spellEnd"/>
           </w:p>
         </w:tc>
         <w:tc>
@@ -12790,11 +12840,9 @@
             <w:vAlign w:val="center"/>
           </w:tcPr>
           <w:p>
-            <w:proofErr w:type="spellStart"/>
             <w:r>
               <w:t>doc_valor</w:t>
             </w:r>
-            <w:proofErr w:type="spellEnd"/>
           </w:p>
         </w:tc>
         <w:tc>
@@ -12876,11 +12924,9 @@
             <w:vAlign w:val="center"/>
           </w:tcPr>
           <w:p>
-            <w:proofErr w:type="spellStart"/>
             <w:r>
               <w:t>doc_status</w:t>
             </w:r>
-            <w:proofErr w:type="spellEnd"/>
           </w:p>
         </w:tc>
         <w:tc>
@@ -13178,11 +13224,9 @@
             <w:vAlign w:val="center"/>
           </w:tcPr>
           <w:p>
-            <w:proofErr w:type="spellStart"/>
             <w:r>
               <w:t>tpd_id</w:t>
             </w:r>
-            <w:proofErr w:type="spellEnd"/>
           </w:p>
         </w:tc>
         <w:tc>
@@ -13243,13 +13287,8 @@
             <w:tcW w:w="1151" w:type="pct"/>
           </w:tcPr>
           <w:p>
-            <w:proofErr w:type="spellStart"/>
-            <w:r>
-              <w:t>Auto-Incremento</w:t>
-            </w:r>
-            <w:proofErr w:type="spellEnd"/>
-            <w:r>
-              <w:t>.</w:t>
+            <w:r>
+              <w:t>Auto-Incremento.</w:t>
             </w:r>
           </w:p>
         </w:tc>
@@ -13261,13 +13300,8 @@
             <w:vAlign w:val="center"/>
           </w:tcPr>
           <w:p>
-            <w:proofErr w:type="spellStart"/>
-            <w:r>
-              <w:t>Descricão</w:t>
-            </w:r>
-            <w:proofErr w:type="spellEnd"/>
-            <w:r>
-              <w:t xml:space="preserve"> do Tipo do Documento.</w:t>
+            <w:r>
+              <w:t>Descricão do Tipo do Documento.</w:t>
             </w:r>
           </w:p>
         </w:tc>
@@ -13277,11 +13311,9 @@
             <w:vAlign w:val="center"/>
           </w:tcPr>
           <w:p>
-            <w:proofErr w:type="spellStart"/>
             <w:r>
               <w:t>tpd_descricao</w:t>
             </w:r>
-            <w:proofErr w:type="spellEnd"/>
           </w:p>
         </w:tc>
         <w:tc>
@@ -13363,11 +13395,9 @@
             <w:vAlign w:val="center"/>
           </w:tcPr>
           <w:p>
-            <w:proofErr w:type="spellStart"/>
             <w:r>
               <w:t>tpd_status</w:t>
             </w:r>
-            <w:proofErr w:type="spellEnd"/>
           </w:p>
         </w:tc>
         <w:tc>
@@ -13667,11 +13697,9 @@
             <w:vAlign w:val="center"/>
           </w:tcPr>
           <w:p>
-            <w:proofErr w:type="spellStart"/>
             <w:r>
               <w:t>praz_id</w:t>
             </w:r>
-            <w:proofErr w:type="spellEnd"/>
           </w:p>
         </w:tc>
         <w:tc>
@@ -13732,13 +13760,8 @@
             <w:tcW w:w="1151" w:type="pct"/>
           </w:tcPr>
           <w:p>
-            <w:proofErr w:type="spellStart"/>
-            <w:r>
-              <w:t>Auto-Incremento</w:t>
-            </w:r>
-            <w:proofErr w:type="spellEnd"/>
-            <w:r>
-              <w:t>.</w:t>
+            <w:r>
+              <w:t>Auto-Incremento.</w:t>
             </w:r>
           </w:p>
         </w:tc>
@@ -13761,11 +13784,9 @@
             <w:vAlign w:val="center"/>
           </w:tcPr>
           <w:p>
-            <w:proofErr w:type="spellStart"/>
             <w:r>
               <w:t>emp_id</w:t>
             </w:r>
-            <w:proofErr w:type="spellEnd"/>
           </w:p>
         </w:tc>
         <w:tc>
@@ -13846,11 +13867,9 @@
             <w:vAlign w:val="center"/>
           </w:tcPr>
           <w:p>
-            <w:proofErr w:type="spellStart"/>
             <w:r>
               <w:t>praz_descricao</w:t>
             </w:r>
-            <w:proofErr w:type="spellEnd"/>
           </w:p>
         </w:tc>
         <w:tc>
@@ -13932,11 +13951,9 @@
             <w:vAlign w:val="center"/>
           </w:tcPr>
           <w:p>
-            <w:proofErr w:type="spellStart"/>
             <w:r>
               <w:t>praz_data_vencimento</w:t>
             </w:r>
-            <w:proofErr w:type="spellEnd"/>
           </w:p>
         </w:tc>
         <w:tc>
@@ -14021,11 +14038,9 @@
             <w:pPr>
               <w:ind w:left="11328" w:hanging="11328"/>
             </w:pPr>
-            <w:proofErr w:type="spellStart"/>
             <w:r>
               <w:t>praz_status</w:t>
             </w:r>
-            <w:proofErr w:type="spellEnd"/>
           </w:p>
         </w:tc>
         <w:tc>
@@ -14172,7 +14187,7 @@
       <w:tr>
         <w:tc>
           <w:tcPr>
-            <w:tcW w:w="1062" w:type="pct"/>
+            <w:tcW w:w="802" w:type="pct"/>
             <w:vAlign w:val="center"/>
           </w:tcPr>
           <w:p>
@@ -14204,7 +14219,7 @@
         </w:tc>
         <w:tc>
           <w:tcPr>
-            <w:tcW w:w="1013" w:type="pct"/>
+            <w:tcW w:w="1303" w:type="pct"/>
             <w:vAlign w:val="center"/>
           </w:tcPr>
           <w:p>
@@ -14224,7 +14239,7 @@
         </w:tc>
         <w:tc>
           <w:tcPr>
-            <w:tcW w:w="861" w:type="pct"/>
+            <w:tcW w:w="732" w:type="pct"/>
             <w:vAlign w:val="center"/>
           </w:tcPr>
           <w:p>
@@ -14244,7 +14259,7 @@
         </w:tc>
         <w:tc>
           <w:tcPr>
-            <w:tcW w:w="507" w:type="pct"/>
+            <w:tcW w:w="676" w:type="pct"/>
             <w:vAlign w:val="center"/>
           </w:tcPr>
           <w:p>
@@ -14264,7 +14279,7 @@
         </w:tc>
         <w:tc>
           <w:tcPr>
-            <w:tcW w:w="203" w:type="pct"/>
+            <w:tcW w:w="294" w:type="pct"/>
             <w:vAlign w:val="center"/>
           </w:tcPr>
           <w:p>
@@ -14284,7 +14299,7 @@
         </w:tc>
         <w:tc>
           <w:tcPr>
-            <w:tcW w:w="203" w:type="pct"/>
+            <w:tcW w:w="286" w:type="pct"/>
             <w:vAlign w:val="center"/>
           </w:tcPr>
           <w:p>
@@ -14304,7 +14319,7 @@
         </w:tc>
         <w:tc>
           <w:tcPr>
-            <w:tcW w:w="1151" w:type="pct"/>
+            <w:tcW w:w="907" w:type="pct"/>
             <w:vAlign w:val="center"/>
           </w:tcPr>
           <w:p>
@@ -14326,7 +14341,7 @@
       <w:tr>
         <w:tc>
           <w:tcPr>
-            <w:tcW w:w="1062" w:type="pct"/>
+            <w:tcW w:w="802" w:type="pct"/>
             <w:vAlign w:val="center"/>
           </w:tcPr>
           <w:p>
@@ -14337,20 +14352,18 @@
         </w:tc>
         <w:tc>
           <w:tcPr>
-            <w:tcW w:w="1013" w:type="pct"/>
-            <w:vAlign w:val="center"/>
-          </w:tcPr>
-          <w:p>
-            <w:proofErr w:type="spellStart"/>
+            <w:tcW w:w="1303" w:type="pct"/>
+            <w:vAlign w:val="center"/>
+          </w:tcPr>
+          <w:p>
             <w:r>
               <w:t>aud_id</w:t>
             </w:r>
-            <w:proofErr w:type="spellEnd"/>
-          </w:p>
-        </w:tc>
-        <w:tc>
-          <w:tcPr>
-            <w:tcW w:w="861" w:type="pct"/>
+          </w:p>
+        </w:tc>
+        <w:tc>
+          <w:tcPr>
+            <w:tcW w:w="732" w:type="pct"/>
             <w:vAlign w:val="center"/>
           </w:tcPr>
           <w:p>
@@ -14364,7 +14377,7 @@
         </w:tc>
         <w:tc>
           <w:tcPr>
-            <w:tcW w:w="507" w:type="pct"/>
+            <w:tcW w:w="676" w:type="pct"/>
             <w:vAlign w:val="center"/>
           </w:tcPr>
           <w:p>
@@ -14378,7 +14391,7 @@
         </w:tc>
         <w:tc>
           <w:tcPr>
-            <w:tcW w:w="203" w:type="pct"/>
+            <w:tcW w:w="294" w:type="pct"/>
             <w:vAlign w:val="center"/>
           </w:tcPr>
           <w:p>
@@ -14392,27 +14405,22 @@
         </w:tc>
         <w:tc>
           <w:tcPr>
-            <w:tcW w:w="203" w:type="pct"/>
-            <w:vAlign w:val="center"/>
-          </w:tcPr>
-          <w:p>
-            <w:pPr>
-              <w:jc w:val="center"/>
-            </w:pPr>
-          </w:p>
-        </w:tc>
-        <w:tc>
-          <w:tcPr>
-            <w:tcW w:w="1151" w:type="pct"/>
-          </w:tcPr>
-          <w:p>
-            <w:proofErr w:type="spellStart"/>
-            <w:r>
-              <w:t>Auto-Incremento</w:t>
-            </w:r>
-            <w:proofErr w:type="spellEnd"/>
-            <w:r>
-              <w:t>.</w:t>
+            <w:tcW w:w="286" w:type="pct"/>
+            <w:vAlign w:val="center"/>
+          </w:tcPr>
+          <w:p>
+            <w:pPr>
+              <w:jc w:val="center"/>
+            </w:pPr>
+          </w:p>
+        </w:tc>
+        <w:tc>
+          <w:tcPr>
+            <w:tcW w:w="907" w:type="pct"/>
+          </w:tcPr>
+          <w:p>
+            <w:r>
+              <w:t>Auto-Incremento.</w:t>
             </w:r>
           </w:p>
         </w:tc>
@@ -14420,7 +14428,7 @@
       <w:tr>
         <w:tc>
           <w:tcPr>
-            <w:tcW w:w="1062" w:type="pct"/>
+            <w:tcW w:w="802" w:type="pct"/>
             <w:vAlign w:val="center"/>
           </w:tcPr>
           <w:p>
@@ -14431,20 +14439,18 @@
         </w:tc>
         <w:tc>
           <w:tcPr>
-            <w:tcW w:w="1013" w:type="pct"/>
-            <w:vAlign w:val="center"/>
-          </w:tcPr>
-          <w:p>
-            <w:proofErr w:type="spellStart"/>
+            <w:tcW w:w="1303" w:type="pct"/>
+            <w:vAlign w:val="center"/>
+          </w:tcPr>
+          <w:p>
             <w:r>
               <w:t>usu_id</w:t>
             </w:r>
-            <w:proofErr w:type="spellEnd"/>
-          </w:p>
-        </w:tc>
-        <w:tc>
-          <w:tcPr>
-            <w:tcW w:w="861" w:type="pct"/>
+          </w:p>
+        </w:tc>
+        <w:tc>
+          <w:tcPr>
+            <w:tcW w:w="732" w:type="pct"/>
             <w:vAlign w:val="center"/>
           </w:tcPr>
           <w:p>
@@ -14458,7 +14464,7 @@
         </w:tc>
         <w:tc>
           <w:tcPr>
-            <w:tcW w:w="507" w:type="pct"/>
+            <w:tcW w:w="676" w:type="pct"/>
             <w:vAlign w:val="center"/>
           </w:tcPr>
           <w:p>
@@ -14472,18 +14478,18 @@
         </w:tc>
         <w:tc>
           <w:tcPr>
-            <w:tcW w:w="203" w:type="pct"/>
-            <w:vAlign w:val="center"/>
-          </w:tcPr>
-          <w:p>
-            <w:pPr>
-              <w:jc w:val="center"/>
-            </w:pPr>
-          </w:p>
-        </w:tc>
-        <w:tc>
-          <w:tcPr>
-            <w:tcW w:w="203" w:type="pct"/>
+            <w:tcW w:w="294" w:type="pct"/>
+            <w:vAlign w:val="center"/>
+          </w:tcPr>
+          <w:p>
+            <w:pPr>
+              <w:jc w:val="center"/>
+            </w:pPr>
+          </w:p>
+        </w:tc>
+        <w:tc>
+          <w:tcPr>
+            <w:tcW w:w="286" w:type="pct"/>
             <w:vAlign w:val="center"/>
           </w:tcPr>
           <w:p>
@@ -14497,7 +14503,7 @@
         </w:tc>
         <w:tc>
           <w:tcPr>
-            <w:tcW w:w="1151" w:type="pct"/>
+            <w:tcW w:w="907" w:type="pct"/>
           </w:tcPr>
           <w:p/>
         </w:tc>
@@ -14505,7 +14511,7 @@
       <w:tr>
         <w:tc>
           <w:tcPr>
-            <w:tcW w:w="1062" w:type="pct"/>
+            <w:tcW w:w="802" w:type="pct"/>
             <w:vAlign w:val="center"/>
           </w:tcPr>
           <w:p>
@@ -14516,20 +14522,18 @@
         </w:tc>
         <w:tc>
           <w:tcPr>
-            <w:tcW w:w="1013" w:type="pct"/>
-            <w:vAlign w:val="center"/>
-          </w:tcPr>
-          <w:p>
-            <w:proofErr w:type="spellStart"/>
+            <w:tcW w:w="1303" w:type="pct"/>
+            <w:vAlign w:val="center"/>
+          </w:tcPr>
+          <w:p>
             <w:r>
               <w:t>aud_acao</w:t>
             </w:r>
-            <w:proofErr w:type="spellEnd"/>
-          </w:p>
-        </w:tc>
-        <w:tc>
-          <w:tcPr>
-            <w:tcW w:w="861" w:type="pct"/>
+          </w:p>
+        </w:tc>
+        <w:tc>
+          <w:tcPr>
+            <w:tcW w:w="732" w:type="pct"/>
             <w:vAlign w:val="center"/>
           </w:tcPr>
           <w:p>
@@ -14543,7 +14547,7 @@
         </w:tc>
         <w:tc>
           <w:tcPr>
-            <w:tcW w:w="507" w:type="pct"/>
+            <w:tcW w:w="676" w:type="pct"/>
             <w:vAlign w:val="center"/>
           </w:tcPr>
           <w:p>
@@ -14557,29 +14561,29 @@
         </w:tc>
         <w:tc>
           <w:tcPr>
-            <w:tcW w:w="203" w:type="pct"/>
-            <w:vAlign w:val="center"/>
-          </w:tcPr>
-          <w:p>
-            <w:pPr>
-              <w:jc w:val="center"/>
-            </w:pPr>
-          </w:p>
-        </w:tc>
-        <w:tc>
-          <w:tcPr>
-            <w:tcW w:w="203" w:type="pct"/>
-            <w:vAlign w:val="center"/>
-          </w:tcPr>
-          <w:p>
-            <w:pPr>
-              <w:jc w:val="center"/>
-            </w:pPr>
-          </w:p>
-        </w:tc>
-        <w:tc>
-          <w:tcPr>
-            <w:tcW w:w="1151" w:type="pct"/>
+            <w:tcW w:w="294" w:type="pct"/>
+            <w:vAlign w:val="center"/>
+          </w:tcPr>
+          <w:p>
+            <w:pPr>
+              <w:jc w:val="center"/>
+            </w:pPr>
+          </w:p>
+        </w:tc>
+        <w:tc>
+          <w:tcPr>
+            <w:tcW w:w="286" w:type="pct"/>
+            <w:vAlign w:val="center"/>
+          </w:tcPr>
+          <w:p>
+            <w:pPr>
+              <w:jc w:val="center"/>
+            </w:pPr>
+          </w:p>
+        </w:tc>
+        <w:tc>
+          <w:tcPr>
+            <w:tcW w:w="907" w:type="pct"/>
           </w:tcPr>
           <w:p>
             <w:r>
@@ -14609,7 +14613,7 @@
       <w:tr>
         <w:tc>
           <w:tcPr>
-            <w:tcW w:w="1062" w:type="pct"/>
+            <w:tcW w:w="802" w:type="pct"/>
             <w:vAlign w:val="center"/>
           </w:tcPr>
           <w:p>
@@ -14620,20 +14624,18 @@
         </w:tc>
         <w:tc>
           <w:tcPr>
-            <w:tcW w:w="1013" w:type="pct"/>
-            <w:vAlign w:val="center"/>
-          </w:tcPr>
-          <w:p>
-            <w:proofErr w:type="spellStart"/>
+            <w:tcW w:w="1303" w:type="pct"/>
+            <w:vAlign w:val="center"/>
+          </w:tcPr>
+          <w:p>
             <w:r>
               <w:t>aud_tabela_afetada</w:t>
             </w:r>
-            <w:proofErr w:type="spellEnd"/>
-          </w:p>
-        </w:tc>
-        <w:tc>
-          <w:tcPr>
-            <w:tcW w:w="861" w:type="pct"/>
+          </w:p>
+        </w:tc>
+        <w:tc>
+          <w:tcPr>
+            <w:tcW w:w="732" w:type="pct"/>
             <w:vAlign w:val="center"/>
           </w:tcPr>
           <w:p>
@@ -14647,7 +14649,7 @@
         </w:tc>
         <w:tc>
           <w:tcPr>
-            <w:tcW w:w="507" w:type="pct"/>
+            <w:tcW w:w="676" w:type="pct"/>
             <w:vAlign w:val="center"/>
           </w:tcPr>
           <w:p>
@@ -14661,29 +14663,29 @@
         </w:tc>
         <w:tc>
           <w:tcPr>
-            <w:tcW w:w="203" w:type="pct"/>
-            <w:vAlign w:val="center"/>
-          </w:tcPr>
-          <w:p>
-            <w:pPr>
-              <w:jc w:val="center"/>
-            </w:pPr>
-          </w:p>
-        </w:tc>
-        <w:tc>
-          <w:tcPr>
-            <w:tcW w:w="203" w:type="pct"/>
-            <w:vAlign w:val="center"/>
-          </w:tcPr>
-          <w:p>
-            <w:pPr>
-              <w:jc w:val="center"/>
-            </w:pPr>
-          </w:p>
-        </w:tc>
-        <w:tc>
-          <w:tcPr>
-            <w:tcW w:w="1151" w:type="pct"/>
+            <w:tcW w:w="294" w:type="pct"/>
+            <w:vAlign w:val="center"/>
+          </w:tcPr>
+          <w:p>
+            <w:pPr>
+              <w:jc w:val="center"/>
+            </w:pPr>
+          </w:p>
+        </w:tc>
+        <w:tc>
+          <w:tcPr>
+            <w:tcW w:w="286" w:type="pct"/>
+            <w:vAlign w:val="center"/>
+          </w:tcPr>
+          <w:p>
+            <w:pPr>
+              <w:jc w:val="center"/>
+            </w:pPr>
+          </w:p>
+        </w:tc>
+        <w:tc>
+          <w:tcPr>
+            <w:tcW w:w="907" w:type="pct"/>
           </w:tcPr>
           <w:p>
             <w:r>
@@ -14695,7 +14697,7 @@
       <w:tr>
         <w:tc>
           <w:tcPr>
-            <w:tcW w:w="1062" w:type="pct"/>
+            <w:tcW w:w="802" w:type="pct"/>
             <w:vAlign w:val="center"/>
           </w:tcPr>
           <w:p>
@@ -14706,20 +14708,18 @@
         </w:tc>
         <w:tc>
           <w:tcPr>
-            <w:tcW w:w="1013" w:type="pct"/>
-            <w:vAlign w:val="center"/>
-          </w:tcPr>
-          <w:p>
-            <w:proofErr w:type="spellStart"/>
+            <w:tcW w:w="1303" w:type="pct"/>
+            <w:vAlign w:val="center"/>
+          </w:tcPr>
+          <w:p>
             <w:r>
               <w:t>aud_registro_afetado</w:t>
             </w:r>
-            <w:proofErr w:type="spellEnd"/>
-          </w:p>
-        </w:tc>
-        <w:tc>
-          <w:tcPr>
-            <w:tcW w:w="861" w:type="pct"/>
+          </w:p>
+        </w:tc>
+        <w:tc>
+          <w:tcPr>
+            <w:tcW w:w="732" w:type="pct"/>
             <w:vAlign w:val="center"/>
           </w:tcPr>
           <w:p>
@@ -14733,7 +14733,7 @@
         </w:tc>
         <w:tc>
           <w:tcPr>
-            <w:tcW w:w="507" w:type="pct"/>
+            <w:tcW w:w="676" w:type="pct"/>
             <w:vAlign w:val="center"/>
           </w:tcPr>
           <w:p>
@@ -14747,29 +14747,29 @@
         </w:tc>
         <w:tc>
           <w:tcPr>
-            <w:tcW w:w="203" w:type="pct"/>
-            <w:vAlign w:val="center"/>
-          </w:tcPr>
-          <w:p>
-            <w:pPr>
-              <w:jc w:val="center"/>
-            </w:pPr>
-          </w:p>
-        </w:tc>
-        <w:tc>
-          <w:tcPr>
-            <w:tcW w:w="203" w:type="pct"/>
-            <w:vAlign w:val="center"/>
-          </w:tcPr>
-          <w:p>
-            <w:pPr>
-              <w:jc w:val="center"/>
-            </w:pPr>
-          </w:p>
-        </w:tc>
-        <w:tc>
-          <w:tcPr>
-            <w:tcW w:w="1151" w:type="pct"/>
+            <w:tcW w:w="294" w:type="pct"/>
+            <w:vAlign w:val="center"/>
+          </w:tcPr>
+          <w:p>
+            <w:pPr>
+              <w:jc w:val="center"/>
+            </w:pPr>
+          </w:p>
+        </w:tc>
+        <w:tc>
+          <w:tcPr>
+            <w:tcW w:w="286" w:type="pct"/>
+            <w:vAlign w:val="center"/>
+          </w:tcPr>
+          <w:p>
+            <w:pPr>
+              <w:jc w:val="center"/>
+            </w:pPr>
+          </w:p>
+        </w:tc>
+        <w:tc>
+          <w:tcPr>
+            <w:tcW w:w="907" w:type="pct"/>
           </w:tcPr>
           <w:p>
             <w:r>
@@ -14781,7 +14781,7 @@
       <w:tr>
         <w:tc>
           <w:tcPr>
-            <w:tcW w:w="1062" w:type="pct"/>
+            <w:tcW w:w="802" w:type="pct"/>
             <w:vAlign w:val="center"/>
           </w:tcPr>
           <w:p>
@@ -14792,20 +14792,18 @@
         </w:tc>
         <w:tc>
           <w:tcPr>
-            <w:tcW w:w="1013" w:type="pct"/>
-            <w:vAlign w:val="center"/>
-          </w:tcPr>
-          <w:p>
-            <w:proofErr w:type="spellStart"/>
+            <w:tcW w:w="1303" w:type="pct"/>
+            <w:vAlign w:val="center"/>
+          </w:tcPr>
+          <w:p>
             <w:r>
               <w:t>aud_data_acao</w:t>
             </w:r>
-            <w:proofErr w:type="spellEnd"/>
-          </w:p>
-        </w:tc>
-        <w:tc>
-          <w:tcPr>
-            <w:tcW w:w="861" w:type="pct"/>
+          </w:p>
+        </w:tc>
+        <w:tc>
+          <w:tcPr>
+            <w:tcW w:w="732" w:type="pct"/>
             <w:vAlign w:val="center"/>
           </w:tcPr>
           <w:p>
@@ -14819,7 +14817,7 @@
         </w:tc>
         <w:tc>
           <w:tcPr>
-            <w:tcW w:w="507" w:type="pct"/>
+            <w:tcW w:w="676" w:type="pct"/>
             <w:vAlign w:val="center"/>
           </w:tcPr>
           <w:p>
@@ -14833,29 +14831,29 @@
         </w:tc>
         <w:tc>
           <w:tcPr>
-            <w:tcW w:w="203" w:type="pct"/>
-            <w:vAlign w:val="center"/>
-          </w:tcPr>
-          <w:p>
-            <w:pPr>
-              <w:jc w:val="center"/>
-            </w:pPr>
-          </w:p>
-        </w:tc>
-        <w:tc>
-          <w:tcPr>
-            <w:tcW w:w="203" w:type="pct"/>
-            <w:vAlign w:val="center"/>
-          </w:tcPr>
-          <w:p>
-            <w:pPr>
-              <w:jc w:val="center"/>
-            </w:pPr>
-          </w:p>
-        </w:tc>
-        <w:tc>
-          <w:tcPr>
-            <w:tcW w:w="1151" w:type="pct"/>
+            <w:tcW w:w="294" w:type="pct"/>
+            <w:vAlign w:val="center"/>
+          </w:tcPr>
+          <w:p>
+            <w:pPr>
+              <w:jc w:val="center"/>
+            </w:pPr>
+          </w:p>
+        </w:tc>
+        <w:tc>
+          <w:tcPr>
+            <w:tcW w:w="286" w:type="pct"/>
+            <w:vAlign w:val="center"/>
+          </w:tcPr>
+          <w:p>
+            <w:pPr>
+              <w:jc w:val="center"/>
+            </w:pPr>
+          </w:p>
+        </w:tc>
+        <w:tc>
+          <w:tcPr>
+            <w:tcW w:w="907" w:type="pct"/>
           </w:tcPr>
           <w:p>
             <w:r>
@@ -15186,8 +15184,9 @@
     <w:p>
       <w:pPr>
         <w:ind w:firstLine="360"/>
-      </w:pPr>
-      <w:bookmarkStart w:id="24" w:name="_Toc229592416"/>
+        <w:jc w:val="center"/>
+      </w:pPr>
+      <w:bookmarkStart w:id="24" w:name="_Toc229598872"/>
       <w:r>
         <w:lastRenderedPageBreak/>
         <w:t xml:space="preserve">Figura </w:t>
@@ -15211,7 +15210,13 @@
         <w:fldChar w:fldCharType="end"/>
       </w:r>
       <w:r>
-        <w:t>: tela de login do software Contax.</w:t>
+        <w:t xml:space="preserve">: </w:t>
+      </w:r>
+      <w:r>
+        <w:t>T</w:t>
+      </w:r>
+      <w:r>
+        <w:t>ela de login do software Contax.</w:t>
       </w:r>
       <w:r>
         <w:rPr>
@@ -15315,7 +15320,7 @@
         <w:keepNext/>
         <w:jc w:val="center"/>
       </w:pPr>
-      <w:bookmarkStart w:id="26" w:name="_Toc229592417"/>
+      <w:bookmarkStart w:id="26" w:name="_Toc229598873"/>
       <w:r>
         <w:lastRenderedPageBreak/>
         <w:t xml:space="preserve">Figura </w:t>
@@ -15488,21 +15493,7 @@
         <w:rPr>
           <w:szCs w:val="24"/>
         </w:rPr>
-        <w:t xml:space="preserve">A tela subdivide-se em duas </w:t>
-      </w:r>
-      <w:proofErr w:type="spellStart"/>
-      <w:r>
-        <w:rPr>
-          <w:szCs w:val="24"/>
-        </w:rPr>
-        <w:t>macrofuncionalidades</w:t>
-      </w:r>
-      <w:proofErr w:type="spellEnd"/>
-      <w:r>
-        <w:rPr>
-          <w:szCs w:val="24"/>
-        </w:rPr>
-        <w:t xml:space="preserve"> principais:</w:t>
+        <w:t>A tela subdivide-se em duas macrofuncionalidades principais:</w:t>
       </w:r>
     </w:p>
     <w:p>
@@ -15554,7 +15545,6 @@
         </w:rPr>
         <w:t xml:space="preserve"> Apresenta uma listagem consolidada das empresas já vinculadas ao escritório. A tabela oferece uma visualização rápida de dados críticos e utiliza indicadores visuais (</w:t>
       </w:r>
-      <w:proofErr w:type="spellStart"/>
       <w:r>
         <w:rPr>
           <w:i/>
@@ -15563,7 +15553,6 @@
         </w:rPr>
         <w:t>badges</w:t>
       </w:r>
-      <w:proofErr w:type="spellEnd"/>
       <w:r>
         <w:rPr>
           <w:szCs w:val="24"/>
@@ -15620,7 +15609,7 @@
           <w:szCs w:val="24"/>
         </w:rPr>
       </w:pPr>
-      <w:bookmarkStart w:id="28" w:name="_Toc229592418"/>
+      <w:bookmarkStart w:id="28" w:name="_Toc229598874"/>
       <w:r>
         <w:t xml:space="preserve">Figura </w:t>
       </w:r>
@@ -15643,7 +15632,13 @@
         <w:fldChar w:fldCharType="end"/>
       </w:r>
       <w:r>
-        <w:t>: Interface de cadastro administrada pelo contador.</w:t>
+        <w:t xml:space="preserve">: Interface de cadastro </w:t>
+      </w:r>
+      <w:r>
+        <w:t xml:space="preserve">de empresa </w:t>
+      </w:r>
+      <w:r>
+        <w:t>administrada pelo contador.</w:t>
       </w:r>
       <w:bookmarkEnd w:id="28"/>
     </w:p>
@@ -15733,7 +15728,7 @@
       <w:pPr>
         <w:jc w:val="center"/>
       </w:pPr>
-      <w:bookmarkStart w:id="30" w:name="_Toc229592419"/>
+      <w:bookmarkStart w:id="30" w:name="_Toc229598875"/>
       <w:r>
         <w:lastRenderedPageBreak/>
         <w:t xml:space="preserve">Figura </w:t>
@@ -15838,854 +15833,83 @@
         <w:t>7.4.5 Menu ME</w:t>
       </w:r>
       <w:bookmarkEnd w:id="31"/>
-    </w:p>
-    <w:p>
-      <w:pPr>
+      <w:r>
         <w:rPr>
           <w:szCs w:val="24"/>
         </w:rPr>
-      </w:pPr>
-    </w:p>
-    <w:p>
-      <w:pPr>
-        <w:outlineLvl w:val="2"/>
-        <w:rPr>
+        <w:t>I</w:t>
+      </w:r>
+    </w:p>
+    <w:p>
+      <w:pPr>
+        <w:pStyle w:val="Legenda"/>
+      </w:pPr>
+      <w:bookmarkStart w:id="32" w:name="_Toc229598876"/>
+      <w:r>
+        <w:rPr>
+          <w:sz w:val="24"/>
           <w:szCs w:val="24"/>
         </w:rPr>
-      </w:pPr>
-      <w:r>
-        <w:rPr>
+        <w:t xml:space="preserve">Figura </w:t>
+      </w:r>
+      <w:r>
+        <w:rPr>
+          <w:sz w:val="24"/>
           <w:szCs w:val="24"/>
         </w:rPr>
-        <w:tab/>
-      </w:r>
-      <w:bookmarkStart w:id="32" w:name="_Toc229592502"/>
-      <w:r>
-        <w:rPr>
+        <w:fldChar w:fldCharType="begin"/>
+      </w:r>
+      <w:r>
+        <w:rPr>
+          <w:sz w:val="24"/>
           <w:szCs w:val="24"/>
         </w:rPr>
-        <w:t>7.4.6 Menu MEI</w:t>
-      </w:r>
-      <w:bookmarkEnd w:id="32"/>
-    </w:p>
-    <w:p>
-      <w:pPr>
-        <w:rPr>
+        <w:instrText xml:space="preserve"> SEQ Figura \* ARABIC </w:instrText>
+      </w:r>
+      <w:r>
+        <w:rPr>
+          <w:sz w:val="24"/>
           <w:szCs w:val="24"/>
         </w:rPr>
-      </w:pPr>
-    </w:p>
-    <w:p>
-      <w:pPr>
-        <w:outlineLvl w:val="2"/>
-        <w:rPr>
+        <w:fldChar w:fldCharType="separate"/>
+      </w:r>
+      <w:r>
+        <w:rPr>
+          <w:noProof/>
+          <w:sz w:val="24"/>
           <w:szCs w:val="24"/>
         </w:rPr>
-      </w:pPr>
-      <w:r>
-        <w:rPr>
+        <w:t>6</w:t>
+      </w:r>
+      <w:r>
+        <w:rPr>
+          <w:sz w:val="24"/>
           <w:szCs w:val="24"/>
         </w:rPr>
-        <w:tab/>
-      </w:r>
-      <w:bookmarkStart w:id="33" w:name="_Toc229592503"/>
-      <w:r>
-        <w:rPr>
+        <w:fldChar w:fldCharType="end"/>
+      </w:r>
+      <w:r>
+        <w:rPr>
+          <w:sz w:val="24"/>
           <w:szCs w:val="24"/>
         </w:rPr>
-        <w:t>7.4.7  Tela de documentos</w:t>
-      </w:r>
-      <w:bookmarkEnd w:id="33"/>
-    </w:p>
-    <w:p>
-      <w:pPr>
-        <w:jc w:val="center"/>
-        <w:rPr>
-          <w:sz w:val="20"/>
-          <w:szCs w:val="20"/>
-        </w:rPr>
-      </w:pPr>
-    </w:p>
-    <w:p>
-      <w:pPr>
-        <w:pStyle w:val="PargrafodaLista"/>
-        <w:numPr>
-          <w:ilvl w:val="1"/>
-          <w:numId w:val="1"/>
-        </w:numPr>
-        <w:outlineLvl w:val="1"/>
-        <w:rPr>
-          <w:b/>
-          <w:bCs/>
-        </w:rPr>
-      </w:pPr>
-      <w:bookmarkStart w:id="34" w:name="_Toc229592504"/>
-      <w:r>
-        <w:rPr>
-          <w:b/>
-          <w:bCs/>
-        </w:rPr>
-        <w:t>Política de Privacidade</w:t>
-      </w:r>
-      <w:bookmarkEnd w:id="34"/>
-    </w:p>
-    <w:p/>
-    <w:p>
-      <w:r>
-        <w:t>A</w:t>
-      </w:r>
-      <w:r>
-        <w:t xml:space="preserve"> sua privacidade é importante para nós. É política do Contax respeitar a sua privacidade em relação a qualquer informação sua que possamos coletar no site Contax, e outros sites que possuímos e operamos.</w:t>
-      </w:r>
-    </w:p>
-    <w:p>
-      <w:r>
-        <w:t xml:space="preserve">Solicitamos informações pessoais apenas quando realmente precisamos delas para lhe </w:t>
-      </w:r>
-      <w:proofErr w:type="spellStart"/>
-      <w:r>
-        <w:t>fornecer</w:t>
-      </w:r>
-      <w:proofErr w:type="spellEnd"/>
-      <w:r>
-        <w:t xml:space="preserve"> um serviço. Fazemo-lo por meios justos e legais, com o seu conhecimento e consentimento. Também informamos por que estamos coletando e como será usado.</w:t>
-      </w:r>
-    </w:p>
-    <w:p>
-      <w:r>
-        <w:lastRenderedPageBreak/>
-        <w:t>Apenas retemos as informações coletadas pelo tempo necessário para fornecer o serviço solicitado. Quando armazenamos dados, protegemos dentro de meios comercialmente aceitáveis ​​para evitar perdas e roubos, bem como acesso, divulgação, cópia, uso ou modificação não autorizados.</w:t>
-      </w:r>
-    </w:p>
-    <w:p>
-      <w:r>
-        <w:t>Não compartilhamos informações de identificação pessoal publicamente ou com terceiros, exceto quando exigido por lei.</w:t>
-      </w:r>
-    </w:p>
-    <w:p>
-      <w:r>
-        <w:t>O nosso site pode ter links para sites externos que não são operados por nós. Esteja ciente de que não temos controle sobre o conteúdo e práticas desses sites e não podemos aceitar responsabilidade por suas respectivas políticas de privacidade.</w:t>
-      </w:r>
-    </w:p>
-    <w:p>
-      <w:r>
-        <w:t xml:space="preserve">Você é livre para recusar a nossa solicitação de informações pessoais, entendendo que talvez não possamos </w:t>
-      </w:r>
-      <w:proofErr w:type="spellStart"/>
-      <w:r>
-        <w:t>fornecer</w:t>
-      </w:r>
-      <w:proofErr w:type="spellEnd"/>
-      <w:r>
-        <w:t xml:space="preserve"> alguns dos serviços desejados.</w:t>
-      </w:r>
-    </w:p>
-    <w:p>
-      <w:r>
-        <w:t>O uso continuado de nosso site será considerado como aceitação de nossas práticas em torno de privacidade e informações pessoais. Se você tiver alguma dúvida sobre como lidamos com dados do usuário e informações pessoais, entre em contacto c</w:t>
-      </w:r>
-      <w:r>
-        <w:t>o</w:t>
-      </w:r>
-      <w:r>
-        <w:t>nosco</w:t>
-      </w:r>
-      <w:r>
-        <w:t>.</w:t>
-      </w:r>
-    </w:p>
-    <w:p>
-      <w:r>
-        <w:t xml:space="preserve">- </w:t>
-      </w:r>
-      <w:r>
-        <w:t xml:space="preserve">O serviço Google </w:t>
-      </w:r>
-      <w:proofErr w:type="spellStart"/>
-      <w:r>
-        <w:t>AdSense</w:t>
-      </w:r>
-      <w:proofErr w:type="spellEnd"/>
-      <w:r>
-        <w:t xml:space="preserve"> que usamos para veicular publicidade usa um cookie </w:t>
-      </w:r>
-      <w:proofErr w:type="spellStart"/>
-      <w:r>
-        <w:t>DoubleClick</w:t>
-      </w:r>
-      <w:proofErr w:type="spellEnd"/>
-      <w:r>
-        <w:t xml:space="preserve"> para veicular anúncios mais relevantes em toda a Web e limitar o número de vezes que um determinado anúncio é exibido para você.</w:t>
-      </w:r>
-    </w:p>
-    <w:p>
-      <w:r>
-        <w:t xml:space="preserve">- </w:t>
-      </w:r>
-      <w:r>
-        <w:t xml:space="preserve">Para mais informações sobre o Google </w:t>
-      </w:r>
-      <w:proofErr w:type="spellStart"/>
-      <w:r>
-        <w:t>AdSense</w:t>
-      </w:r>
-      <w:proofErr w:type="spellEnd"/>
-      <w:r>
-        <w:t xml:space="preserve">, consulte as </w:t>
-      </w:r>
-      <w:proofErr w:type="spellStart"/>
-      <w:r>
-        <w:t>FAQs</w:t>
-      </w:r>
-      <w:proofErr w:type="spellEnd"/>
-      <w:r>
-        <w:t xml:space="preserve"> oficiais sobre privacidade do Google </w:t>
-      </w:r>
-      <w:proofErr w:type="spellStart"/>
-      <w:r>
-        <w:t>AdSense</w:t>
-      </w:r>
-      <w:proofErr w:type="spellEnd"/>
-      <w:r>
-        <w:t>.</w:t>
-      </w:r>
-    </w:p>
-    <w:p>
-      <w:r>
-        <w:t xml:space="preserve">- </w:t>
-      </w:r>
-      <w:r>
-        <w:t>Utilizamos anúncios para compensar os custos de funcionamento deste site e fornecer financiamento para futuros desenvolvimentos. Os cookies de publicidade comportamental usados ​​por este site foram projetados para garantir que você forneça os anúncios mais relevantes sempre que possível, rastreando anonimamente seus interesses e apresentando coisas semelhantes que possam ser do seu interesse.</w:t>
-      </w:r>
-    </w:p>
-    <w:p>
-      <w:r>
-        <w:t xml:space="preserve">- </w:t>
-      </w:r>
-      <w:r>
-        <w:t>Vários parceiros anunciam em nosso nome e os cookies de rastreamento de afiliados simplesmente nos permitem ver se nossos clientes acessaram o site através de um dos sites de nossos parceiros, para que possamos creditá-los adequadamente e, quando aplicável, permitir que nossos parceiros afiliados ofereçam qualquer promoção que pode fornecê-lo para fazer uma compra.</w:t>
-      </w:r>
-    </w:p>
-    <w:p/>
-    <w:p>
-      <w:r>
-        <w:lastRenderedPageBreak/>
-        <w:t>Compromisso do Usuário</w:t>
-      </w:r>
-    </w:p>
-    <w:p>
-      <w:r>
-        <w:t>O usuário se compromete a fazer uso adequado dos conteúdos e da informação que o Contax oferece no site e com caráter enunciativo, mas não limitativo:</w:t>
-      </w:r>
-    </w:p>
-    <w:p>
-      <w:pPr>
-        <w:ind w:firstLine="357"/>
-      </w:pPr>
-      <w:r>
-        <w:t>A) Não se envolver em atividades que sejam ilegais ou contrárias à boa fé a à ordem pública</w:t>
-      </w:r>
-      <w:r>
-        <w:t>;</w:t>
-      </w:r>
-    </w:p>
-    <w:p>
-      <w:pPr>
-        <w:ind w:firstLine="357"/>
-      </w:pPr>
-      <w:r>
-        <w:t>B) Não difundir propaganda ou conteúdo de natureza racista, xenofóbica, jogos de sorte ou azar, qualquer tipo de pornografia ilegal, de apologia ao terrorismo ou contra os direitos humanos;</w:t>
-      </w:r>
-    </w:p>
-    <w:p>
-      <w:pPr>
-        <w:ind w:firstLine="357"/>
-      </w:pPr>
-      <w:r>
-        <w:t>C) Não causar danos aos sistemas físicos (hardwares) e lógicos (softwares) do Contax, de seus fornecedores ou terceiros, para introduzir ou disseminar vírus informáticos ou quaisquer outros sistemas de hardware ou software que sejam capazes de causar danos anteriormente mencionados.</w:t>
-      </w:r>
-    </w:p>
-    <w:p/>
-    <w:p>
-      <w:r>
-        <w:t>Mais informações</w:t>
-      </w:r>
-    </w:p>
-    <w:p>
-      <w:r>
-        <w:t>Esperemos que esteja esclarecido e, como mencionado anteriormente, se houver algo que você não tem certeza se precisa ou não, geralmente é mais seguro deixar os cookies ativados, caso interaja com um dos recursos que você usa em nosso site.</w:t>
-      </w:r>
-    </w:p>
-    <w:p>
-      <w:pPr>
-        <w:ind w:firstLine="357"/>
-      </w:pPr>
-      <w:r>
-        <w:t>Esta política é efetiva a partir de 28 April 2026 22:46</w:t>
-      </w:r>
-    </w:p>
-    <w:p/>
-    <w:p>
-      <w:pPr>
-        <w:pStyle w:val="PargrafodaLista"/>
-        <w:numPr>
-          <w:ilvl w:val="1"/>
-          <w:numId w:val="1"/>
-        </w:numPr>
-        <w:ind w:left="788" w:hanging="431"/>
-        <w:outlineLvl w:val="1"/>
-        <w:rPr>
-          <w:b/>
-          <w:bCs/>
-        </w:rPr>
-      </w:pPr>
-      <w:bookmarkStart w:id="35" w:name="_Toc229592505"/>
-      <w:r>
-        <w:rPr>
-          <w:b/>
-          <w:bCs/>
-        </w:rPr>
-        <w:t>Termos de Uso</w:t>
-      </w:r>
-      <w:bookmarkEnd w:id="35"/>
-    </w:p>
-    <w:p/>
-    <w:p>
-      <w:pPr>
-        <w:pStyle w:val="PargrafodaLista"/>
-        <w:numPr>
-          <w:ilvl w:val="0"/>
-          <w:numId w:val="8"/>
-        </w:numPr>
-      </w:pPr>
-      <w:r>
-        <w:t>Termos</w:t>
-      </w:r>
-    </w:p>
-    <w:p>
-      <w:r>
-        <w:t>Ao acessar ao site Contax, concorda em cumprir estes termos de serviço, todas as leis e regulamentos aplicáveis ​​e concorda que é responsável pelo cumprimento de todas as leis locais aplicáveis. Se você não concordar com algum desses termos, está proibido de usar ou acessar este site. Os materiais contidos neste site são protegidos pelas leis de direitos autorais e marcas comerciais aplicáveis.</w:t>
-      </w:r>
-    </w:p>
-    <w:p>
-      <w:pPr>
-        <w:pStyle w:val="PargrafodaLista"/>
-        <w:numPr>
-          <w:ilvl w:val="0"/>
-          <w:numId w:val="8"/>
-        </w:numPr>
-      </w:pPr>
-      <w:r>
-        <w:t>Uso de Licença</w:t>
-      </w:r>
-    </w:p>
-    <w:p>
-      <w:r>
-        <w:lastRenderedPageBreak/>
-        <w:t>É concedida permissão para baixar temporariamente uma cópia dos materiais (informações ou software) no site Contax, apenas para visualização transitória pessoal e não comercial. Esta é a concessão de uma licença, não uma transferência de título e, sob esta licença, você não pode:</w:t>
-      </w:r>
-    </w:p>
-    <w:p>
-      <w:pPr>
-        <w:pStyle w:val="PargrafodaLista"/>
-        <w:numPr>
-          <w:ilvl w:val="0"/>
-          <w:numId w:val="7"/>
-        </w:numPr>
-      </w:pPr>
-      <w:r>
-        <w:t>modificar ou copiar os materiais;</w:t>
-      </w:r>
-    </w:p>
-    <w:p>
-      <w:pPr>
-        <w:pStyle w:val="PargrafodaLista"/>
-        <w:numPr>
-          <w:ilvl w:val="0"/>
-          <w:numId w:val="7"/>
-        </w:numPr>
-      </w:pPr>
-      <w:r>
-        <w:t>usar os materiais para qualquer finalidade comercial ou para exibição pública (comercial ou não comercial);</w:t>
-      </w:r>
-    </w:p>
-    <w:p>
-      <w:pPr>
-        <w:pStyle w:val="PargrafodaLista"/>
-        <w:numPr>
-          <w:ilvl w:val="0"/>
-          <w:numId w:val="7"/>
-        </w:numPr>
-      </w:pPr>
-      <w:r>
-        <w:t xml:space="preserve">tentar </w:t>
-      </w:r>
-      <w:proofErr w:type="spellStart"/>
-      <w:r>
-        <w:t>descompilar</w:t>
-      </w:r>
-      <w:proofErr w:type="spellEnd"/>
-      <w:r>
-        <w:t xml:space="preserve"> ou fazer engenharia reversa de qualquer software contido no site Contax;</w:t>
-      </w:r>
-    </w:p>
-    <w:p>
-      <w:pPr>
-        <w:pStyle w:val="PargrafodaLista"/>
-        <w:numPr>
-          <w:ilvl w:val="0"/>
-          <w:numId w:val="7"/>
-        </w:numPr>
-      </w:pPr>
-      <w:r>
-        <w:t>remover quaisquer direitos autorais ou outras notações de propriedade dos materiais; ou</w:t>
-      </w:r>
-    </w:p>
-    <w:p>
-      <w:pPr>
-        <w:pStyle w:val="PargrafodaLista"/>
-        <w:numPr>
-          <w:ilvl w:val="0"/>
-          <w:numId w:val="7"/>
-        </w:numPr>
-      </w:pPr>
-      <w:r>
-        <w:t>transferir os materiais para outra pessoa ou 'espelhe' os materiais em qualquer outro servidor.</w:t>
-      </w:r>
-    </w:p>
-    <w:p>
-      <w:r>
-        <w:t xml:space="preserve">Esta licença será automaticamente rescindida se você violar alguma dessas restrições e poderá ser rescindida por Contax a qualquer momento. Ao encerrar a visualização desses materiais ou após o término desta licença, você deve apagar todos os materiais baixados em sua posse, seja em formato </w:t>
-      </w:r>
-      <w:proofErr w:type="spellStart"/>
-      <w:r>
-        <w:t>eletrónico</w:t>
-      </w:r>
-      <w:proofErr w:type="spellEnd"/>
-      <w:r>
-        <w:t xml:space="preserve"> ou impresso.</w:t>
-      </w:r>
-    </w:p>
-    <w:p>
-      <w:pPr>
-        <w:pStyle w:val="PargrafodaLista"/>
-        <w:numPr>
-          <w:ilvl w:val="0"/>
-          <w:numId w:val="8"/>
-        </w:numPr>
-      </w:pPr>
-      <w:r>
-        <w:t>Isenção de responsabilidade</w:t>
-      </w:r>
-    </w:p>
-    <w:p>
-      <w:pPr>
-        <w:pStyle w:val="PargrafodaLista"/>
-        <w:numPr>
-          <w:ilvl w:val="0"/>
-          <w:numId w:val="9"/>
-        </w:numPr>
-      </w:pPr>
-      <w:r>
-        <w:t>Os materiais no site da Contax são fornecidos 'como estão'. Contax não oferece garantias, expressas ou implícitas, e, por este meio, isenta e nega todas as outras garantias, incluindo, sem limitação, garantias implícitas ou condições de comercialização, adequação a um fim específico ou não violação de propriedade intelectual ou outra violação de direitos.</w:t>
-      </w:r>
-    </w:p>
-    <w:p>
-      <w:pPr>
-        <w:pStyle w:val="PargrafodaLista"/>
-        <w:numPr>
-          <w:ilvl w:val="0"/>
-          <w:numId w:val="9"/>
-        </w:numPr>
-      </w:pPr>
-      <w:r>
-        <w:t>Além disso, o Contax não garante ou faz qualquer representação relativa à precisão, aos resultados prováveis ​​ou à confiabilidade do uso dos materiais em seu site ou de outra forma relacionado a esses materiais ou em sites vinculados a este site.</w:t>
-      </w:r>
-    </w:p>
-    <w:p>
-      <w:pPr>
-        <w:pStyle w:val="PargrafodaLista"/>
-        <w:numPr>
-          <w:ilvl w:val="0"/>
-          <w:numId w:val="8"/>
-        </w:numPr>
-      </w:pPr>
-      <w:r>
-        <w:t>Limitações</w:t>
-      </w:r>
-    </w:p>
-    <w:p>
-      <w:r>
-        <w:t xml:space="preserve">Em nenhum caso o Contax ou seus fornecedores serão responsáveis ​​por quaisquer danos (incluindo, sem limitação, danos por perda de dados ou lucro ou devido a interrupção dos negócios) decorrentes do uso ou da incapacidade de usar os materiais em Contax, mesmo que Contax ou um representante autorizado da Contax tenha sido notificado oralmente ou por escrito da possibilidade de tais danos. Como algumas </w:t>
-      </w:r>
-      <w:r>
-        <w:lastRenderedPageBreak/>
-        <w:t xml:space="preserve">jurisdições não permitem limitações em garantias implícitas, ou limitações de responsabilidade por danos </w:t>
-      </w:r>
-      <w:proofErr w:type="spellStart"/>
-      <w:r>
-        <w:t>conseqüentes</w:t>
-      </w:r>
-      <w:proofErr w:type="spellEnd"/>
-      <w:r>
-        <w:t xml:space="preserve"> ou incidentais, essas limitações podem não se aplicar a você.</w:t>
-      </w:r>
-    </w:p>
-    <w:p>
-      <w:pPr>
-        <w:pStyle w:val="PargrafodaLista"/>
-        <w:numPr>
-          <w:ilvl w:val="0"/>
-          <w:numId w:val="8"/>
-        </w:numPr>
-      </w:pPr>
-      <w:r>
-        <w:t>Precisão dos materiais</w:t>
-      </w:r>
-    </w:p>
-    <w:p>
-      <w:r>
-        <w:t>Os materiais exibidos no site da Contax podem incluir erros técnicos, tipográficos ou fotográficos. Contax não garante que qualquer material em seu site seja preciso, completo ou atual. Contax pode fazer alterações nos materiais contidos em seu site a qualquer momento, sem aviso prévio. No entanto, Contax não se compromete a atualizar os materiais.</w:t>
-      </w:r>
-    </w:p>
-    <w:p>
-      <w:pPr>
-        <w:pStyle w:val="PargrafodaLista"/>
-        <w:numPr>
-          <w:ilvl w:val="0"/>
-          <w:numId w:val="8"/>
-        </w:numPr>
-      </w:pPr>
-      <w:r>
-        <w:t>Links</w:t>
-      </w:r>
-    </w:p>
-    <w:p>
-      <w:r>
-        <w:t>O Contax não analisou todos os sites vinculados ao seu site e não é responsável pelo conteúdo de nenhum site vinculado. A inclusão de qualquer link não implica endosso por Contax do site. O uso de qualquer site vinculado é por conta e risco do usuário.</w:t>
-      </w:r>
-    </w:p>
-    <w:p/>
-    <w:p>
-      <w:r>
-        <w:t>Modificações</w:t>
-      </w:r>
-    </w:p>
-    <w:p>
-      <w:r>
-        <w:t>O Contax pode revisar estes termos de serviço do site a qualquer momento, sem aviso prévio. Ao usar este site, você concorda em ficar vinculado à versão atual desses termos de serviço.</w:t>
-      </w:r>
-    </w:p>
-    <w:p/>
-    <w:p>
-      <w:r>
-        <w:t>Lei aplicável</w:t>
-      </w:r>
-    </w:p>
-    <w:p>
-      <w:r>
-        <w:t>Estes termos e condições são regidos e interpretados de acordo com as leis do Contax e você se submete irrevogavelmente à jurisdição exclusiva dos tribunais naquele estado ou localidade.</w:t>
-      </w:r>
-    </w:p>
-    <w:p>
-      <w:pPr>
-        <w:spacing w:after="200" w:line="276" w:lineRule="auto"/>
-        <w:jc w:val="left"/>
-      </w:pPr>
-      <w:r>
-        <w:br w:type="page"/>
-      </w:r>
-    </w:p>
-    <w:p>
-      <w:pPr>
-        <w:pStyle w:val="PargrafodaLista"/>
-        <w:numPr>
-          <w:ilvl w:val="0"/>
-          <w:numId w:val="8"/>
-        </w:numPr>
-        <w:ind w:left="357" w:hanging="357"/>
-        <w:outlineLvl w:val="0"/>
-        <w:rPr>
-          <w:b/>
-        </w:rPr>
-      </w:pPr>
-      <w:bookmarkStart w:id="36" w:name="_Toc229592506"/>
-      <w:r>
-        <w:rPr>
-          <w:b/>
-        </w:rPr>
-        <w:lastRenderedPageBreak/>
-        <w:t>CONSIDERAÇÕES FINAIS</w:t>
-      </w:r>
-      <w:bookmarkEnd w:id="36"/>
-    </w:p>
-    <w:p/>
-    <w:p/>
-    <w:p>
-      <w:r>
-        <w:t>Parte final do trabalho no qual são expostas as conclusões correspondentes aos objetivos e hipóteses, apresentados na introdução.</w:t>
-      </w:r>
-    </w:p>
-    <w:p>
-      <w:r>
-        <w:t>Nesse campo são apontadas as respostas às hipóteses e objetivos do TCC. O ponto de vista dos autores, devidamente embasado pelos dados, conceitos e informações apresentados no desenvolvimento deve ser inserido aqui. Podem ser incluídas breves recomendações e sugestões para trabalhos futuros.</w:t>
-      </w:r>
-    </w:p>
-    <w:p/>
-    <w:p>
-      <w:pPr>
-        <w:spacing w:after="200" w:line="276" w:lineRule="auto"/>
-        <w:jc w:val="left"/>
-      </w:pPr>
-      <w:r>
-        <w:br w:type="page"/>
-      </w:r>
-    </w:p>
-    <w:p>
-      <w:pPr>
-        <w:jc w:val="center"/>
-        <w:outlineLvl w:val="0"/>
-        <w:rPr>
-          <w:b/>
-        </w:rPr>
-      </w:pPr>
-      <w:bookmarkStart w:id="37" w:name="_Toc229592507"/>
-      <w:r>
-        <w:rPr>
-          <w:b/>
-        </w:rPr>
-        <w:lastRenderedPageBreak/>
-        <w:t>REFERÊNCIAS</w:t>
-      </w:r>
-      <w:bookmarkEnd w:id="37"/>
-    </w:p>
-    <w:p/>
-    <w:p>
-      <w:r>
-        <w:t>MACORATTI</w:t>
-      </w:r>
-      <w:r>
-        <w:t xml:space="preserve">, José Carlos. </w:t>
-      </w:r>
-      <w:r>
-        <w:rPr>
-          <w:b/>
-        </w:rPr>
-        <w:t>Visual Studio Code – Apresentando o editor multiplataforma da Microsoft</w:t>
-      </w:r>
-      <w:r>
-        <w:t xml:space="preserve">, 2016. Disponível em: </w:t>
-      </w:r>
-      <w:hyperlink r:id="rId20" w:history="1">
-        <w:r>
-          <w:rPr>
-            <w:rStyle w:val="Hyperlink"/>
-          </w:rPr>
-          <w:t>https://imasters.com.br/desenvolvimento/visual-studio-code-apresentando-o-editor-multiplataforma-da-microsoft</w:t>
-        </w:r>
-      </w:hyperlink>
-      <w:r>
-        <w:t>. Acesso em 19 out. 2023.</w:t>
-      </w:r>
-      <w:r>
+        <w:t>: Interface central da empresa MEI.</w:t>
+      </w:r>
+      <w:r>
+        <w:rPr>
+          <w:szCs w:val="24"/>
+        </w:rPr>
         <w:t xml:space="preserve"> </w:t>
       </w:r>
-    </w:p>
-    <w:p/>
-    <w:p>
-      <w:r>
-        <w:t xml:space="preserve">MICROSOFT. </w:t>
-      </w:r>
-      <w:r>
-        <w:rPr>
-          <w:b/>
-        </w:rPr>
-        <w:t>Conheça a família Visual Studio</w:t>
-      </w:r>
-      <w:r>
-        <w:t xml:space="preserve">, 2023. Disponível em: </w:t>
-      </w:r>
-      <w:hyperlink r:id="rId21" w:anchor=":~:text=o%20Visual%20Studio-,Visual%20Studio%20Code,praticamente%20qualquer%20linguagem%20de%20programa%C3%A7%C3%A3o" w:history="1">
-        <w:r>
-          <w:rPr>
-            <w:rStyle w:val="Hyperlink"/>
-          </w:rPr>
-          <w:t>https://visualstudio.microsoft.com/pt-br/#:~:text=o%20Visual%20Studio-,Visual%20Studio%20Code,praticamente%20qualquer%20linguagem%20de%20programa%C3%A7%C3%A3o</w:t>
-        </w:r>
-      </w:hyperlink>
-      <w:r>
-        <w:t>.</w:t>
-      </w:r>
-      <w:r>
-        <w:t xml:space="preserve"> Acesso em 20 out. 2023.</w:t>
-      </w:r>
-    </w:p>
-    <w:p/>
-    <w:p>
-      <w:r>
-        <w:t xml:space="preserve">ALBUQUERQUE, Felipe et al. </w:t>
-      </w:r>
-      <w:proofErr w:type="spellStart"/>
-      <w:r>
-        <w:t>Integraçao</w:t>
-      </w:r>
-      <w:proofErr w:type="spellEnd"/>
-      <w:r>
-        <w:t xml:space="preserve"> de </w:t>
-      </w:r>
-      <w:proofErr w:type="spellStart"/>
-      <w:r>
-        <w:t>Replicaçao</w:t>
-      </w:r>
-      <w:proofErr w:type="spellEnd"/>
-      <w:r>
-        <w:t xml:space="preserve"> Máquina de Estados no </w:t>
-      </w:r>
-      <w:proofErr w:type="spellStart"/>
-      <w:r>
-        <w:t>Kubernetes</w:t>
-      </w:r>
-      <w:proofErr w:type="spellEnd"/>
-      <w:r>
-        <w:t>. In: </w:t>
-      </w:r>
-      <w:r>
-        <w:rPr>
-          <w:b/>
-          <w:bCs/>
-        </w:rPr>
-        <w:t>Anais do XIX Workshop de Testes e Tolerância a Falhas</w:t>
-      </w:r>
-      <w:r>
-        <w:t>. SBC, 2018.</w:t>
-      </w:r>
-      <w:r>
-        <w:t xml:space="preserve"> Disponível em: </w:t>
-      </w:r>
-      <w:hyperlink r:id="rId22" w:history="1">
-        <w:r>
-          <w:rPr>
-            <w:rStyle w:val="Hyperlink"/>
-          </w:rPr>
-          <w:t>https://sol.sbc.org.br/index.php/wtf/article/view/2384</w:t>
-        </w:r>
-      </w:hyperlink>
-      <w:r>
-        <w:t>. Acesso em 20 out. 2023.</w:t>
-      </w:r>
-    </w:p>
-    <w:p/>
-    <w:p>
-      <w:r>
-        <w:t xml:space="preserve">Oliveira S de M de. O funcionamento da autoria nos blogs de divulgação científica. </w:t>
-      </w:r>
-      <w:proofErr w:type="spellStart"/>
-      <w:r>
-        <w:t>Ling</w:t>
-      </w:r>
-      <w:proofErr w:type="spellEnd"/>
-      <w:r>
-        <w:t xml:space="preserve"> (</w:t>
-      </w:r>
-      <w:proofErr w:type="spellStart"/>
-      <w:r>
-        <w:t>dis</w:t>
-      </w:r>
-      <w:proofErr w:type="spellEnd"/>
-      <w:r>
-        <w:t>)curso</w:t>
-      </w:r>
-      <w:r>
-        <w:t>,</w:t>
-      </w:r>
-      <w:r>
-        <w:t xml:space="preserve"> </w:t>
-      </w:r>
-      <w:r>
-        <w:t>set. 2011</w:t>
-      </w:r>
-      <w:r>
-        <w:t xml:space="preserve">. </w:t>
-      </w:r>
-      <w:r>
-        <w:t>DOI</w:t>
-      </w:r>
-      <w:r>
-        <w:t xml:space="preserve">: </w:t>
-      </w:r>
-      <w:hyperlink r:id="rId23" w:history="1">
-        <w:r>
-          <w:rPr>
-            <w:rStyle w:val="Hyperlink"/>
-          </w:rPr>
-          <w:t>https://doi.org/10.1590/S1518-76322011000300008</w:t>
-        </w:r>
-      </w:hyperlink>
-      <w:r>
-        <w:t>. Acesso em 17 out. 2023.</w:t>
-      </w:r>
-    </w:p>
-    <w:p/>
-    <w:p/>
-    <w:p/>
-    <w:p>
-      <w:pPr>
-        <w:spacing w:after="200" w:line="276" w:lineRule="auto"/>
-        <w:jc w:val="left"/>
-      </w:pPr>
-      <w:r>
-        <w:br w:type="page"/>
-      </w:r>
-    </w:p>
-    <w:p>
-      <w:pPr>
-        <w:jc w:val="center"/>
-        <w:outlineLvl w:val="0"/>
-        <w:rPr>
-          <w:b/>
-        </w:rPr>
-      </w:pPr>
-      <w:bookmarkStart w:id="38" w:name="_Toc229592508"/>
-      <w:r>
-        <w:rPr>
-          <w:b/>
-        </w:rPr>
-        <w:lastRenderedPageBreak/>
-        <w:t>APÊNDICE</w:t>
-      </w:r>
-      <w:r>
-        <w:rPr>
-          <w:b/>
-        </w:rPr>
-        <w:t>(s) (Elemento opcional)</w:t>
-      </w:r>
-      <w:bookmarkEnd w:id="38"/>
-    </w:p>
-    <w:p/>
-    <w:p>
-      <w:r>
-        <w:t xml:space="preserve">Texto ou documento elaborado pelo autor, a fim de complementar sua argumentação. O(s) apêndice(s) é(são) identificado(s) por letras maiúsculas consecutivas, travessão e pelos res- </w:t>
-      </w:r>
-      <w:proofErr w:type="spellStart"/>
-      <w:r>
-        <w:t>pectivos</w:t>
-      </w:r>
-      <w:proofErr w:type="spellEnd"/>
-      <w:r>
-        <w:t xml:space="preserve"> títulos. Excepcionalmente utilizam-se letras maiúsculas dobradas, na identificação dos apêndices, quando esgotadas as 26 letras do alfabeto.</w:t>
-      </w:r>
-    </w:p>
-    <w:p/>
-    <w:p>
-      <w:r>
-        <w:rPr>
-          <w:noProof/>
+      <w:r>
+        <w:rPr>
+          <w:szCs w:val="24"/>
         </w:rPr>
         <w:drawing>
-          <wp:inline distT="0" distB="0" distL="0" distR="0" wp14:anchorId="2710AA24" wp14:editId="6BF729FA">
-            <wp:extent cx="5760085" cy="1520190"/>
-            <wp:effectExtent l="0" t="0" r="0" b="3810"/>
-            <wp:docPr id="2" name="Imagem 2"/>
+          <wp:inline distT="0" distB="0" distL="0" distR="0" wp14:anchorId="0C1425D0" wp14:editId="687A283F">
+            <wp:extent cx="5760085" cy="3238500"/>
+            <wp:effectExtent l="0" t="0" r="0" b="0"/>
+            <wp:docPr id="10" name="Imagem 10"/>
             <wp:cNvGraphicFramePr>
               <a:graphicFrameLocks xmlns:a="http://schemas.openxmlformats.org/drawingml/2006/main" noChangeAspect="1"/>
             </wp:cNvGraphicFramePr>
@@ -16693,17 +15917,11 @@
               <a:graphicData uri="http://schemas.openxmlformats.org/drawingml/2006/picture">
                 <pic:pic xmlns:pic="http://schemas.openxmlformats.org/drawingml/2006/picture">
                   <pic:nvPicPr>
-                    <pic:cNvPr id="2" name="3DC3AB0.tmp"/>
+                    <pic:cNvPr id="1" name=""/>
                     <pic:cNvPicPr/>
                   </pic:nvPicPr>
                   <pic:blipFill>
-                    <a:blip r:embed="rId24">
-                      <a:extLst>
-                        <a:ext uri="{28A0092B-C50C-407E-A947-70E740481C1C}">
-                          <a14:useLocalDpi xmlns:a14="http://schemas.microsoft.com/office/drawing/2010/main" val="0"/>
-                        </a:ext>
-                      </a:extLst>
-                    </a:blip>
+                    <a:blip r:embed="rId20"/>
                     <a:stretch>
                       <a:fillRect/>
                     </a:stretch>
@@ -16711,7 +15929,7 @@
                   <pic:spPr>
                     <a:xfrm>
                       <a:off x="0" y="0"/>
-                      <a:ext cx="5760085" cy="1520190"/>
+                      <a:ext cx="5760085" cy="3238500"/>
                     </a:xfrm>
                     <a:prstGeom prst="rect">
                       <a:avLst/>
@@ -16723,65 +15941,131 @@
           </wp:inline>
         </w:drawing>
       </w:r>
-    </w:p>
-    <w:p/>
-    <w:p/>
-    <w:p>
-      <w:pPr>
-        <w:spacing w:after="200" w:line="276" w:lineRule="auto"/>
-        <w:jc w:val="left"/>
-      </w:pPr>
-      <w:r>
-        <w:br w:type="page"/>
-      </w:r>
+      <w:bookmarkEnd w:id="32"/>
     </w:p>
     <w:p>
       <w:pPr>
         <w:jc w:val="center"/>
-        <w:outlineLvl w:val="0"/>
-        <w:rPr>
-          <w:b/>
-        </w:rPr>
-      </w:pPr>
-      <w:bookmarkStart w:id="39" w:name="_Toc229592509"/>
-      <w:r>
-        <w:rPr>
-          <w:b/>
+        <w:rPr>
+          <w:sz w:val="20"/>
+          <w:szCs w:val="20"/>
+        </w:rPr>
+      </w:pPr>
+      <w:r>
+        <w:rPr>
+          <w:sz w:val="20"/>
+          <w:szCs w:val="20"/>
+        </w:rPr>
+        <w:t>Fonte: Elaborado pelos autores (2026).</w:t>
+      </w:r>
+    </w:p>
+    <w:p>
+      <w:pPr>
+        <w:rPr>
+          <w:szCs w:val="24"/>
+        </w:rPr>
+      </w:pPr>
+    </w:p>
+    <w:p>
+      <w:pPr>
+        <w:outlineLvl w:val="2"/>
+        <w:rPr>
+          <w:szCs w:val="24"/>
+        </w:rPr>
+      </w:pPr>
+      <w:r>
+        <w:rPr>
+          <w:szCs w:val="24"/>
+        </w:rPr>
+        <w:tab/>
+      </w:r>
+      <w:bookmarkStart w:id="33" w:name="_Toc229592502"/>
+      <w:r>
+        <w:rPr>
+          <w:szCs w:val="24"/>
+        </w:rPr>
+        <w:t>7.4.6 Menu ME</w:t>
+      </w:r>
+      <w:bookmarkEnd w:id="33"/>
+    </w:p>
+    <w:p>
+      <w:pPr>
+        <w:pStyle w:val="Legenda"/>
+        <w:rPr>
+          <w:sz w:val="24"/>
+          <w:szCs w:val="24"/>
+        </w:rPr>
+      </w:pPr>
+      <w:bookmarkStart w:id="34" w:name="_Toc229598877"/>
+      <w:r>
+        <w:rPr>
+          <w:sz w:val="24"/>
+          <w:szCs w:val="24"/>
         </w:rPr>
         <w:lastRenderedPageBreak/>
-        <w:t>ANEXO(s)</w:t>
-      </w:r>
-      <w:r>
-        <w:rPr>
-          <w:b/>
-        </w:rPr>
-        <w:t xml:space="preserve"> </w:t>
-      </w:r>
-      <w:r>
-        <w:rPr>
-          <w:b/>
-        </w:rPr>
-        <w:t>(Elemento opcional)</w:t>
-      </w:r>
-      <w:bookmarkEnd w:id="39"/>
-    </w:p>
-    <w:p/>
-    <w:p>
-      <w:r>
-        <w:t>Texto ou documento não elaborado pelo autor, que serve de fundamentação, comprovação e ilustração. O(s) anexo(s) é(são) identificado(s) por letras maiúsculas consecutivas, traves- são e pelos respectivos títulos. Excepcionalmente utilizam-se letras maiúsculas dobradas, na identificação dos anexos, quando esgotadas as 26 letras do alfabeto.</w:t>
-      </w:r>
-    </w:p>
-    <w:p/>
-    <w:p>
+        <w:t xml:space="preserve">Figura </w:t>
+      </w:r>
+      <w:r>
+        <w:rPr>
+          <w:sz w:val="24"/>
+          <w:szCs w:val="24"/>
+        </w:rPr>
+        <w:fldChar w:fldCharType="begin"/>
+      </w:r>
+      <w:r>
+        <w:rPr>
+          <w:sz w:val="24"/>
+          <w:szCs w:val="24"/>
+        </w:rPr>
+        <w:instrText xml:space="preserve"> SEQ Figura \* ARABIC </w:instrText>
+      </w:r>
+      <w:r>
+        <w:rPr>
+          <w:sz w:val="24"/>
+          <w:szCs w:val="24"/>
+        </w:rPr>
+        <w:fldChar w:fldCharType="separate"/>
+      </w:r>
       <w:r>
         <w:rPr>
           <w:noProof/>
+          <w:sz w:val="24"/>
+          <w:szCs w:val="24"/>
+        </w:rPr>
+        <w:t>7</w:t>
+      </w:r>
+      <w:r>
+        <w:rPr>
+          <w:sz w:val="24"/>
+          <w:szCs w:val="24"/>
+        </w:rPr>
+        <w:fldChar w:fldCharType="end"/>
+      </w:r>
+      <w:r>
+        <w:rPr>
+          <w:sz w:val="24"/>
+          <w:szCs w:val="24"/>
+        </w:rPr>
+        <w:t>: Interface central da empresa ME.</w:t>
+      </w:r>
+      <w:bookmarkEnd w:id="34"/>
+    </w:p>
+    <w:p>
+      <w:pPr>
+        <w:outlineLvl w:val="2"/>
+        <w:rPr>
+          <w:szCs w:val="24"/>
+        </w:rPr>
+      </w:pPr>
+      <w:r>
+        <w:rPr>
+          <w:szCs w:val="24"/>
         </w:rPr>
         <w:drawing>
-          <wp:inline distT="0" distB="0" distL="0" distR="0" wp14:anchorId="472E0E4F" wp14:editId="69AA1A93">
-            <wp:extent cx="5760085" cy="2364105"/>
+          <wp:inline distT="0" distB="0" distL="0" distR="0" wp14:anchorId="4B626CA7" wp14:editId="1F958851">
+            <wp:extent cx="5760085" cy="3238500"/>
             <wp:effectExtent l="0" t="0" r="0" b="0"/>
-            <wp:docPr id="1" name="Imagem 1"/>
+            <wp:docPr id="18" name="Imagem 18"/>
             <wp:cNvGraphicFramePr>
               <a:graphicFrameLocks xmlns:a="http://schemas.openxmlformats.org/drawingml/2006/main" noChangeAspect="1"/>
             </wp:cNvGraphicFramePr>
@@ -16789,17 +16073,11 @@
               <a:graphicData uri="http://schemas.openxmlformats.org/drawingml/2006/picture">
                 <pic:pic xmlns:pic="http://schemas.openxmlformats.org/drawingml/2006/picture">
                   <pic:nvPicPr>
-                    <pic:cNvPr id="1" name="3DC1554.tmp"/>
+                    <pic:cNvPr id="1" name=""/>
                     <pic:cNvPicPr/>
                   </pic:nvPicPr>
                   <pic:blipFill>
-                    <a:blip r:embed="rId25">
-                      <a:extLst>
-                        <a:ext uri="{28A0092B-C50C-407E-A947-70E740481C1C}">
-                          <a14:useLocalDpi xmlns:a14="http://schemas.microsoft.com/office/drawing/2010/main" val="0"/>
-                        </a:ext>
-                      </a:extLst>
-                    </a:blip>
+                    <a:blip r:embed="rId21"/>
                     <a:stretch>
                       <a:fillRect/>
                     </a:stretch>
@@ -16807,7 +16085,7 @@
                   <pic:spPr>
                     <a:xfrm>
                       <a:off x="0" y="0"/>
-                      <a:ext cx="5760085" cy="2364105"/>
+                      <a:ext cx="5760085" cy="3238500"/>
                     </a:xfrm>
                     <a:prstGeom prst="rect">
                       <a:avLst/>
@@ -16820,7 +16098,790 @@
         </w:drawing>
       </w:r>
     </w:p>
+    <w:p>
+      <w:pPr>
+        <w:jc w:val="center"/>
+        <w:rPr>
+          <w:sz w:val="20"/>
+          <w:szCs w:val="20"/>
+        </w:rPr>
+      </w:pPr>
+      <w:r>
+        <w:rPr>
+          <w:sz w:val="20"/>
+          <w:szCs w:val="20"/>
+        </w:rPr>
+        <w:t>Fonte: Elaborado pelos autores (2026).</w:t>
+      </w:r>
+    </w:p>
+    <w:p>
+      <w:pPr>
+        <w:jc w:val="center"/>
+        <w:rPr>
+          <w:sz w:val="20"/>
+          <w:szCs w:val="20"/>
+        </w:rPr>
+      </w:pPr>
+    </w:p>
+    <w:p>
+      <w:pPr>
+        <w:outlineLvl w:val="2"/>
+        <w:rPr>
+          <w:szCs w:val="24"/>
+        </w:rPr>
+      </w:pPr>
+      <w:r>
+        <w:rPr>
+          <w:szCs w:val="24"/>
+        </w:rPr>
+        <w:tab/>
+      </w:r>
+      <w:bookmarkStart w:id="35" w:name="_Toc229592503"/>
+      <w:r>
+        <w:rPr>
+          <w:szCs w:val="24"/>
+        </w:rPr>
+        <w:t>7.4.7  Tela de documentos</w:t>
+      </w:r>
+      <w:bookmarkEnd w:id="35"/>
+    </w:p>
+    <w:p>
+      <w:pPr>
+        <w:outlineLvl w:val="2"/>
+        <w:rPr>
+          <w:szCs w:val="24"/>
+        </w:rPr>
+      </w:pPr>
+    </w:p>
+    <w:p>
+      <w:pPr>
+        <w:pStyle w:val="Legenda"/>
+        <w:rPr>
+          <w:szCs w:val="20"/>
+        </w:rPr>
+      </w:pPr>
+      <w:bookmarkStart w:id="36" w:name="_Toc229598878"/>
+      <w:r>
+        <w:rPr>
+          <w:sz w:val="24"/>
+          <w:szCs w:val="24"/>
+        </w:rPr>
+        <w:t xml:space="preserve">Figura </w:t>
+      </w:r>
+      <w:r>
+        <w:rPr>
+          <w:sz w:val="24"/>
+          <w:szCs w:val="24"/>
+        </w:rPr>
+        <w:fldChar w:fldCharType="begin"/>
+      </w:r>
+      <w:r>
+        <w:rPr>
+          <w:sz w:val="24"/>
+          <w:szCs w:val="24"/>
+        </w:rPr>
+        <w:instrText xml:space="preserve"> SEQ Figura \* ARABIC </w:instrText>
+      </w:r>
+      <w:r>
+        <w:rPr>
+          <w:sz w:val="24"/>
+          <w:szCs w:val="24"/>
+        </w:rPr>
+        <w:fldChar w:fldCharType="separate"/>
+      </w:r>
+      <w:r>
+        <w:rPr>
+          <w:noProof/>
+          <w:sz w:val="24"/>
+          <w:szCs w:val="24"/>
+        </w:rPr>
+        <w:t>8</w:t>
+      </w:r>
+      <w:r>
+        <w:rPr>
+          <w:sz w:val="24"/>
+          <w:szCs w:val="24"/>
+        </w:rPr>
+        <w:fldChar w:fldCharType="end"/>
+      </w:r>
+      <w:r>
+        <w:rPr>
+          <w:sz w:val="24"/>
+          <w:szCs w:val="24"/>
+        </w:rPr>
+        <w:t>: Tela de documentos.</w:t>
+      </w:r>
+      <w:r>
+        <w:rPr>
+          <w:szCs w:val="20"/>
+        </w:rPr>
+        <w:t xml:space="preserve"> </w:t>
+      </w:r>
+      <w:r>
+        <w:rPr>
+          <w:szCs w:val="20"/>
+        </w:rPr>
+        <w:drawing>
+          <wp:inline distT="0" distB="0" distL="0" distR="0" wp14:anchorId="44217E8E" wp14:editId="6D1FAC80">
+            <wp:extent cx="5760085" cy="3238500"/>
+            <wp:effectExtent l="0" t="0" r="0" b="0"/>
+            <wp:docPr id="19" name="Imagem 19"/>
+            <wp:cNvGraphicFramePr>
+              <a:graphicFrameLocks xmlns:a="http://schemas.openxmlformats.org/drawingml/2006/main" noChangeAspect="1"/>
+            </wp:cNvGraphicFramePr>
+            <a:graphic xmlns:a="http://schemas.openxmlformats.org/drawingml/2006/main">
+              <a:graphicData uri="http://schemas.openxmlformats.org/drawingml/2006/picture">
+                <pic:pic xmlns:pic="http://schemas.openxmlformats.org/drawingml/2006/picture">
+                  <pic:nvPicPr>
+                    <pic:cNvPr id="1" name=""/>
+                    <pic:cNvPicPr/>
+                  </pic:nvPicPr>
+                  <pic:blipFill>
+                    <a:blip r:embed="rId22"/>
+                    <a:stretch>
+                      <a:fillRect/>
+                    </a:stretch>
+                  </pic:blipFill>
+                  <pic:spPr>
+                    <a:xfrm>
+                      <a:off x="0" y="0"/>
+                      <a:ext cx="5760085" cy="3238500"/>
+                    </a:xfrm>
+                    <a:prstGeom prst="rect">
+                      <a:avLst/>
+                    </a:prstGeom>
+                  </pic:spPr>
+                </pic:pic>
+              </a:graphicData>
+            </a:graphic>
+          </wp:inline>
+        </w:drawing>
+      </w:r>
+      <w:bookmarkEnd w:id="36"/>
+    </w:p>
+    <w:p>
+      <w:pPr>
+        <w:jc w:val="center"/>
+        <w:rPr>
+          <w:sz w:val="20"/>
+          <w:szCs w:val="20"/>
+        </w:rPr>
+      </w:pPr>
+      <w:r>
+        <w:rPr>
+          <w:sz w:val="20"/>
+          <w:szCs w:val="20"/>
+        </w:rPr>
+        <w:t>Fonte: Interface para consulta de documentos (2026).</w:t>
+      </w:r>
+    </w:p>
+    <w:p>
+      <w:pPr>
+        <w:jc w:val="center"/>
+        <w:rPr>
+          <w:sz w:val="20"/>
+          <w:szCs w:val="20"/>
+        </w:rPr>
+      </w:pPr>
+    </w:p>
+    <w:p>
+      <w:pPr>
+        <w:pStyle w:val="PargrafodaLista"/>
+        <w:numPr>
+          <w:ilvl w:val="1"/>
+          <w:numId w:val="1"/>
+        </w:numPr>
+        <w:outlineLvl w:val="1"/>
+        <w:rPr>
+          <w:b/>
+          <w:bCs/>
+        </w:rPr>
+      </w:pPr>
+      <w:bookmarkStart w:id="37" w:name="_Toc229592504"/>
+      <w:r>
+        <w:rPr>
+          <w:b/>
+          <w:bCs/>
+        </w:rPr>
+        <w:lastRenderedPageBreak/>
+        <w:t>Política de Privacidade</w:t>
+      </w:r>
+      <w:bookmarkEnd w:id="37"/>
+    </w:p>
     <w:p/>
+    <w:p>
+      <w:r>
+        <w:t>A</w:t>
+      </w:r>
+      <w:r>
+        <w:t xml:space="preserve"> sua privacidade é importante para nós. É política do Contax respeitar a sua privacidade em relação a qualquer informação sua que possamos coletar no site Contax, e outros sites que possuímos e operamos.</w:t>
+      </w:r>
+    </w:p>
+    <w:p>
+      <w:r>
+        <w:t>Solicitamos informações pessoais apenas quando realmente precisamos delas para lhe fornecer um serviço. Fazemo-lo por meios justos e legais, com o seu conhecimento e consentimento. Também informamos por que estamos coletando e como será usado.</w:t>
+      </w:r>
+    </w:p>
+    <w:p>
+      <w:r>
+        <w:t>Apenas retemos as informações coletadas pelo tempo necessário para fornecer o serviço solicitado. Quando armazenamos dados, protegemos dentro de meios comercialmente aceitáveis ​​para evitar perdas e roubos, bem como acesso, divulgação, cópia, uso ou modificação não autorizados.</w:t>
+      </w:r>
+    </w:p>
+    <w:p>
+      <w:r>
+        <w:t>Não compartilhamos informações de identificação pessoal publicamente ou com terceiros, exceto quando exigido por lei.</w:t>
+      </w:r>
+    </w:p>
+    <w:p>
+      <w:r>
+        <w:t>O nosso site pode ter links para sites externos que não são operados por nós. Esteja ciente de que não temos controle sobre o conteúdo e práticas desses sites e não podemos aceitar responsabilidade por suas respectivas políticas de privacidade.</w:t>
+      </w:r>
+    </w:p>
+    <w:p>
+      <w:r>
+        <w:t>Você é livre para recusar a nossa solicitação de informações pessoais, entendendo que talvez não possamos fornecer alguns dos serviços desejados.</w:t>
+      </w:r>
+    </w:p>
+    <w:p>
+      <w:r>
+        <w:t>O uso continuado de nosso site será considerado como aceitação de nossas práticas em torno de privacidade e informações pessoais. Se você tiver alguma dúvida sobre como lidamos com dados do usuário e informações pessoais, entre em contacto c</w:t>
+      </w:r>
+      <w:r>
+        <w:t>o</w:t>
+      </w:r>
+      <w:r>
+        <w:t>nosco</w:t>
+      </w:r>
+      <w:r>
+        <w:t>.</w:t>
+      </w:r>
+    </w:p>
+    <w:p>
+      <w:r>
+        <w:t xml:space="preserve">- </w:t>
+      </w:r>
+      <w:r>
+        <w:t>O serviço Google AdSense que usamos para veicular publicidade usa um cookie DoubleClick para veicular anúncios mais relevantes em toda a Web e limitar o número de vezes que um determinado anúncio é exibido para você.</w:t>
+      </w:r>
+    </w:p>
+    <w:p>
+      <w:r>
+        <w:t xml:space="preserve">- </w:t>
+      </w:r>
+      <w:r>
+        <w:t>Para mais informações sobre o Google AdSense, consulte as FAQs oficiais sobre privacidade do Google AdSense.</w:t>
+      </w:r>
+    </w:p>
+    <w:p>
+      <w:r>
+        <w:lastRenderedPageBreak/>
+        <w:t xml:space="preserve">- </w:t>
+      </w:r>
+      <w:r>
+        <w:t>Utilizamos anúncios para compensar os custos de funcionamento deste site e fornecer financiamento para futuros desenvolvimentos. Os cookies de publicidade comportamental usados ​​por este site foram projetados para garantir que você forneça os anúncios mais relevantes sempre que possível, rastreando anonimamente seus interesses e apresentando coisas semelhantes que possam ser do seu interesse.</w:t>
+      </w:r>
+    </w:p>
+    <w:p>
+      <w:r>
+        <w:t xml:space="preserve">- </w:t>
+      </w:r>
+      <w:r>
+        <w:t>Vários parceiros anunciam em nosso nome e os cookies de rastreamento de afiliados simplesmente nos permitem ver se nossos clientes acessaram o site através de um dos sites de nossos parceiros, para que possamos creditá-los adequadamente e, quando aplicável, permitir que nossos parceiros afiliados ofereçam qualquer promoção que pode fornecê-lo para fazer uma compra.</w:t>
+      </w:r>
+    </w:p>
+    <w:p>
+      <w:r>
+        <w:t>Compromisso do Usuário</w:t>
+      </w:r>
+    </w:p>
+    <w:p>
+      <w:r>
+        <w:t>O usuário se compromete a fazer uso adequado dos conteúdos e da informação que o Contax oferece no site e com caráter enunciativo, mas não limitativo:</w:t>
+      </w:r>
+    </w:p>
+    <w:p>
+      <w:pPr>
+        <w:ind w:firstLine="357"/>
+      </w:pPr>
+      <w:r>
+        <w:t>A) Não se envolver em atividades que sejam ilegais ou contrárias à boa fé a à ordem pública</w:t>
+      </w:r>
+      <w:r>
+        <w:t>;</w:t>
+      </w:r>
+    </w:p>
+    <w:p>
+      <w:pPr>
+        <w:ind w:firstLine="357"/>
+      </w:pPr>
+      <w:r>
+        <w:t>B) Não difundir propaganda ou conteúdo de natureza racista, xenofóbica, jogos de sorte ou azar, qualquer tipo de pornografia ilegal, de apologia ao terrorismo ou contra os direitos humanos;</w:t>
+      </w:r>
+    </w:p>
+    <w:p>
+      <w:pPr>
+        <w:ind w:firstLine="357"/>
+      </w:pPr>
+      <w:r>
+        <w:t>C) Não causar danos aos sistemas físicos (hardwares) e lógicos (softwares) do Contax, de seus fornecedores ou terceiros, para introduzir ou disseminar vírus informáticos ou quaisquer outros sistemas de hardware ou software que sejam capazes de causar danos anteriormente mencionados.</w:t>
+      </w:r>
+    </w:p>
+    <w:p>
+      <w:r>
+        <w:t>Mais informações</w:t>
+      </w:r>
+    </w:p>
+    <w:p>
+      <w:r>
+        <w:t>Esperemos que esteja esclarecido e, como mencionado anteriormente, se houver algo que você não tem certeza se precisa ou não, geralmente é mais seguro deixar os cookies ativados, caso interaja com um dos recursos que você usa em nosso site.</w:t>
+      </w:r>
+    </w:p>
+    <w:p>
+      <w:pPr>
+        <w:ind w:firstLine="357"/>
+      </w:pPr>
+      <w:r>
+        <w:t>Esta política é efetiva a partir de 28 April 2026 22:46</w:t>
+      </w:r>
+    </w:p>
+    <w:p/>
+    <w:p>
+      <w:pPr>
+        <w:pStyle w:val="PargrafodaLista"/>
+        <w:numPr>
+          <w:ilvl w:val="1"/>
+          <w:numId w:val="1"/>
+        </w:numPr>
+        <w:ind w:left="788" w:hanging="431"/>
+        <w:outlineLvl w:val="1"/>
+        <w:rPr>
+          <w:b/>
+          <w:bCs/>
+        </w:rPr>
+      </w:pPr>
+      <w:bookmarkStart w:id="38" w:name="_Toc229592505"/>
+      <w:r>
+        <w:rPr>
+          <w:b/>
+          <w:bCs/>
+        </w:rPr>
+        <w:t>Termos de Uso</w:t>
+      </w:r>
+      <w:bookmarkEnd w:id="38"/>
+    </w:p>
+    <w:p/>
+    <w:p>
+      <w:pPr>
+        <w:pStyle w:val="PargrafodaLista"/>
+        <w:numPr>
+          <w:ilvl w:val="0"/>
+          <w:numId w:val="8"/>
+        </w:numPr>
+      </w:pPr>
+      <w:r>
+        <w:lastRenderedPageBreak/>
+        <w:t>Termos</w:t>
+      </w:r>
+    </w:p>
+    <w:p>
+      <w:r>
+        <w:t>Ao acessar ao site Contax, concorda em cumprir estes termos de serviço, todas as leis e regulamentos aplicáveis ​​e concorda que é responsável pelo cumprimento de todas as leis locais aplicáveis. Se você não concordar com algum desses termos, está proibido de usar ou acessar este site. Os materiais contidos neste site são protegidos pelas leis de direitos autorais e marcas comerciais aplicáveis.</w:t>
+      </w:r>
+    </w:p>
+    <w:p>
+      <w:pPr>
+        <w:pStyle w:val="PargrafodaLista"/>
+        <w:numPr>
+          <w:ilvl w:val="0"/>
+          <w:numId w:val="8"/>
+        </w:numPr>
+      </w:pPr>
+      <w:r>
+        <w:t>Uso de Licença</w:t>
+      </w:r>
+    </w:p>
+    <w:p>
+      <w:r>
+        <w:t>É concedida permissão para baixar temporariamente uma cópia dos materiais (informações ou software) no site Contax, apenas para visualização transitória pessoal e não comercial. Esta é a concessão de uma licença, não uma transferência de título e, sob esta licença, você não pode:</w:t>
+      </w:r>
+    </w:p>
+    <w:p>
+      <w:pPr>
+        <w:pStyle w:val="PargrafodaLista"/>
+        <w:numPr>
+          <w:ilvl w:val="0"/>
+          <w:numId w:val="7"/>
+        </w:numPr>
+      </w:pPr>
+      <w:r>
+        <w:t>modificar ou copiar os materiais;</w:t>
+      </w:r>
+    </w:p>
+    <w:p>
+      <w:pPr>
+        <w:pStyle w:val="PargrafodaLista"/>
+        <w:numPr>
+          <w:ilvl w:val="0"/>
+          <w:numId w:val="7"/>
+        </w:numPr>
+      </w:pPr>
+      <w:r>
+        <w:t>usar os materiais para qualquer finalidade comercial ou para exibição pública (comercial ou não comercial);</w:t>
+      </w:r>
+    </w:p>
+    <w:p>
+      <w:pPr>
+        <w:pStyle w:val="PargrafodaLista"/>
+        <w:numPr>
+          <w:ilvl w:val="0"/>
+          <w:numId w:val="7"/>
+        </w:numPr>
+      </w:pPr>
+      <w:r>
+        <w:t>tentar descompilar ou fazer engenharia reversa de qualquer software contido no site Contax;</w:t>
+      </w:r>
+    </w:p>
+    <w:p>
+      <w:pPr>
+        <w:pStyle w:val="PargrafodaLista"/>
+        <w:numPr>
+          <w:ilvl w:val="0"/>
+          <w:numId w:val="7"/>
+        </w:numPr>
+      </w:pPr>
+      <w:r>
+        <w:t>remover quaisquer direitos autorais ou outras notações de propriedade dos materiais; ou</w:t>
+      </w:r>
+    </w:p>
+    <w:p>
+      <w:pPr>
+        <w:pStyle w:val="PargrafodaLista"/>
+        <w:numPr>
+          <w:ilvl w:val="0"/>
+          <w:numId w:val="7"/>
+        </w:numPr>
+      </w:pPr>
+      <w:r>
+        <w:t>transferir os materiais para outra pessoa ou 'espelhe' os materiais em qualquer outro servidor.</w:t>
+      </w:r>
+    </w:p>
+    <w:p>
+      <w:r>
+        <w:t>Esta licença será automaticamente rescindida se você violar alguma dessas restrições e poderá ser rescindida por Contax a qualquer momento. Ao encerrar a visualização desses materiais ou após o término desta licença, você deve apagar todos os materiais baixados em sua posse, seja em formato eletrónico ou impresso.</w:t>
+      </w:r>
+    </w:p>
+    <w:p>
+      <w:pPr>
+        <w:pStyle w:val="PargrafodaLista"/>
+        <w:numPr>
+          <w:ilvl w:val="0"/>
+          <w:numId w:val="8"/>
+        </w:numPr>
+      </w:pPr>
+      <w:r>
+        <w:t>Isenção de responsabilidade</w:t>
+      </w:r>
+    </w:p>
+    <w:p>
+      <w:pPr>
+        <w:pStyle w:val="PargrafodaLista"/>
+        <w:numPr>
+          <w:ilvl w:val="0"/>
+          <w:numId w:val="9"/>
+        </w:numPr>
+      </w:pPr>
+      <w:r>
+        <w:t>Os materiais no site da Contax são fornecidos 'como estão'. Contax não oferece garantias, expressas ou implícitas, e, por este meio, isenta e nega todas as outras garantias, incluindo, sem limitação, garantias implícitas ou condições de comercialização, adequação a um fim específico ou não violação de propriedade intelectual ou outra violação de direitos.</w:t>
+      </w:r>
+    </w:p>
+    <w:p>
+      <w:pPr>
+        <w:pStyle w:val="PargrafodaLista"/>
+        <w:numPr>
+          <w:ilvl w:val="0"/>
+          <w:numId w:val="9"/>
+        </w:numPr>
+      </w:pPr>
+      <w:r>
+        <w:t xml:space="preserve">Além disso, o Contax não garante ou faz qualquer representação relativa à precisão, aos resultados prováveis ​​ou à confiabilidade do uso dos materiais </w:t>
+      </w:r>
+      <w:r>
+        <w:lastRenderedPageBreak/>
+        <w:t>em seu site ou de outra forma relacionado a esses materiais ou em sites vinculados a este site.</w:t>
+      </w:r>
+    </w:p>
+    <w:p>
+      <w:pPr>
+        <w:pStyle w:val="PargrafodaLista"/>
+        <w:numPr>
+          <w:ilvl w:val="0"/>
+          <w:numId w:val="8"/>
+        </w:numPr>
+      </w:pPr>
+      <w:r>
+        <w:t>Limitações</w:t>
+      </w:r>
+    </w:p>
+    <w:p>
+      <w:r>
+        <w:t>Em nenhum caso o Contax ou seus fornecedores serão responsáveis ​​por quaisquer danos (incluindo, sem limitação, danos por perda de dados ou lucro ou devido a interrupção dos negócios) decorrentes do uso ou da incapacidade de usar os materiais em Contax, mesmo que Contax ou um representante autorizado da Contax tenha sido notificado oralmente ou por escrito da possibilidade de tais danos. Como algumas jurisdições não permitem limitações em garantias implícitas, ou limitações de responsabilidade por danos conseqüentes ou incidentais, essas limitações podem não se aplicar a você.</w:t>
+      </w:r>
+    </w:p>
+    <w:p>
+      <w:pPr>
+        <w:pStyle w:val="PargrafodaLista"/>
+        <w:numPr>
+          <w:ilvl w:val="0"/>
+          <w:numId w:val="8"/>
+        </w:numPr>
+      </w:pPr>
+      <w:r>
+        <w:t>Precisão dos materiais</w:t>
+      </w:r>
+    </w:p>
+    <w:p>
+      <w:r>
+        <w:t>Os materiais exibidos no site da Contax podem incluir erros técnicos, tipográficos ou fotográficos. Contax não garante que qualquer material em seu site seja preciso, completo ou atual. Contax pode fazer alterações nos materiais contidos em seu site a qualquer momento, sem aviso prévio. No entanto, Contax não se compromete a atualizar os materiais.</w:t>
+      </w:r>
+    </w:p>
+    <w:p>
+      <w:pPr>
+        <w:pStyle w:val="PargrafodaLista"/>
+        <w:numPr>
+          <w:ilvl w:val="0"/>
+          <w:numId w:val="8"/>
+        </w:numPr>
+      </w:pPr>
+      <w:r>
+        <w:t>Links</w:t>
+      </w:r>
+    </w:p>
+    <w:p>
+      <w:r>
+        <w:t>O Contax não analisou todos os sites vinculados ao seu site e não é responsável pelo conteúdo de nenhum site vinculado. A inclusão de qualquer link não implica endosso por Contax do site. O uso de qualquer site vinculado é por conta e risco do usuário.</w:t>
+      </w:r>
+    </w:p>
+    <w:p>
+      <w:r>
+        <w:t>Modificações</w:t>
+      </w:r>
+    </w:p>
+    <w:p>
+      <w:r>
+        <w:t>O Contax pode revisar estes termos de serviço do site a qualquer momento, sem aviso prévio. Ao usar este site, você concorda em ficar vinculado à versão atual desses termos de serviço.</w:t>
+      </w:r>
+    </w:p>
+    <w:p>
+      <w:r>
+        <w:t>Lei aplicável</w:t>
+      </w:r>
+    </w:p>
+    <w:p>
+      <w:r>
+        <w:t>Estes termos e condições são regidos e interpretados de acordo com as leis do Contax e você se submete irrevogavelmente à jurisdição exclusiva dos tribunais naquele estado ou localidade.</w:t>
+      </w:r>
+      <w:r>
+        <w:br w:type="page"/>
+      </w:r>
+    </w:p>
+    <w:p>
+      <w:pPr>
+        <w:pStyle w:val="PargrafodaLista"/>
+        <w:numPr>
+          <w:ilvl w:val="0"/>
+          <w:numId w:val="8"/>
+        </w:numPr>
+        <w:ind w:left="357" w:hanging="357"/>
+        <w:outlineLvl w:val="0"/>
+        <w:rPr>
+          <w:b/>
+        </w:rPr>
+      </w:pPr>
+      <w:bookmarkStart w:id="39" w:name="_Toc229592506"/>
+      <w:r>
+        <w:rPr>
+          <w:b/>
+        </w:rPr>
+        <w:lastRenderedPageBreak/>
+        <w:t>CONSIDERAÇÕES FINAIS</w:t>
+      </w:r>
+      <w:bookmarkEnd w:id="39"/>
+    </w:p>
+    <w:p/>
+    <w:p/>
+    <w:p>
+      <w:r>
+        <w:t>Parte final do trabalho no qual são expostas as conclusões correspondentes aos objetivos e hipóteses, apresentados na introdução.</w:t>
+      </w:r>
+    </w:p>
+    <w:p>
+      <w:r>
+        <w:t>Nesse campo são apontadas as respostas às hipóteses e objetivos do TCC. O ponto de vista dos autores, devidamente embasado pelos dados, conceitos e informações apresentados no desenvolvimento deve ser inserido aqui. Podem ser incluídas breves recomendações e sugestões para trabalhos futuros.</w:t>
+      </w:r>
+    </w:p>
+    <w:p/>
+    <w:p>
+      <w:pPr>
+        <w:spacing w:after="200" w:line="276" w:lineRule="auto"/>
+        <w:jc w:val="left"/>
+      </w:pPr>
+      <w:r>
+        <w:br w:type="page"/>
+      </w:r>
+    </w:p>
+    <w:p>
+      <w:pPr>
+        <w:jc w:val="center"/>
+        <w:outlineLvl w:val="0"/>
+        <w:rPr>
+          <w:b/>
+        </w:rPr>
+      </w:pPr>
+      <w:bookmarkStart w:id="40" w:name="_Toc229592507"/>
+      <w:r>
+        <w:rPr>
+          <w:b/>
+        </w:rPr>
+        <w:lastRenderedPageBreak/>
+        <w:t>REFERÊNCIAS</w:t>
+      </w:r>
+      <w:bookmarkEnd w:id="40"/>
+    </w:p>
+    <w:p/>
+    <w:p>
+      <w:r>
+        <w:t>MACORATTI</w:t>
+      </w:r>
+      <w:r>
+        <w:t xml:space="preserve">, José Carlos. </w:t>
+      </w:r>
+      <w:r>
+        <w:rPr>
+          <w:b/>
+        </w:rPr>
+        <w:t>Visual Studio Code – Apresentando o editor multiplataforma da Microsoft</w:t>
+      </w:r>
+      <w:r>
+        <w:t xml:space="preserve">, 2016. Disponível em: </w:t>
+      </w:r>
+      <w:hyperlink r:id="rId23" w:history="1">
+        <w:r>
+          <w:rPr>
+            <w:rStyle w:val="Hyperlink"/>
+          </w:rPr>
+          <w:t>https://imasters.com.br/desenvolvimento/visual-studio-code-apresentando-o-editor-multiplataforma-da-microsoft</w:t>
+        </w:r>
+      </w:hyperlink>
+      <w:r>
+        <w:t>. Acesso em 19 out. 2023.</w:t>
+      </w:r>
+      <w:r>
+        <w:t xml:space="preserve"> </w:t>
+      </w:r>
+    </w:p>
+    <w:p/>
+    <w:p>
+      <w:r>
+        <w:t xml:space="preserve">MICROSOFT. </w:t>
+      </w:r>
+      <w:r>
+        <w:rPr>
+          <w:b/>
+        </w:rPr>
+        <w:t>Conheça a família Visual Studio</w:t>
+      </w:r>
+      <w:r>
+        <w:t xml:space="preserve">, 2023. Disponível em: </w:t>
+      </w:r>
+      <w:hyperlink r:id="rId24" w:anchor=":~:text=o%20Visual%20Studio-,Visual%20Studio%20Code,praticamente%20qualquer%20linguagem%20de%20programa%C3%A7%C3%A3o" w:history="1">
+        <w:r>
+          <w:rPr>
+            <w:rStyle w:val="Hyperlink"/>
+          </w:rPr>
+          <w:t>https://visualstudio.microsoft.com/pt-br/#:~:text=o%20Visual%20Studio-,Visual%20Studio%20Code,praticamente%20qualquer%20linguagem%20de%20programa%C3%A7%C3%A3o</w:t>
+        </w:r>
+      </w:hyperlink>
+      <w:r>
+        <w:t>.</w:t>
+      </w:r>
+      <w:r>
+        <w:t xml:space="preserve"> Acesso em 20 out. 2023.</w:t>
+      </w:r>
+    </w:p>
+    <w:p/>
+    <w:p>
+      <w:r>
+        <w:t>ALBUQUERQUE, Felipe et al. Integraçao de Replicaçao Máquina de Estados no Kubernetes. In: </w:t>
+      </w:r>
+      <w:r>
+        <w:rPr>
+          <w:b/>
+          <w:bCs/>
+        </w:rPr>
+        <w:t>Anais do XIX Workshop de Testes e Tolerância a Falhas</w:t>
+      </w:r>
+      <w:r>
+        <w:t>. SBC, 2018.</w:t>
+      </w:r>
+      <w:r>
+        <w:t xml:space="preserve"> Disponível em: </w:t>
+      </w:r>
+      <w:hyperlink r:id="rId25" w:history="1">
+        <w:r>
+          <w:rPr>
+            <w:rStyle w:val="Hyperlink"/>
+          </w:rPr>
+          <w:t>https://sol.sbc.org.br/index.php/wtf/article/view/2384</w:t>
+        </w:r>
+      </w:hyperlink>
+      <w:r>
+        <w:t>. Acesso em 20 out. 2023.</w:t>
+      </w:r>
+    </w:p>
+    <w:p/>
+    <w:p>
+      <w:r>
+        <w:t>Oliveira S de M de. O funcionamento da autoria nos blogs de divulgação científica. Ling (dis)curso</w:t>
+      </w:r>
+      <w:r>
+        <w:t>,</w:t>
+      </w:r>
+      <w:r>
+        <w:t xml:space="preserve"> </w:t>
+      </w:r>
+      <w:r>
+        <w:t>set. 2011</w:t>
+      </w:r>
+      <w:r>
+        <w:t xml:space="preserve">. </w:t>
+      </w:r>
+      <w:r>
+        <w:t>DOI</w:t>
+      </w:r>
+      <w:r>
+        <w:t xml:space="preserve">: </w:t>
+      </w:r>
+      <w:hyperlink r:id="rId26" w:history="1">
+        <w:r>
+          <w:rPr>
+            <w:rStyle w:val="Hyperlink"/>
+          </w:rPr>
+          <w:t>https://doi.org/10.1590/S1518-76322011000300008</w:t>
+        </w:r>
+      </w:hyperlink>
+      <w:r>
+        <w:t>. Acesso em 17 out. 2023.</w:t>
+      </w:r>
+    </w:p>
+    <w:p/>
+    <w:p/>
+    <w:p/>
+    <w:p>
+      <w:pPr>
+        <w:spacing w:after="200" w:line="276" w:lineRule="auto"/>
+        <w:jc w:val="left"/>
+      </w:pPr>
+    </w:p>
     <w:sectPr>
       <w:pgSz w:w="11906" w:h="16838" w:code="9"/>
       <w:pgMar w:top="1701" w:right="1134" w:bottom="1134" w:left="1701" w:header="709" w:footer="709" w:gutter="0"/>
@@ -18453,6 +18514,7 @@
   <w:style w:type="character" w:default="1" w:styleId="Fontepargpadro">
     <w:name w:val="Default Paragraph Font"/>
     <w:uiPriority w:val="1"/>
+    <w:semiHidden/>
     <w:unhideWhenUsed/>
   </w:style>
   <w:style w:type="table" w:default="1" w:styleId="Tabelanormal">
@@ -19285,15 +19347,6 @@
 </file>
 
 <file path=customXml/item1.xml><?xml version="1.0" encoding="utf-8"?>
-<?mso-contentType ?>
-<FormTemplates xmlns="http://schemas.microsoft.com/sharepoint/v3/contenttype/forms">
-  <Display>DocumentLibraryForm</Display>
-  <Edit>DocumentLibraryForm</Edit>
-  <New>DocumentLibraryForm</New>
-</FormTemplates>
-</file>
-
-<file path=customXml/item2.xml><?xml version="1.0" encoding="utf-8"?>
 <ct:contentTypeSchema xmlns:ct="http://schemas.microsoft.com/office/2006/metadata/contentType" xmlns:ma="http://schemas.microsoft.com/office/2006/metadata/properties/metaAttributes" ct:_="" ma:_="" ma:contentTypeName="Documento" ma:contentTypeID="0x01010079E85AF13E1D6948BAEBBC3E299C7A4C" ma:contentTypeVersion="11" ma:contentTypeDescription="Crie um novo documento." ma:contentTypeScope="" ma:versionID="9903338d6f6ebf8d9f52e57d695b90e0">
   <xsd:schema xmlns:xsd="http://www.w3.org/2001/XMLSchema" xmlns:xs="http://www.w3.org/2001/XMLSchema" xmlns:p="http://schemas.microsoft.com/office/2006/metadata/properties" xmlns:ns2="1c99b82c-450d-407b-8685-188b0222f857" xmlns:ns3="ec9326a9-796b-4177-81ae-8ce46d6874ce" targetNamespace="http://schemas.microsoft.com/office/2006/metadata/properties" ma:root="true" ma:fieldsID="27025b9af28ab54196939bbeabbec0a9" ns2:_="" ns3:_="">
     <xsd:import namespace="1c99b82c-450d-407b-8685-188b0222f857"/>
@@ -19482,19 +19535,20 @@
 </ct:contentTypeSchema>
 </file>
 
+<file path=customXml/item2.xml><?xml version="1.0" encoding="utf-8"?>
+<?mso-contentType ?>
+<FormTemplates xmlns="http://schemas.microsoft.com/sharepoint/v3/contenttype/forms">
+  <Display>DocumentLibraryForm</Display>
+  <Edit>DocumentLibraryForm</Edit>
+  <New>DocumentLibraryForm</New>
+</FormTemplates>
+</file>
+
 <file path=customXml/item3.xml><?xml version="1.0" encoding="utf-8"?>
 <b:Sources xmlns:b="http://schemas.openxmlformats.org/officeDocument/2006/bibliography" xmlns="http://schemas.openxmlformats.org/officeDocument/2006/bibliography" SelectedStyle="\APA.XSL" StyleName="APA"/>
 </file>
 
 <file path=customXml/itemProps1.xml><?xml version="1.0" encoding="utf-8"?>
-<ds:datastoreItem xmlns:ds="http://schemas.openxmlformats.org/officeDocument/2006/customXml" ds:itemID="{19856E04-179F-401F-8246-BA08537D6152}">
-  <ds:schemaRefs>
-    <ds:schemaRef ds:uri="http://schemas.microsoft.com/sharepoint/v3/contenttype/forms"/>
-  </ds:schemaRefs>
-</ds:datastoreItem>
-</file>
-
-<file path=customXml/itemProps2.xml><?xml version="1.0" encoding="utf-8"?>
 <ds:datastoreItem xmlns:ds="http://schemas.openxmlformats.org/officeDocument/2006/customXml" ds:itemID="{F9562963-6458-4B09-8DDA-F09296948AA7}">
   <ds:schemaRefs>
     <ds:schemaRef ds:uri="http://schemas.microsoft.com/office/2006/metadata/contentType"/>
@@ -19513,6 +19567,14 @@
 </ds:datastoreItem>
 </file>
 
+<file path=customXml/itemProps2.xml><?xml version="1.0" encoding="utf-8"?>
+<ds:datastoreItem xmlns:ds="http://schemas.openxmlformats.org/officeDocument/2006/customXml" ds:itemID="{19856E04-179F-401F-8246-BA08537D6152}">
+  <ds:schemaRefs>
+    <ds:schemaRef ds:uri="http://schemas.microsoft.com/sharepoint/v3/contenttype/forms"/>
+  </ds:schemaRefs>
+</ds:datastoreItem>
+</file>
+
 <file path=customXml/itemProps3.xml><?xml version="1.0" encoding="utf-8"?>
 <ds:datastoreItem xmlns:ds="http://schemas.openxmlformats.org/officeDocument/2006/customXml" ds:itemID="{205E797E-3F55-48D0-B859-951F215AD568}">
   <ds:schemaRefs>

</xml_diff>